<commit_message>
Update Word documentation: template rationale + recent changes
Adds a new "Why Build Your Own (LWR), Not a Prebuilt Template" section
(9.1) covering the Customer Account Portal / Partner Central /
Customer Service comparison, revisited after finishing the build.

Also brings the doc's technical content up to date with everything
since it was first published: Priority narrowed to Standard/Urgent,
the Urgent priority pill highlight, the mobile card layout for My
Requests/Reporting/Invoices (including the CSS specificity bug found
and fixed), the iOS Safari download fix (fileDownloadUtils), and
updated LWC/test counts (16 components, 142 Jest tests).
</commit_message>
<xml_diff>
--- a/docs/Alliance_Client_Portal_Documentation.docx
+++ b/docs/Alliance_Client_Portal_Documentation.docx
@@ -67,7 +67,7 @@
           <w:sz w:val="20"/>
           <w:szCs w:val="20"/>
         </w:rPr>
-        <w:t xml:space="preserve">Last updated 28 July 2026</w:t>
+        <w:t xml:space="preserve">Last updated 29 July 2026</w:t>
       </w:r>
     </w:p>
     <w:p>
@@ -344,7 +344,7 @@
           <w:sz w:val="19"/>
           <w:szCs w:val="19"/>
         </w:rPr>
-        <w:t xml:space="preserve">lwc/                15 Lightning Web Components: 12 screen components</w:t>
+        <w:t xml:space="preserve">lwc/                16 Lightning Web Components: 12 screen components</w:t>
       </w:r>
     </w:p>
     <w:p>
@@ -359,7 +359,7 @@
           <w:sz w:val="19"/>
           <w:szCs w:val="19"/>
         </w:rPr>
-        <w:t xml:space="preserve">                    (incl. Calendar, portalUserBadge, Reporting) plus 3</w:t>
+        <w:t xml:space="preserve">                    (incl. Calendar, portalUserBadge, Reporting) plus 4</w:t>
       </w:r>
     </w:p>
     <w:p>
@@ -389,7 +389,7 @@
           <w:sz w:val="19"/>
           <w:szCs w:val="19"/>
         </w:rPr>
-        <w:t xml:space="preserve">                    sortTableUtils, timeFormatUtils)</w:t>
+        <w:t xml:space="preserve">                    sortTableUtils, timeFormatUtils, fileDownloadUtils)</w:t>
       </w:r>
     </w:p>
     <w:p>
@@ -1448,28 +1448,6 @@
     </w:p>
     <w:p>
       <w:pPr>
-        <w:pStyle w:val="Heading3"/>
-        <w:spacing w:after="100" w:before="200"/>
-      </w:pPr>
-      <w:r>
-        <w:t xml:space="preserve">3.2.1 Request Cancellation action</w:t>
-      </w:r>
-    </w:p>
-    <w:p>
-      <w:pPr>
-        <w:spacing w:after="160"/>
-      </w:pPr>
-      <w:r>
-        <w:rPr>
-          <w:rFonts w:ascii="Calibri" w:cs="Calibri" w:eastAsia="Calibri" w:hAnsi="Calibri"/>
-          <w:sz w:val="22"/>
-          <w:szCs w:val="22"/>
-        </w:rPr>
-        <w:t xml:space="preserve">Each row has a Request Cancellation action — previously a “Cancellation Request” type on the Support/Query screen, now a per-row action since that is a more natural place to act on a specific request.</w:t>
-      </w:r>
-    </w:p>
-    <w:p>
-      <w:pPr>
         <w:pStyle w:val="ListParagraph"/>
         <w:numPr>
           <w:ilvl w:val="0"/>
@@ -1480,10 +1458,107 @@
       <w:r>
         <w:rPr>
           <w:rFonts w:ascii="Calibri" w:cs="Calibri" w:eastAsia="Calibri" w:hAnsi="Calibri"/>
-          <w:sz w:val="22"/>
-          <w:szCs w:val="22"/>
-        </w:rPr>
-        <w:t xml:space="preserve">Implemented as a compact lightning-button-menu (small dropdown, icon-only trigger) with a single “Request Cancellation” menu item, rather than a full-width destructive button (a full button-per-row was visibly too wide on the live site).</w:t>
+          <w:b/>
+          <w:bCs/>
+          <w:sz w:val="22"/>
+          <w:szCs w:val="22"/>
+        </w:rPr>
+        <w:t xml:space="preserve">Priority narrowed to two values: </w:t>
+      </w:r>
+      <w:r>
+        <w:rPr>
+          <w:rFonts w:ascii="Calibri" w:cs="Calibri" w:eastAsia="Calibri" w:hAnsi="Calibri"/>
+          <w:sz w:val="22"/>
+          <w:szCs w:val="22"/>
+        </w:rPr>
+        <w:t xml:space="preserve">the </w:t>
+      </w:r>
+      <w:r>
+        <w:rPr>
+          <w:rFonts w:ascii="Consolas" w:cs="Consolas" w:eastAsia="Consolas" w:hAnsi="Consolas"/>
+          <w:sz w:val="20"/>
+          <w:szCs w:val="20"/>
+          <w:shd w:fill="F0F0F0" w:val="clear"/>
+        </w:rPr>
+        <w:t xml:space="preserve">Priority__c</w:t>
+      </w:r>
+      <w:r>
+        <w:rPr>
+          <w:rFonts w:ascii="Calibri" w:cs="Calibri" w:eastAsia="Calibri" w:hAnsi="Calibri"/>
+          <w:sz w:val="22"/>
+          <w:szCs w:val="22"/>
+        </w:rPr>
+        <w:t xml:space="preserve"> restricted picklist previously had four values (Low/Medium/High/Urgent); narrowed to just </w:t>
+      </w:r>
+      <w:r>
+        <w:rPr>
+          <w:rFonts w:ascii="Calibri" w:cs="Calibri" w:eastAsia="Calibri" w:hAnsi="Calibri"/>
+          <w:b/>
+          <w:bCs/>
+          <w:sz w:val="22"/>
+          <w:szCs w:val="22"/>
+        </w:rPr>
+        <w:t xml:space="preserve">Standard</w:t>
+      </w:r>
+      <w:r>
+        <w:rPr>
+          <w:rFonts w:ascii="Calibri" w:cs="Calibri" w:eastAsia="Calibri" w:hAnsi="Calibri"/>
+          <w:sz w:val="22"/>
+          <w:szCs w:val="22"/>
+        </w:rPr>
+        <w:t xml:space="preserve"> (the default) and </w:t>
+      </w:r>
+      <w:r>
+        <w:rPr>
+          <w:rFonts w:ascii="Calibri" w:cs="Calibri" w:eastAsia="Calibri" w:hAnsi="Calibri"/>
+          <w:b/>
+          <w:bCs/>
+          <w:sz w:val="22"/>
+          <w:szCs w:val="22"/>
+        </w:rPr>
+        <w:t xml:space="preserve">Urgent</w:t>
+      </w:r>
+      <w:r>
+        <w:rPr>
+          <w:rFonts w:ascii="Calibri" w:cs="Calibri" w:eastAsia="Calibri" w:hAnsi="Calibri"/>
+          <w:sz w:val="22"/>
+          <w:szCs w:val="22"/>
+        </w:rPr>
+        <w:t xml:space="preserve"> per request. </w:t>
+      </w:r>
+      <w:r>
+        <w:rPr>
+          <w:rFonts w:ascii="Consolas" w:cs="Consolas" w:eastAsia="Consolas" w:hAnsi="Consolas"/>
+          <w:sz w:val="20"/>
+          <w:szCs w:val="20"/>
+          <w:shd w:fill="F0F0F0" w:val="clear"/>
+        </w:rPr>
+        <w:t xml:space="preserve">requestStaffForm</w:t>
+      </w:r>
+      <w:r>
+        <w:rPr>
+          <w:rFonts w:ascii="Calibri" w:cs="Calibri" w:eastAsia="Calibri" w:hAnsi="Calibri"/>
+          <w:sz w:val="22"/>
+          <w:szCs w:val="22"/>
+        </w:rPr>
+        <w:t xml:space="preserve">'s </w:t>
+      </w:r>
+      <w:r>
+        <w:rPr>
+          <w:rFonts w:ascii="Consolas" w:cs="Consolas" w:eastAsia="Consolas" w:hAnsi="Consolas"/>
+          <w:sz w:val="20"/>
+          <w:szCs w:val="20"/>
+          <w:shd w:fill="F0F0F0" w:val="clear"/>
+        </w:rPr>
+        <w:t xml:space="preserve">PRIORITY_OPTIONS</w:t>
+      </w:r>
+      <w:r>
+        <w:rPr>
+          <w:rFonts w:ascii="Calibri" w:cs="Calibri" w:eastAsia="Calibri" w:hAnsi="Calibri"/>
+          <w:sz w:val="22"/>
+          <w:szCs w:val="22"/>
+        </w:rPr>
+        <w:t xml:space="preserve"> and default value were updated to match, along with every Apex test/LWC fixture that inserted the old values (a restricted picklist rejects anything outside its valueSet).</w:t>
       </w:r>
     </w:p>
     <w:p>
@@ -1498,10 +1573,110 @@
       <w:r>
         <w:rPr>
           <w:rFonts w:ascii="Calibri" w:cs="Calibri" w:eastAsia="Calibri" w:hAnsi="Calibri"/>
-          <w:sz w:val="22"/>
-          <w:szCs w:val="22"/>
-        </w:rPr>
-        <w:t xml:space="preserve">Selecting the item asks for confirmation via a native window.confirm (not a custom modal), then reuses SupportRequestController.createCase(): creates a Portal_Request_Type__c = 'Cancellation Request' Case linked to that request (same confirmation email, same Case note) and refreshes the list.</w:t>
+          <w:b/>
+          <w:bCs/>
+          <w:sz w:val="22"/>
+          <w:szCs w:val="22"/>
+        </w:rPr>
+        <w:t xml:space="preserve">Urgent priority is visually highlighted: </w:t>
+      </w:r>
+      <w:r>
+        <w:rPr>
+          <w:rFonts w:ascii="Calibri" w:cs="Calibri" w:eastAsia="Calibri" w:hAnsi="Calibri"/>
+          <w:sz w:val="22"/>
+          <w:szCs w:val="22"/>
+        </w:rPr>
+        <w:t xml:space="preserve">an </w:t>
+      </w:r>
+      <w:r>
+        <w:rPr>
+          <w:rFonts w:ascii="Consolas" w:cs="Consolas" w:eastAsia="Consolas" w:hAnsi="Consolas"/>
+          <w:sz w:val="20"/>
+          <w:szCs w:val="20"/>
+          <w:shd w:fill="F0F0F0" w:val="clear"/>
+        </w:rPr>
+        <w:t xml:space="preserve">Urgent</w:t>
+      </w:r>
+      <w:r>
+        <w:rPr>
+          <w:rFonts w:ascii="Calibri" w:cs="Calibri" w:eastAsia="Calibri" w:hAnsi="Calibri"/>
+          <w:sz w:val="22"/>
+          <w:szCs w:val="22"/>
+        </w:rPr>
+        <w:t xml:space="preserve"> row's Priority cell renders as a small red pill (the same red used elsewhere for errors/Cancelled) instead of plain text, so it doesn't blend in with Standard rows — a client-side-only style keyed off </w:t>
+      </w:r>
+      <w:r>
+        <w:rPr>
+          <w:rFonts w:ascii="Consolas" w:cs="Consolas" w:eastAsia="Consolas" w:hAnsi="Consolas"/>
+          <w:sz w:val="20"/>
+          <w:szCs w:val="20"/>
+          <w:shd w:fill="F0F0F0" w:val="clear"/>
+        </w:rPr>
+        <w:t xml:space="preserve">request.priority === 'Urgent'</w:t>
+      </w:r>
+      <w:r>
+        <w:rPr>
+          <w:rFonts w:ascii="Calibri" w:cs="Calibri" w:eastAsia="Calibri" w:hAnsi="Calibri"/>
+          <w:sz w:val="22"/>
+          <w:szCs w:val="22"/>
+        </w:rPr>
+        <w:t xml:space="preserve"> (</w:t>
+      </w:r>
+      <w:r>
+        <w:rPr>
+          <w:rFonts w:ascii="Consolas" w:cs="Consolas" w:eastAsia="Consolas" w:hAnsi="Consolas"/>
+          <w:sz w:val="20"/>
+          <w:szCs w:val="20"/>
+          <w:shd w:fill="F0F0F0" w:val="clear"/>
+        </w:rPr>
+        <w:t xml:space="preserve">request.priorityClass</w:t>
+      </w:r>
+      <w:r>
+        <w:rPr>
+          <w:rFonts w:ascii="Calibri" w:cs="Calibri" w:eastAsia="Calibri" w:hAnsi="Calibri"/>
+          <w:sz w:val="22"/>
+          <w:szCs w:val="22"/>
+        </w:rPr>
+        <w:t xml:space="preserve"> in </w:t>
+      </w:r>
+      <w:r>
+        <w:rPr>
+          <w:rFonts w:ascii="Consolas" w:cs="Consolas" w:eastAsia="Consolas" w:hAnsi="Consolas"/>
+          <w:sz w:val="20"/>
+          <w:szCs w:val="20"/>
+          <w:shd w:fill="F0F0F0" w:val="clear"/>
+        </w:rPr>
+        <w:t xml:space="preserve">myStaffingRequests.js</w:t>
+      </w:r>
+      <w:r>
+        <w:rPr>
+          <w:rFonts w:ascii="Calibri" w:cs="Calibri" w:eastAsia="Calibri" w:hAnsi="Calibri"/>
+          <w:sz w:val="22"/>
+          <w:szCs w:val="22"/>
+        </w:rPr>
+        <w:t xml:space="preserve">). Reporting's Priority column is left plain, since that screen is a data extract rather than something scanned for action.</w:t>
+      </w:r>
+    </w:p>
+    <w:p>
+      <w:pPr>
+        <w:pStyle w:val="Heading3"/>
+        <w:spacing w:after="100" w:before="200"/>
+      </w:pPr>
+      <w:r>
+        <w:t xml:space="preserve">3.2.1 Request Cancellation action</w:t>
+      </w:r>
+    </w:p>
+    <w:p>
+      <w:pPr>
+        <w:spacing w:after="160"/>
+      </w:pPr>
+      <w:r>
+        <w:rPr>
+          <w:rFonts w:ascii="Calibri" w:cs="Calibri" w:eastAsia="Calibri" w:hAnsi="Calibri"/>
+          <w:sz w:val="22"/>
+          <w:szCs w:val="22"/>
+        </w:rPr>
+        <w:t xml:space="preserve">Each row has a Request Cancellation action — previously a “Cancellation Request” type on the Support/Query screen, now a per-row action since that is a more natural place to act on a specific request.</w:t>
       </w:r>
     </w:p>
     <w:p>
@@ -1516,141 +1691,10 @@
       <w:r>
         <w:rPr>
           <w:rFonts w:ascii="Calibri" w:cs="Calibri" w:eastAsia="Calibri" w:hAnsi="Calibri"/>
-          <w:b/>
-          <w:bCs/>
-          <w:sz w:val="22"/>
-          <w:szCs w:val="22"/>
-        </w:rPr>
-        <w:t xml:space="preserve">Visibility rule: </w:t>
-      </w:r>
-      <w:r>
-        <w:rPr>
-          <w:rFonts w:ascii="Calibri" w:cs="Calibri" w:eastAsia="Calibri" w:hAnsi="Calibri"/>
-          <w:sz w:val="22"/>
-          <w:szCs w:val="22"/>
-        </w:rPr>
-        <w:t xml:space="preserve">the action only shows for requests that are </w:t>
-      </w:r>
-      <w:r>
-        <w:rPr>
-          <w:rFonts w:ascii="Calibri" w:cs="Calibri" w:eastAsia="Calibri" w:hAnsi="Calibri"/>
-          <w:b/>
-          <w:bCs/>
-          <w:sz w:val="22"/>
-          <w:szCs w:val="22"/>
-        </w:rPr>
-        <w:t xml:space="preserve">not</w:t>
-      </w:r>
-      <w:r>
-        <w:rPr>
-          <w:rFonts w:ascii="Calibri" w:cs="Calibri" w:eastAsia="Calibri" w:hAnsi="Calibri"/>
-          <w:sz w:val="22"/>
-          <w:szCs w:val="22"/>
-        </w:rPr>
-        <w:t xml:space="preserve"> already Cancellation-Requested and </w:t>
-      </w:r>
-      <w:r>
-        <w:rPr>
-          <w:rFonts w:ascii="Calibri" w:cs="Calibri" w:eastAsia="Calibri" w:hAnsi="Calibri"/>
-          <w:b/>
-          <w:bCs/>
-          <w:sz w:val="22"/>
-          <w:szCs w:val="22"/>
-        </w:rPr>
-        <w:t xml:space="preserve">not</w:t>
-      </w:r>
-      <w:r>
-        <w:rPr>
-          <w:rFonts w:ascii="Calibri" w:cs="Calibri" w:eastAsia="Calibri" w:hAnsi="Calibri"/>
-          <w:sz w:val="22"/>
-          <w:szCs w:val="22"/>
-        </w:rPr>
-        <w:t xml:space="preserve"> already in a terminal status — </w:t>
-      </w:r>
-      <w:r>
-        <w:rPr>
-          <w:rFonts w:ascii="Consolas" w:cs="Consolas" w:eastAsia="Consolas" w:hAnsi="Consolas"/>
-          <w:sz w:val="20"/>
-          <w:szCs w:val="20"/>
-          <w:shd w:fill="F0F0F0" w:val="clear"/>
-        </w:rPr>
-        <w:t xml:space="preserve">Filled</w:t>
-      </w:r>
-      <w:r>
-        <w:rPr>
-          <w:rFonts w:ascii="Calibri" w:cs="Calibri" w:eastAsia="Calibri" w:hAnsi="Calibri"/>
-          <w:sz w:val="22"/>
-          <w:szCs w:val="22"/>
-        </w:rPr>
-        <w:t xml:space="preserve">, </w:t>
-      </w:r>
-      <w:r>
-        <w:rPr>
-          <w:rFonts w:ascii="Consolas" w:cs="Consolas" w:eastAsia="Consolas" w:hAnsi="Consolas"/>
-          <w:sz w:val="20"/>
-          <w:szCs w:val="20"/>
-          <w:shd w:fill="F0F0F0" w:val="clear"/>
-        </w:rPr>
-        <w:t xml:space="preserve">Unable to Fill</w:t>
-      </w:r>
-      <w:r>
-        <w:rPr>
-          <w:rFonts w:ascii="Calibri" w:cs="Calibri" w:eastAsia="Calibri" w:hAnsi="Calibri"/>
-          <w:sz w:val="22"/>
-          <w:szCs w:val="22"/>
-        </w:rPr>
-        <w:t xml:space="preserve">, or </w:t>
-      </w:r>
-      <w:r>
-        <w:rPr>
-          <w:rFonts w:ascii="Consolas" w:cs="Consolas" w:eastAsia="Consolas" w:hAnsi="Consolas"/>
-          <w:sz w:val="20"/>
-          <w:szCs w:val="20"/>
-          <w:shd w:fill="F0F0F0" w:val="clear"/>
-        </w:rPr>
-        <w:t xml:space="preserve">Cancelled</w:t>
-      </w:r>
-      <w:r>
-        <w:rPr>
-          <w:rFonts w:ascii="Calibri" w:cs="Calibri" w:eastAsia="Calibri" w:hAnsi="Calibri"/>
-          <w:sz w:val="22"/>
-          <w:szCs w:val="22"/>
-        </w:rPr>
-        <w:t xml:space="preserve">. Concretely: </w:t>
-      </w:r>
-      <w:r>
-        <w:rPr>
-          <w:rFonts w:ascii="Consolas" w:cs="Consolas" w:eastAsia="Consolas" w:hAnsi="Consolas"/>
-          <w:sz w:val="20"/>
-          <w:szCs w:val="20"/>
-          <w:shd w:fill="F0F0F0" w:val="clear"/>
-        </w:rPr>
-        <w:t xml:space="preserve">canCancel = !cancellationRequested &amp;&amp; !CANCELLATION_BLOCKED_STATUSES.includes(Status__c)</w:t>
-      </w:r>
-      <w:r>
-        <w:rPr>
-          <w:rFonts w:ascii="Calibri" w:cs="Calibri" w:eastAsia="Calibri" w:hAnsi="Calibri"/>
-          <w:sz w:val="22"/>
-          <w:szCs w:val="22"/>
-        </w:rPr>
-        <w:t xml:space="preserve">, where </w:t>
-      </w:r>
-      <w:r>
-        <w:rPr>
-          <w:rFonts w:ascii="Consolas" w:cs="Consolas" w:eastAsia="Consolas" w:hAnsi="Consolas"/>
-          <w:sz w:val="20"/>
-          <w:szCs w:val="20"/>
-          <w:shd w:fill="F0F0F0" w:val="clear"/>
-        </w:rPr>
-        <w:t xml:space="preserve">CANCELLATION_BLOCKED_STATUSES = ['Filled', 'Unable to Fill', 'Cancelled']</w:t>
-      </w:r>
-      <w:r>
-        <w:rPr>
-          <w:rFonts w:ascii="Calibri" w:cs="Calibri" w:eastAsia="Calibri" w:hAnsi="Calibri"/>
-          <w:sz w:val="22"/>
-          <w:szCs w:val="22"/>
-        </w:rPr>
-        <w:t xml:space="preserve">. For a row in any of those three statuses, no Action dropdown renders at all, regardless of the Cancellation Requested flag — there is no way to request cancellation on a shift that is already Filled, already Unable to Fill, or already Cancelled through this UI.</w:t>
+          <w:sz w:val="22"/>
+          <w:szCs w:val="22"/>
+        </w:rPr>
+        <w:t xml:space="preserve">Implemented as a compact lightning-button-menu (small dropdown, icon-only trigger) with a single “Request Cancellation” menu item, rather than a full-width destructive button (a full button-per-row was visibly too wide on the live site).</w:t>
       </w:r>
     </w:p>
     <w:p>
@@ -1668,138 +1712,7 @@
           <w:sz w:val="22"/>
           <w:szCs w:val="22"/>
         </w:rPr>
-        <w:t xml:space="preserve">This closed a real gap: </w:t>
-      </w:r>
-      <w:r>
-        <w:rPr>
-          <w:rFonts w:ascii="Consolas" w:cs="Consolas" w:eastAsia="Consolas" w:hAnsi="Consolas"/>
-          <w:sz w:val="20"/>
-          <w:szCs w:val="20"/>
-          <w:shd w:fill="F0F0F0" w:val="clear"/>
-        </w:rPr>
-        <w:t xml:space="preserve">Cancellation_Requested__c</w:t>
-      </w:r>
-      <w:r>
-        <w:rPr>
-          <w:rFonts w:ascii="Calibri" w:cs="Calibri" w:eastAsia="Calibri" w:hAnsi="Calibri"/>
-          <w:sz w:val="22"/>
-          <w:szCs w:val="22"/>
-        </w:rPr>
-        <w:t xml:space="preserve"> existed and was already displayed as a column, but nothing in the codebase ever actually set it. </w:t>
-      </w:r>
-      <w:r>
-        <w:rPr>
-          <w:rFonts w:ascii="Consolas" w:cs="Consolas" w:eastAsia="Consolas" w:hAnsi="Consolas"/>
-          <w:sz w:val="20"/>
-          <w:szCs w:val="20"/>
-          <w:shd w:fill="F0F0F0" w:val="clear"/>
-        </w:rPr>
-        <w:t xml:space="preserve">SupportRequestService</w:t>
-      </w:r>
-      <w:r>
-        <w:rPr>
-          <w:rFonts w:ascii="Calibri" w:cs="Calibri" w:eastAsia="Calibri" w:hAnsi="Calibri"/>
-          <w:sz w:val="22"/>
-          <w:szCs w:val="22"/>
-        </w:rPr>
-        <w:t xml:space="preserve"> now flags it on the related request whenever a Cancellation Request Case is created, regardless of which screen submitted it.</w:t>
-      </w:r>
-    </w:p>
-    <w:p>
-      <w:pPr>
-        <w:pStyle w:val="Heading3"/>
-        <w:spacing w:after="100" w:before="200"/>
-      </w:pPr>
-      <w:r>
-        <w:t xml:space="preserve">3.2.2 Action column placement</w:t>
-      </w:r>
-    </w:p>
-    <w:p>
-      <w:pPr>
-        <w:spacing w:after="160"/>
-      </w:pPr>
-      <w:r>
-        <w:rPr>
-          <w:rFonts w:ascii="Calibri" w:cs="Calibri" w:eastAsia="Calibri" w:hAnsi="Calibri"/>
-          <w:sz w:val="22"/>
-          <w:szCs w:val="22"/>
-        </w:rPr>
-        <w:t xml:space="preserve">The Action column is the first column, titled “Action” (it started as a trailing, unlabeled column). The dropdown's menu-alignment moved from right to left — right was correct while Action was the last column (menu opens leftward, staying inside the table), but once Action became the first column that alignment opened the menu off the left edge, clipped by the table wrapper's overflow-x: auto. left opens it rightward into the table where there is room.</w:t>
-      </w:r>
-    </w:p>
-    <w:p>
-      <w:pPr>
-        <w:spacing w:after="160"/>
-      </w:pPr>
-      <w:r>
-        <w:rPr>
-          <w:rFonts w:ascii="Calibri" w:cs="Calibri" w:eastAsia="Calibri" w:hAnsi="Calibri"/>
-          <w:sz w:val="22"/>
-          <w:szCs w:val="22"/>
-        </w:rPr>
-        <w:t xml:space="preserve">The table container also has defensive max-width: 100% / overflow-x: auto CSS on its wrapper elements, so wide row content scrolls within the table's own frame instead of stretching the page.</w:t>
-      </w:r>
-    </w:p>
-    <w:p>
-      <w:pPr>
-        <w:pStyle w:val="Heading2"/>
-        <w:spacing w:after="150" w:before="300"/>
-      </w:pPr>
-      <w:r>
-        <w:t xml:space="preserve">3.3 Calendar (requestStaffCalendar)</w:t>
-      </w:r>
-    </w:p>
-    <w:p>
-      <w:pPr>
-        <w:spacing w:after="160"/>
-      </w:pPr>
-      <w:r>
-        <w:rPr>
-          <w:rFonts w:ascii="Calibri" w:cs="Calibri" w:eastAsia="Calibri" w:hAnsi="Calibri"/>
-          <w:sz w:val="22"/>
-          <w:szCs w:val="22"/>
-        </w:rPr>
-        <w:t xml:space="preserve">Added convenience screen (nav label “Calendar”), not part of the original 6-screen deck: a month grid showing a badge on any day with existing requests. Clicking a day shows that day's bookings (Quantity + Role, Facility/Ward, Status) plus a Request Staff button that navigates to the Request Staff page with the date carried in state — Calendar is for reviewing what is already booked, Request Staff is where a request is actually submitted. Each booking is also clickable, navigating to My Requests filtered to that shift date.</w:t>
-      </w:r>
-    </w:p>
-    <w:p>
-      <w:pPr>
-        <w:pStyle w:val="Heading2"/>
-        <w:spacing w:after="150" w:before="300"/>
-      </w:pPr>
-      <w:r>
-        <w:t xml:space="preserve">3.4 Invoices (invoiceList)</w:t>
-      </w:r>
-    </w:p>
-    <w:p>
-      <w:pPr>
-        <w:spacing w:after="160"/>
-      </w:pPr>
-      <w:r>
-        <w:rPr>
-          <w:rFonts w:ascii="Calibri" w:cs="Calibri" w:eastAsia="Calibri" w:hAnsi="Calibri"/>
-          <w:sz w:val="22"/>
-          <w:szCs w:val="22"/>
-        </w:rPr>
-        <w:t xml:space="preserve">Has the same search/sort behaviour as My Requests. The </w:t>
-      </w:r>
-      <w:r>
-        <w:rPr>
-          <w:rFonts w:ascii="Calibri" w:cs="Calibri" w:eastAsia="Calibri" w:hAnsi="Calibri"/>
-          <w:b/>
-          <w:bCs/>
-          <w:sz w:val="22"/>
-          <w:szCs w:val="22"/>
-        </w:rPr>
-        <w:t xml:space="preserve">View / Download</w:t>
-      </w:r>
-      <w:r>
-        <w:rPr>
-          <w:rFonts w:ascii="Calibri" w:cs="Calibri" w:eastAsia="Calibri" w:hAnsi="Calibri"/>
-          <w:sz w:val="22"/>
-          <w:szCs w:val="22"/>
-        </w:rPr>
-        <w:t xml:space="preserve"> button is wired to the actual attached file, not just the record page.</w:t>
+        <w:t xml:space="preserve">Selecting the item asks for confirmation via a native window.confirm (not a custom modal), then reuses SupportRequestController.createCase(): creates a Portal_Request_Type__c = 'Cancellation Request' Case linked to that request (same confirmation email, same Case note) and refreshes the list.</w:t>
       </w:r>
     </w:p>
     <w:p>
@@ -1813,122 +1726,142 @@
       </w:pPr>
       <w:r>
         <w:rPr>
-          <w:rFonts w:ascii="Consolas" w:cs="Consolas" w:eastAsia="Consolas" w:hAnsi="Consolas"/>
-          <w:sz w:val="20"/>
-          <w:szCs w:val="20"/>
-          <w:shd w:fill="F0F0F0" w:val="clear"/>
-        </w:rPr>
-        <w:t xml:space="preserve">InvoiceController.getInvoiceFileIds()</w:t>
-      </w:r>
-      <w:r>
-        <w:rPr>
-          <w:rFonts w:ascii="Calibri" w:cs="Calibri" w:eastAsia="Calibri" w:hAnsi="Calibri"/>
-          <w:sz w:val="22"/>
-          <w:szCs w:val="22"/>
-        </w:rPr>
-        <w:t xml:space="preserve"> returns a </w:t>
-      </w:r>
-      <w:r>
-        <w:rPr>
-          <w:rFonts w:ascii="Consolas" w:cs="Consolas" w:eastAsia="Consolas" w:hAnsi="Consolas"/>
-          <w:sz w:val="20"/>
-          <w:szCs w:val="20"/>
-          <w:shd w:fill="F0F0F0" w:val="clear"/>
-        </w:rPr>
-        <w:t xml:space="preserve">Map&lt;Id, Id&gt;</w:t>
-      </w:r>
-      <w:r>
-        <w:rPr>
-          <w:rFonts w:ascii="Calibri" w:cs="Calibri" w:eastAsia="Calibri" w:hAnsi="Calibri"/>
-          <w:sz w:val="22"/>
-          <w:szCs w:val="22"/>
-        </w:rPr>
-        <w:t xml:space="preserve"> of invoice Id → the most recently modified </w:t>
-      </w:r>
-      <w:r>
-        <w:rPr>
-          <w:rFonts w:ascii="Consolas" w:cs="Consolas" w:eastAsia="Consolas" w:hAnsi="Consolas"/>
-          <w:sz w:val="20"/>
-          <w:szCs w:val="20"/>
-          <w:shd w:fill="F0F0F0" w:val="clear"/>
-        </w:rPr>
-        <w:t xml:space="preserve">ContentDocumentId</w:t>
-      </w:r>
-      <w:r>
-        <w:rPr>
-          <w:rFonts w:ascii="Calibri" w:cs="Calibri" w:eastAsia="Calibri" w:hAnsi="Calibri"/>
-          <w:sz w:val="22"/>
-          <w:szCs w:val="22"/>
-        </w:rPr>
-        <w:t xml:space="preserve"> linked to it (a second, separate </w:t>
-      </w:r>
-      <w:r>
-        <w:rPr>
-          <w:rFonts w:ascii="Consolas" w:cs="Consolas" w:eastAsia="Consolas" w:hAnsi="Consolas"/>
-          <w:sz w:val="20"/>
-          <w:szCs w:val="20"/>
-          <w:shd w:fill="F0F0F0" w:val="clear"/>
-        </w:rPr>
-        <w:t xml:space="preserve">@wire</w:t>
-      </w:r>
-      <w:r>
-        <w:rPr>
-          <w:rFonts w:ascii="Calibri" w:cs="Calibri" w:eastAsia="Calibri" w:hAnsi="Calibri"/>
-          <w:sz w:val="22"/>
-          <w:szCs w:val="22"/>
-        </w:rPr>
-        <w:t xml:space="preserve">, since the file is a standard </w:t>
-      </w:r>
-      <w:r>
-        <w:rPr>
-          <w:rFonts w:ascii="Consolas" w:cs="Consolas" w:eastAsia="Consolas" w:hAnsi="Consolas"/>
-          <w:sz w:val="20"/>
-          <w:szCs w:val="20"/>
-          <w:shd w:fill="F0F0F0" w:val="clear"/>
-        </w:rPr>
-        <w:t xml:space="preserve">ContentVersion</w:t>
-      </w:r>
-      <w:r>
-        <w:rPr>
-          <w:rFonts w:ascii="Calibri" w:cs="Calibri" w:eastAsia="Calibri" w:hAnsi="Calibri"/>
-          <w:sz w:val="22"/>
-          <w:szCs w:val="22"/>
-        </w:rPr>
-        <w:t xml:space="preserve">/</w:t>
-      </w:r>
-      <w:r>
-        <w:rPr>
-          <w:rFonts w:ascii="Consolas" w:cs="Consolas" w:eastAsia="Consolas" w:hAnsi="Consolas"/>
-          <w:sz w:val="20"/>
-          <w:szCs w:val="20"/>
-          <w:shd w:fill="F0F0F0" w:val="clear"/>
-        </w:rPr>
-        <w:t xml:space="preserve">ContentDocumentLink</w:t>
-      </w:r>
-      <w:r>
-        <w:rPr>
-          <w:rFonts w:ascii="Calibri" w:cs="Calibri" w:eastAsia="Calibri" w:hAnsi="Calibri"/>
-          <w:sz w:val="22"/>
-          <w:szCs w:val="22"/>
-        </w:rPr>
-        <w:t xml:space="preserve">, not a field on </w:t>
-      </w:r>
-      <w:r>
-        <w:rPr>
-          <w:rFonts w:ascii="Consolas" w:cs="Consolas" w:eastAsia="Consolas" w:hAnsi="Consolas"/>
-          <w:sz w:val="20"/>
-          <w:szCs w:val="20"/>
-          <w:shd w:fill="F0F0F0" w:val="clear"/>
-        </w:rPr>
-        <w:t xml:space="preserve">Invoice__c</w:t>
-      </w:r>
-      <w:r>
-        <w:rPr>
-          <w:rFonts w:ascii="Calibri" w:cs="Calibri" w:eastAsia="Calibri" w:hAnsi="Calibri"/>
-          <w:sz w:val="22"/>
-          <w:szCs w:val="22"/>
-        </w:rPr>
-        <w:t xml:space="preserve">) — merged onto each row client-side so it stays correct regardless of which wire resolves first.</w:t>
+          <w:rFonts w:ascii="Calibri" w:cs="Calibri" w:eastAsia="Calibri" w:hAnsi="Calibri"/>
+          <w:b/>
+          <w:bCs/>
+          <w:sz w:val="22"/>
+          <w:szCs w:val="22"/>
+        </w:rPr>
+        <w:t xml:space="preserve">Visibility rule: </w:t>
+      </w:r>
+      <w:r>
+        <w:rPr>
+          <w:rFonts w:ascii="Calibri" w:cs="Calibri" w:eastAsia="Calibri" w:hAnsi="Calibri"/>
+          <w:sz w:val="22"/>
+          <w:szCs w:val="22"/>
+        </w:rPr>
+        <w:t xml:space="preserve">the action only shows for requests that are </w:t>
+      </w:r>
+      <w:r>
+        <w:rPr>
+          <w:rFonts w:ascii="Calibri" w:cs="Calibri" w:eastAsia="Calibri" w:hAnsi="Calibri"/>
+          <w:b/>
+          <w:bCs/>
+          <w:sz w:val="22"/>
+          <w:szCs w:val="22"/>
+        </w:rPr>
+        <w:t xml:space="preserve">not</w:t>
+      </w:r>
+      <w:r>
+        <w:rPr>
+          <w:rFonts w:ascii="Calibri" w:cs="Calibri" w:eastAsia="Calibri" w:hAnsi="Calibri"/>
+          <w:sz w:val="22"/>
+          <w:szCs w:val="22"/>
+        </w:rPr>
+        <w:t xml:space="preserve"> already Cancellation-Requested and </w:t>
+      </w:r>
+      <w:r>
+        <w:rPr>
+          <w:rFonts w:ascii="Calibri" w:cs="Calibri" w:eastAsia="Calibri" w:hAnsi="Calibri"/>
+          <w:b/>
+          <w:bCs/>
+          <w:sz w:val="22"/>
+          <w:szCs w:val="22"/>
+        </w:rPr>
+        <w:t xml:space="preserve">not</w:t>
+      </w:r>
+      <w:r>
+        <w:rPr>
+          <w:rFonts w:ascii="Calibri" w:cs="Calibri" w:eastAsia="Calibri" w:hAnsi="Calibri"/>
+          <w:sz w:val="22"/>
+          <w:szCs w:val="22"/>
+        </w:rPr>
+        <w:t xml:space="preserve"> already in a terminal status — </w:t>
+      </w:r>
+      <w:r>
+        <w:rPr>
+          <w:rFonts w:ascii="Consolas" w:cs="Consolas" w:eastAsia="Consolas" w:hAnsi="Consolas"/>
+          <w:sz w:val="20"/>
+          <w:szCs w:val="20"/>
+          <w:shd w:fill="F0F0F0" w:val="clear"/>
+        </w:rPr>
+        <w:t xml:space="preserve">Filled</w:t>
+      </w:r>
+      <w:r>
+        <w:rPr>
+          <w:rFonts w:ascii="Calibri" w:cs="Calibri" w:eastAsia="Calibri" w:hAnsi="Calibri"/>
+          <w:sz w:val="22"/>
+          <w:szCs w:val="22"/>
+        </w:rPr>
+        <w:t xml:space="preserve">, </w:t>
+      </w:r>
+      <w:r>
+        <w:rPr>
+          <w:rFonts w:ascii="Consolas" w:cs="Consolas" w:eastAsia="Consolas" w:hAnsi="Consolas"/>
+          <w:sz w:val="20"/>
+          <w:szCs w:val="20"/>
+          <w:shd w:fill="F0F0F0" w:val="clear"/>
+        </w:rPr>
+        <w:t xml:space="preserve">Unable to Fill</w:t>
+      </w:r>
+      <w:r>
+        <w:rPr>
+          <w:rFonts w:ascii="Calibri" w:cs="Calibri" w:eastAsia="Calibri" w:hAnsi="Calibri"/>
+          <w:sz w:val="22"/>
+          <w:szCs w:val="22"/>
+        </w:rPr>
+        <w:t xml:space="preserve">, or </w:t>
+      </w:r>
+      <w:r>
+        <w:rPr>
+          <w:rFonts w:ascii="Consolas" w:cs="Consolas" w:eastAsia="Consolas" w:hAnsi="Consolas"/>
+          <w:sz w:val="20"/>
+          <w:szCs w:val="20"/>
+          <w:shd w:fill="F0F0F0" w:val="clear"/>
+        </w:rPr>
+        <w:t xml:space="preserve">Cancelled</w:t>
+      </w:r>
+      <w:r>
+        <w:rPr>
+          <w:rFonts w:ascii="Calibri" w:cs="Calibri" w:eastAsia="Calibri" w:hAnsi="Calibri"/>
+          <w:sz w:val="22"/>
+          <w:szCs w:val="22"/>
+        </w:rPr>
+        <w:t xml:space="preserve">. Concretely: </w:t>
+      </w:r>
+      <w:r>
+        <w:rPr>
+          <w:rFonts w:ascii="Consolas" w:cs="Consolas" w:eastAsia="Consolas" w:hAnsi="Consolas"/>
+          <w:sz w:val="20"/>
+          <w:szCs w:val="20"/>
+          <w:shd w:fill="F0F0F0" w:val="clear"/>
+        </w:rPr>
+        <w:t xml:space="preserve">canCancel = !cancellationRequested &amp;&amp; !CANCELLATION_BLOCKED_STATUSES.includes(Status__c)</w:t>
+      </w:r>
+      <w:r>
+        <w:rPr>
+          <w:rFonts w:ascii="Calibri" w:cs="Calibri" w:eastAsia="Calibri" w:hAnsi="Calibri"/>
+          <w:sz w:val="22"/>
+          <w:szCs w:val="22"/>
+        </w:rPr>
+        <w:t xml:space="preserve">, where </w:t>
+      </w:r>
+      <w:r>
+        <w:rPr>
+          <w:rFonts w:ascii="Consolas" w:cs="Consolas" w:eastAsia="Consolas" w:hAnsi="Consolas"/>
+          <w:sz w:val="20"/>
+          <w:szCs w:val="20"/>
+          <w:shd w:fill="F0F0F0" w:val="clear"/>
+        </w:rPr>
+        <w:t xml:space="preserve">CANCELLATION_BLOCKED_STATUSES = ['Filled', 'Unable to Fill', 'Cancelled']</w:t>
+      </w:r>
+      <w:r>
+        <w:rPr>
+          <w:rFonts w:ascii="Calibri" w:cs="Calibri" w:eastAsia="Calibri" w:hAnsi="Calibri"/>
+          <w:sz w:val="22"/>
+          <w:szCs w:val="22"/>
+        </w:rPr>
+        <w:t xml:space="preserve">. For a row in any of those three statuses, no Action dropdown renders at all, regardless of the Cancellation Requested flag — there is no way to request cancellation on a shift that is already Filled, already Unable to Fill, or already Cancelled through this UI.</w:t>
       </w:r>
     </w:p>
     <w:p>
@@ -1946,7 +1879,41 @@
           <w:sz w:val="22"/>
           <w:szCs w:val="22"/>
         </w:rPr>
-        <w:t xml:space="preserve">The button label switches per row: “Download PDF” when a file exists, or “View” (the old record-page navigation) when it doesn't.</w:t>
+        <w:t xml:space="preserve">This closed a real gap: </w:t>
+      </w:r>
+      <w:r>
+        <w:rPr>
+          <w:rFonts w:ascii="Consolas" w:cs="Consolas" w:eastAsia="Consolas" w:hAnsi="Consolas"/>
+          <w:sz w:val="20"/>
+          <w:szCs w:val="20"/>
+          <w:shd w:fill="F0F0F0" w:val="clear"/>
+        </w:rPr>
+        <w:t xml:space="preserve">Cancellation_Requested__c</w:t>
+      </w:r>
+      <w:r>
+        <w:rPr>
+          <w:rFonts w:ascii="Calibri" w:cs="Calibri" w:eastAsia="Calibri" w:hAnsi="Calibri"/>
+          <w:sz w:val="22"/>
+          <w:szCs w:val="22"/>
+        </w:rPr>
+        <w:t xml:space="preserve"> existed and was already displayed as a column, but nothing in the codebase ever actually set it. </w:t>
+      </w:r>
+      <w:r>
+        <w:rPr>
+          <w:rFonts w:ascii="Consolas" w:cs="Consolas" w:eastAsia="Consolas" w:hAnsi="Consolas"/>
+          <w:sz w:val="20"/>
+          <w:szCs w:val="20"/>
+          <w:shd w:fill="F0F0F0" w:val="clear"/>
+        </w:rPr>
+        <w:t xml:space="preserve">SupportRequestService</w:t>
+      </w:r>
+      <w:r>
+        <w:rPr>
+          <w:rFonts w:ascii="Calibri" w:cs="Calibri" w:eastAsia="Calibri" w:hAnsi="Calibri"/>
+          <w:sz w:val="22"/>
+          <w:szCs w:val="22"/>
+        </w:rPr>
+        <w:t xml:space="preserve"> now flags it on the related request whenever a Cancellation Request Case is created, regardless of which screen submitted it.</w:t>
       </w:r>
     </w:p>
     <w:p>
@@ -1955,7 +1922,7 @@
         <w:spacing w:after="100" w:before="200"/>
       </w:pPr>
       <w:r>
-        <w:t xml:space="preserve">3.4.1 Download mechanism</w:t>
+        <w:t xml:space="preserve">3.2.2 Action column placement</w:t>
       </w:r>
     </w:p>
     <w:p>
@@ -1965,37 +1932,181 @@
       <w:r>
         <w:rPr>
           <w:rFonts w:ascii="Calibri" w:cs="Calibri" w:eastAsia="Calibri" w:hAnsi="Calibri"/>
-          <w:b/>
-          <w:bCs/>
-          <w:sz w:val="22"/>
-          <w:szCs w:val="22"/>
-        </w:rPr>
-        <w:t xml:space="preserve">Does not </w:t>
-      </w:r>
-      <w:r>
-        <w:rPr>
-          <w:rFonts w:ascii="Calibri" w:cs="Calibri" w:eastAsia="Calibri" w:hAnsi="Calibri"/>
-          <w:sz w:val="22"/>
-          <w:szCs w:val="22"/>
-        </w:rPr>
-        <w:t xml:space="preserve">link to Salesforce's internal </w:t>
-      </w:r>
-      <w:r>
-        <w:rPr>
-          <w:rFonts w:ascii="Consolas" w:cs="Consolas" w:eastAsia="Consolas" w:hAnsi="Consolas"/>
-          <w:sz w:val="20"/>
-          <w:szCs w:val="20"/>
-          <w:shd w:fill="F0F0F0" w:val="clear"/>
-        </w:rPr>
-        <w:t xml:space="preserve">/sfc/servlet.shepherd/document/download/{id}</w:t>
-      </w:r>
-      <w:r>
-        <w:rPr>
-          <w:rFonts w:ascii="Calibri" w:cs="Calibri" w:eastAsia="Calibri" w:hAnsi="Calibri"/>
-          <w:sz w:val="22"/>
-          <w:szCs w:val="22"/>
-        </w:rPr>
-        <w:t xml:space="preserve"> file servlet path — that path lives on Salesforce's core domain and 404s on this Experience Cloud (LWR) site, landing on the site's “Invalid Page” instead of the file.</w:t>
+          <w:sz w:val="22"/>
+          <w:szCs w:val="22"/>
+        </w:rPr>
+        <w:t xml:space="preserve">The Action column is the first column, titled “Action” (it started as a trailing, unlabeled column). The dropdown's menu-alignment moved from right to left — right was correct while Action was the last column (menu opens leftward, staying inside the table), but once Action became the first column that alignment opened the menu off the left edge, clipped by the table wrapper's overflow-x: auto. left opens it rightward into the table where there is room.</w:t>
+      </w:r>
+    </w:p>
+    <w:p>
+      <w:pPr>
+        <w:spacing w:after="160"/>
+      </w:pPr>
+      <w:r>
+        <w:rPr>
+          <w:rFonts w:ascii="Calibri" w:cs="Calibri" w:eastAsia="Calibri" w:hAnsi="Calibri"/>
+          <w:sz w:val="22"/>
+          <w:szCs w:val="22"/>
+        </w:rPr>
+        <w:t xml:space="preserve">The table container also has defensive max-width: 100% / overflow-x: auto CSS on its wrapper elements, so wide row content scrolls within the table's own frame instead of stretching the page.</w:t>
+      </w:r>
+    </w:p>
+    <w:p>
+      <w:pPr>
+        <w:pStyle w:val="Heading3"/>
+        <w:spacing w:after="100" w:before="200"/>
+      </w:pPr>
+      <w:r>
+        <w:t xml:space="preserve">3.2.3 Mobile card layout</w:t>
+      </w:r>
+    </w:p>
+    <w:p>
+      <w:pPr>
+        <w:spacing w:after="160"/>
+      </w:pPr>
+      <w:r>
+        <w:rPr>
+          <w:rFonts w:ascii="Calibri" w:cs="Calibri" w:eastAsia="Calibri" w:hAnsi="Calibri"/>
+          <w:sz w:val="22"/>
+          <w:szCs w:val="22"/>
+        </w:rPr>
+        <w:t xml:space="preserve">Below a </w:t>
+      </w:r>
+      <w:r>
+        <w:rPr>
+          <w:rFonts w:ascii="Consolas" w:cs="Consolas" w:eastAsia="Consolas" w:hAnsi="Consolas"/>
+          <w:sz w:val="20"/>
+          <w:szCs w:val="20"/>
+          <w:shd w:fill="F0F0F0" w:val="clear"/>
+        </w:rPr>
+        <w:t xml:space="preserve">48rem</w:t>
+      </w:r>
+      <w:r>
+        <w:rPr>
+          <w:rFonts w:ascii="Calibri" w:cs="Calibri" w:eastAsia="Calibri" w:hAnsi="Calibri"/>
+          <w:sz w:val="22"/>
+          <w:szCs w:val="22"/>
+        </w:rPr>
+        <w:t xml:space="preserve"> (~768px) viewport, </w:t>
+      </w:r>
+      <w:r>
+        <w:rPr>
+          <w:rFonts w:ascii="Consolas" w:cs="Consolas" w:eastAsia="Consolas" w:hAnsi="Consolas"/>
+          <w:sz w:val="20"/>
+          <w:szCs w:val="20"/>
+          <w:shd w:fill="F0F0F0" w:val="clear"/>
+        </w:rPr>
+        <w:t xml:space="preserve">myStaffingRequests</w:t>
+      </w:r>
+      <w:r>
+        <w:rPr>
+          <w:rFonts w:ascii="Calibri" w:cs="Calibri" w:eastAsia="Calibri" w:hAnsi="Calibri"/>
+          <w:sz w:val="22"/>
+          <w:szCs w:val="22"/>
+        </w:rPr>
+        <w:t xml:space="preserve"> and </w:t>
+      </w:r>
+      <w:r>
+        <w:rPr>
+          <w:rFonts w:ascii="Consolas" w:cs="Consolas" w:eastAsia="Consolas" w:hAnsi="Consolas"/>
+          <w:sz w:val="20"/>
+          <w:szCs w:val="20"/>
+          <w:shd w:fill="F0F0F0" w:val="clear"/>
+        </w:rPr>
+        <w:t xml:space="preserve">staffingRequestReporting</w:t>
+      </w:r>
+      <w:r>
+        <w:rPr>
+          <w:rFonts w:ascii="Calibri" w:cs="Calibri" w:eastAsia="Calibri" w:hAnsi="Calibri"/>
+          <w:sz w:val="22"/>
+          <w:szCs w:val="22"/>
+        </w:rPr>
+        <w:t xml:space="preserve"> both switch from the wide table to a per-row card, rather than leaving a 15+ column table to be scrolled sideways on a phone. A CSS media query (each component's own CSS — Shadow DOM means it can't be a shared file) hides the </w:t>
+      </w:r>
+      <w:r>
+        <w:rPr>
+          <w:rFonts w:ascii="Consolas" w:cs="Consolas" w:eastAsia="Consolas" w:hAnsi="Consolas"/>
+          <w:sz w:val="20"/>
+          <w:szCs w:val="20"/>
+          <w:shd w:fill="F0F0F0" w:val="clear"/>
+        </w:rPr>
+        <w:t xml:space="preserve">&lt;thead&gt;</w:t>
+      </w:r>
+      <w:r>
+        <w:rPr>
+          <w:rFonts w:ascii="Calibri" w:cs="Calibri" w:eastAsia="Calibri" w:hAnsi="Calibri"/>
+          <w:sz w:val="22"/>
+          <w:szCs w:val="22"/>
+        </w:rPr>
+        <w:t xml:space="preserve"> and turns each </w:t>
+      </w:r>
+      <w:r>
+        <w:rPr>
+          <w:rFonts w:ascii="Consolas" w:cs="Consolas" w:eastAsia="Consolas" w:hAnsi="Consolas"/>
+          <w:sz w:val="20"/>
+          <w:szCs w:val="20"/>
+          <w:shd w:fill="F0F0F0" w:val="clear"/>
+        </w:rPr>
+        <w:t xml:space="preserve">&lt;tr&gt;</w:t>
+      </w:r>
+      <w:r>
+        <w:rPr>
+          <w:rFonts w:ascii="Calibri" w:cs="Calibri" w:eastAsia="Calibri" w:hAnsi="Calibri"/>
+          <w:sz w:val="22"/>
+          <w:szCs w:val="22"/>
+        </w:rPr>
+        <w:t xml:space="preserve"> into a bordered card; a </w:t>
+      </w:r>
+      <w:r>
+        <w:rPr>
+          <w:rFonts w:ascii="Consolas" w:cs="Consolas" w:eastAsia="Consolas" w:hAnsi="Consolas"/>
+          <w:sz w:val="20"/>
+          <w:szCs w:val="20"/>
+          <w:shd w:fill="F0F0F0" w:val="clear"/>
+        </w:rPr>
+        <w:t xml:space="preserve">data-label</w:t>
+      </w:r>
+      <w:r>
+        <w:rPr>
+          <w:rFonts w:ascii="Calibri" w:cs="Calibri" w:eastAsia="Calibri" w:hAnsi="Calibri"/>
+          <w:sz w:val="22"/>
+          <w:szCs w:val="22"/>
+        </w:rPr>
+        <w:t xml:space="preserve"> attribute on every </w:t>
+      </w:r>
+      <w:r>
+        <w:rPr>
+          <w:rFonts w:ascii="Consolas" w:cs="Consolas" w:eastAsia="Consolas" w:hAnsi="Consolas"/>
+          <w:sz w:val="20"/>
+          <w:szCs w:val="20"/>
+          <w:shd w:fill="F0F0F0" w:val="clear"/>
+        </w:rPr>
+        <w:t xml:space="preserve">&lt;td&gt;</w:t>
+      </w:r>
+      <w:r>
+        <w:rPr>
+          <w:rFonts w:ascii="Calibri" w:cs="Calibri" w:eastAsia="Calibri" w:hAnsi="Calibri"/>
+          <w:sz w:val="22"/>
+          <w:szCs w:val="22"/>
+        </w:rPr>
+        <w:t xml:space="preserve"> (unused above the breakpoint) supplies a small label above its value via </w:t>
+      </w:r>
+      <w:r>
+        <w:rPr>
+          <w:rFonts w:ascii="Consolas" w:cs="Consolas" w:eastAsia="Consolas" w:hAnsi="Consolas"/>
+          <w:sz w:val="20"/>
+          <w:szCs w:val="20"/>
+          <w:shd w:fill="F0F0F0" w:val="clear"/>
+        </w:rPr>
+        <w:t xml:space="preserve">::before</w:t>
+      </w:r>
+      <w:r>
+        <w:rPr>
+          <w:rFonts w:ascii="Calibri" w:cs="Calibri" w:eastAsia="Calibri" w:hAnsi="Calibri"/>
+          <w:sz w:val="22"/>
+          <w:szCs w:val="22"/>
+        </w:rPr>
+        <w:t xml:space="preserve">, since the column headers are no longer visible to label them.</w:t>
       </w:r>
     </w:p>
     <w:p>
@@ -2009,54 +2120,21 @@
       </w:pPr>
       <w:r>
         <w:rPr>
-          <w:rFonts w:ascii="Consolas" w:cs="Consolas" w:eastAsia="Consolas" w:hAnsi="Consolas"/>
-          <w:sz w:val="20"/>
-          <w:szCs w:val="20"/>
-          <w:shd w:fill="F0F0F0" w:val="clear"/>
-        </w:rPr>
-        <w:t xml:space="preserve">InvoiceController.getInvoiceFileData(invoiceId)</w:t>
-      </w:r>
-      <w:r>
-        <w:rPr>
-          <w:rFonts w:ascii="Calibri" w:cs="Calibri" w:eastAsia="Calibri" w:hAnsi="Calibri"/>
-          <w:sz w:val="22"/>
-          <w:szCs w:val="22"/>
-        </w:rPr>
-        <w:t xml:space="preserve"> is called imperatively (only fetched on click, not preloaded per row) and returns the file's bytes base64-encoded (</w:t>
-      </w:r>
-      <w:r>
-        <w:rPr>
-          <w:rFonts w:ascii="Consolas" w:cs="Consolas" w:eastAsia="Consolas" w:hAnsi="Consolas"/>
-          <w:sz w:val="20"/>
-          <w:szCs w:val="20"/>
-          <w:shd w:fill="F0F0F0" w:val="clear"/>
-        </w:rPr>
-        <w:t xml:space="preserve">EncodingUtil.base64Encode</w:t>
-      </w:r>
-      <w:r>
-        <w:rPr>
-          <w:rFonts w:ascii="Calibri" w:cs="Calibri" w:eastAsia="Calibri" w:hAnsi="Calibri"/>
-          <w:sz w:val="22"/>
-          <w:szCs w:val="22"/>
-        </w:rPr>
-        <w:t xml:space="preserve"> on the </w:t>
-      </w:r>
-      <w:r>
-        <w:rPr>
-          <w:rFonts w:ascii="Consolas" w:cs="Consolas" w:eastAsia="Consolas" w:hAnsi="Consolas"/>
-          <w:sz w:val="20"/>
-          <w:szCs w:val="20"/>
-          <w:shd w:fill="F0F0F0" w:val="clear"/>
-        </w:rPr>
-        <w:t xml:space="preserve">ContentVersion.VersionData</w:t>
-      </w:r>
-      <w:r>
-        <w:rPr>
-          <w:rFonts w:ascii="Calibri" w:cs="Calibri" w:eastAsia="Calibri" w:hAnsi="Calibri"/>
-          <w:sz w:val="22"/>
-          <w:szCs w:val="22"/>
-        </w:rPr>
-        <w:t xml:space="preserve"> Blob) plus its filename.</w:t>
+          <w:rFonts w:ascii="Calibri" w:cs="Calibri" w:eastAsia="Calibri" w:hAnsi="Calibri"/>
+          <w:b/>
+          <w:bCs/>
+          <w:sz w:val="22"/>
+          <w:szCs w:val="22"/>
+        </w:rPr>
+        <w:t xml:space="preserve">Always shown on the card: </w:t>
+      </w:r>
+      <w:r>
+        <w:rPr>
+          <w:rFonts w:ascii="Calibri" w:cs="Calibri" w:eastAsia="Calibri" w:hAnsi="Calibri"/>
+          <w:sz w:val="22"/>
+          <w:szCs w:val="22"/>
+        </w:rPr>
+        <w:t xml:space="preserve">Request, Facility, Role, Shift Date, Start Time, Status, and (My Requests only) the Action menu.</w:t>
       </w:r>
     </w:p>
     <w:p>
@@ -2071,27 +2149,88 @@
       <w:r>
         <w:rPr>
           <w:rFonts w:ascii="Calibri" w:cs="Calibri" w:eastAsia="Calibri" w:hAnsi="Calibri"/>
-          <w:sz w:val="22"/>
-          <w:szCs w:val="22"/>
-        </w:rPr>
-        <w:t xml:space="preserve">The LWC builds a </w:t>
-      </w:r>
-      <w:r>
-        <w:rPr>
-          <w:rFonts w:ascii="Consolas" w:cs="Consolas" w:eastAsia="Consolas" w:hAnsi="Consolas"/>
-          <w:sz w:val="20"/>
-          <w:szCs w:val="20"/>
-          <w:shd w:fill="F0F0F0" w:val="clear"/>
-        </w:rPr>
-        <w:t xml:space="preserve">data:application/octet-stream;base64,...</w:t>
-      </w:r>
-      <w:r>
-        <w:rPr>
-          <w:rFonts w:ascii="Calibri" w:cs="Calibri" w:eastAsia="Calibri" w:hAnsi="Calibri"/>
-          <w:sz w:val="22"/>
-          <w:szCs w:val="22"/>
-        </w:rPr>
-        <w:t xml:space="preserve"> URI and triggers the download via a plain in-page anchor click — the same technique Reporting's CSV export uses, with file bytes instead of CSV text.</w:t>
+          <w:b/>
+          <w:bCs/>
+          <w:sz w:val="22"/>
+          <w:szCs w:val="22"/>
+        </w:rPr>
+        <w:t xml:space="preserve">Behind a per-card "Show more" toggle: </w:t>
+      </w:r>
+      <w:r>
+        <w:rPr>
+          <w:rFonts w:ascii="Calibri" w:cs="Calibri" w:eastAsia="Calibri" w:hAnsi="Calibri"/>
+          <w:sz w:val="22"/>
+          <w:szCs w:val="22"/>
+        </w:rPr>
+        <w:t xml:space="preserve">Ward, Specialty, End Time, Quantity, Priority, Assigned Contact, Broadcasted, Cancellation Requested, Last Update — tagged with a </w:t>
+      </w:r>
+      <w:r>
+        <w:rPr>
+          <w:rFonts w:ascii="Consolas" w:cs="Consolas" w:eastAsia="Consolas" w:hAnsi="Consolas"/>
+          <w:sz w:val="20"/>
+          <w:szCs w:val="20"/>
+          <w:shd w:fill="F0F0F0" w:val="clear"/>
+        </w:rPr>
+        <w:t xml:space="preserve">*__cell_secondary</w:t>
+      </w:r>
+      <w:r>
+        <w:rPr>
+          <w:rFonts w:ascii="Calibri" w:cs="Calibri" w:eastAsia="Calibri" w:hAnsi="Calibri"/>
+          <w:sz w:val="22"/>
+          <w:szCs w:val="22"/>
+        </w:rPr>
+        <w:t xml:space="preserve"> class, hidden by the same media query, revealed only once that card is expanded. The toggle is appended as an extra cell at the end of each row (</w:t>
+      </w:r>
+      <w:r>
+        <w:rPr>
+          <w:rFonts w:ascii="Consolas" w:cs="Consolas" w:eastAsia="Consolas" w:hAnsi="Consolas"/>
+          <w:sz w:val="20"/>
+          <w:szCs w:val="20"/>
+          <w:shd w:fill="F0F0F0" w:val="clear"/>
+        </w:rPr>
+        <w:t xml:space="preserve">*__toggle-cell</w:t>
+      </w:r>
+      <w:r>
+        <w:rPr>
+          <w:rFonts w:ascii="Calibri" w:cs="Calibri" w:eastAsia="Calibri" w:hAnsi="Calibri"/>
+          <w:sz w:val="22"/>
+          <w:szCs w:val="22"/>
+        </w:rPr>
+        <w:t xml:space="preserve"> — always </w:t>
+      </w:r>
+      <w:r>
+        <w:rPr>
+          <w:rFonts w:ascii="Consolas" w:cs="Consolas" w:eastAsia="Consolas" w:hAnsi="Consolas"/>
+          <w:sz w:val="20"/>
+          <w:szCs w:val="20"/>
+          <w:shd w:fill="F0F0F0" w:val="clear"/>
+        </w:rPr>
+        <w:t xml:space="preserve">display: none</w:t>
+      </w:r>
+      <w:r>
+        <w:rPr>
+          <w:rFonts w:ascii="Calibri" w:cs="Calibri" w:eastAsia="Calibri" w:hAnsi="Calibri"/>
+          <w:sz w:val="22"/>
+          <w:szCs w:val="22"/>
+        </w:rPr>
+        <w:t xml:space="preserve"> above the breakpoint, so it never appears as a stray column on the desktop table). Each component tracks which rows are expanded itself (</w:t>
+      </w:r>
+      <w:r>
+        <w:rPr>
+          <w:rFonts w:ascii="Consolas" w:cs="Consolas" w:eastAsia="Consolas" w:hAnsi="Consolas"/>
+          <w:sz w:val="20"/>
+          <w:szCs w:val="20"/>
+          <w:shd w:fill="F0F0F0" w:val="clear"/>
+        </w:rPr>
+        <w:t xml:space="preserve">expandedIds</w:t>
+      </w:r>
+      <w:r>
+        <w:rPr>
+          <w:rFonts w:ascii="Calibri" w:cs="Calibri" w:eastAsia="Calibri" w:hAnsi="Calibri"/>
+          <w:sz w:val="22"/>
+          <w:szCs w:val="22"/>
+        </w:rPr>
+        <w:t xml:space="preserve">, an array of request Ids reassigned rather than mutated in place, since LWC only re-renders on property reassignment). No data is ever dropped on mobile — everything is one tap away, and the same field split is used on both screens for consistency. Desktop behaviour is completely unchanged.</w:t>
       </w:r>
     </w:p>
     <w:p>
@@ -2106,19 +2245,20 @@
       <w:r>
         <w:rPr>
           <w:rFonts w:ascii="Calibri" w:cs="Calibri" w:eastAsia="Calibri" w:hAnsi="Calibri"/>
-          <w:sz w:val="22"/>
-          <w:szCs w:val="22"/>
-        </w:rPr>
-        <w:t xml:space="preserve">A failed fetch (no file, wrong Account, etc.) shows a guaranteed inline error banner rather than a toast.</w:t>
-      </w:r>
-    </w:p>
-    <w:p>
-      <w:pPr>
-        <w:pStyle w:val="Heading3"/>
-        <w:spacing w:after="100" w:before="200"/>
-      </w:pPr>
-      <w:r>
-        <w:t xml:space="preserve">3.4.2 Root-cause investigation: portal users could not see invoice files</w:t>
+          <w:b/>
+          <w:bCs/>
+          <w:sz w:val="22"/>
+          <w:szCs w:val="22"/>
+        </w:rPr>
+        <w:t xml:space="preserve">invoiceList gets the same treatment, simpler: </w:t>
+      </w:r>
+      <w:r>
+        <w:rPr>
+          <w:rFonts w:ascii="Calibri" w:cs="Calibri" w:eastAsia="Calibri" w:hAnsi="Calibri"/>
+          <w:sz w:val="22"/>
+          <w:szCs w:val="22"/>
+        </w:rPr>
+        <w:t xml:space="preserve">only 6 columns (Invoice Number, Invoice Date, Due Date, Amount, Status, View/Download action), so every field shows directly on the card — no secondary/toggle split needed at all.</w:t>
       </w:r>
     </w:p>
     <w:p>
@@ -2128,10 +2268,219 @@
       <w:r>
         <w:rPr>
           <w:rFonts w:ascii="Calibri" w:cs="Calibri" w:eastAsia="Calibri" w:hAnsi="Calibri"/>
-          <w:sz w:val="22"/>
-          <w:szCs w:val="22"/>
-        </w:rPr>
-        <w:t xml:space="preserve">Getting this working against a real connected org took several rounds, all silent failures (query succeeds, returns nothing, no exception). Three things were tried and kept in place, though none turned out to be the actual root cause:</w:t>
+          <w:b/>
+          <w:bCs/>
+          <w:sz w:val="22"/>
+          <w:szCs w:val="22"/>
+        </w:rPr>
+        <w:t xml:space="preserve">The secondary cells didn't actually hide on the first pass — a CSS specificity bug, not a media-query bug.</w:t>
+      </w:r>
+      <w:r>
+        <w:rPr>
+          <w:rFonts w:ascii="Calibri" w:cs="Calibri" w:eastAsia="Calibri" w:hAnsi="Calibri"/>
+          <w:sz w:val="22"/>
+          <w:szCs w:val="22"/>
+        </w:rPr>
+        <w:t xml:space="preserve"> Confirmed on a real device, every column still showed regardless of a card's expanded state, which also made the toggle look broken (nothing further to reveal). Root cause: the layout rule </w:t>
+      </w:r>
+      <w:r>
+        <w:rPr>
+          <w:rFonts w:ascii="Consolas" w:cs="Consolas" w:eastAsia="Consolas" w:hAnsi="Consolas"/>
+          <w:sz w:val="20"/>
+          <w:szCs w:val="20"/>
+          <w:shd w:fill="F0F0F0" w:val="clear"/>
+        </w:rPr>
+        <w:t xml:space="preserve">.my-requests__table td { display: block; }</w:t>
+      </w:r>
+      <w:r>
+        <w:rPr>
+          <w:rFonts w:ascii="Calibri" w:cs="Calibri" w:eastAsia="Calibri" w:hAnsi="Calibri"/>
+          <w:sz w:val="22"/>
+          <w:szCs w:val="22"/>
+        </w:rPr>
+        <w:t xml:space="preserve"> (a class plus an element, specificity 0-1-1) was cascading over the hide rule </w:t>
+      </w:r>
+      <w:r>
+        <w:rPr>
+          <w:rFonts w:ascii="Consolas" w:cs="Consolas" w:eastAsia="Consolas" w:hAnsi="Consolas"/>
+          <w:sz w:val="20"/>
+          <w:szCs w:val="20"/>
+          <w:shd w:fill="F0F0F0" w:val="clear"/>
+        </w:rPr>
+        <w:t xml:space="preserve">.my-requests__cell_secondary { display: none; }</w:t>
+      </w:r>
+      <w:r>
+        <w:rPr>
+          <w:rFonts w:ascii="Calibri" w:cs="Calibri" w:eastAsia="Calibri" w:hAnsi="Calibri"/>
+          <w:sz w:val="22"/>
+          <w:szCs w:val="22"/>
+        </w:rPr>
+        <w:t xml:space="preserve"> (one class alone, specificity 0-1-0) — the </w:t>
+      </w:r>
+      <w:r>
+        <w:rPr>
+          <w:rFonts w:ascii="Calibri" w:cs="Calibri" w:eastAsia="Calibri" w:hAnsi="Calibri"/>
+          <w:b/>
+          <w:bCs/>
+          <w:sz w:val="22"/>
+          <w:szCs w:val="22"/>
+        </w:rPr>
+        <w:t xml:space="preserve">higher</w:t>
+      </w:r>
+      <w:r>
+        <w:rPr>
+          <w:rFonts w:ascii="Calibri" w:cs="Calibri" w:eastAsia="Calibri" w:hAnsi="Calibri"/>
+          <w:sz w:val="22"/>
+          <w:szCs w:val="22"/>
+        </w:rPr>
+        <w:t xml:space="preserve">-specificity rule always wins regardless of source order, so "hidden by default" silently lost every time. Fixed by qualifying both the hide and reveal selectors with </w:t>
+      </w:r>
+      <w:r>
+        <w:rPr>
+          <w:rFonts w:ascii="Consolas" w:cs="Consolas" w:eastAsia="Consolas" w:hAnsi="Consolas"/>
+          <w:sz w:val="20"/>
+          <w:szCs w:val="20"/>
+          <w:shd w:fill="F0F0F0" w:val="clear"/>
+        </w:rPr>
+        <w:t xml:space="preserve">td</w:t>
+      </w:r>
+      <w:r>
+        <w:rPr>
+          <w:rFonts w:ascii="Calibri" w:cs="Calibri" w:eastAsia="Calibri" w:hAnsi="Calibri"/>
+          <w:sz w:val="22"/>
+          <w:szCs w:val="22"/>
+        </w:rPr>
+        <w:t xml:space="preserve">/</w:t>
+      </w:r>
+      <w:r>
+        <w:rPr>
+          <w:rFonts w:ascii="Consolas" w:cs="Consolas" w:eastAsia="Consolas" w:hAnsi="Consolas"/>
+          <w:sz w:val="20"/>
+          <w:szCs w:val="20"/>
+          <w:shd w:fill="F0F0F0" w:val="clear"/>
+        </w:rPr>
+        <w:t xml:space="preserve">tr</w:t>
+      </w:r>
+      <w:r>
+        <w:rPr>
+          <w:rFonts w:ascii="Calibri" w:cs="Calibri" w:eastAsia="Calibri" w:hAnsi="Calibri"/>
+          <w:sz w:val="22"/>
+          <w:szCs w:val="22"/>
+        </w:rPr>
+        <w:t xml:space="preserve"> so they outrank the layout rule. Verified with a real Chromium instance (Playwright) checking </w:t>
+      </w:r>
+      <w:r>
+        <w:rPr>
+          <w:rFonts w:ascii="Consolas" w:cs="Consolas" w:eastAsia="Consolas" w:hAnsi="Consolas"/>
+          <w:sz w:val="20"/>
+          <w:szCs w:val="20"/>
+          <w:shd w:fill="F0F0F0" w:val="clear"/>
+        </w:rPr>
+        <w:t xml:space="preserve">getComputedStyle(...).display</w:t>
+      </w:r>
+      <w:r>
+        <w:rPr>
+          <w:rFonts w:ascii="Calibri" w:cs="Calibri" w:eastAsia="Calibri" w:hAnsi="Calibri"/>
+          <w:sz w:val="22"/>
+          <w:szCs w:val="22"/>
+        </w:rPr>
+        <w:t xml:space="preserve"> before/after adding the expanded class — Jest/jsdom doesn't compute CSS cascade at all, so the existing unit tests (which only assert the </w:t>
+      </w:r>
+      <w:r>
+        <w:rPr>
+          <w:rFonts w:ascii="Consolas" w:cs="Consolas" w:eastAsia="Consolas" w:hAnsi="Consolas"/>
+          <w:sz w:val="20"/>
+          <w:szCs w:val="20"/>
+          <w:shd w:fill="F0F0F0" w:val="clear"/>
+        </w:rPr>
+        <w:t xml:space="preserve">_expanded</w:t>
+      </w:r>
+      <w:r>
+        <w:rPr>
+          <w:rFonts w:ascii="Calibri" w:cs="Calibri" w:eastAsia="Calibri" w:hAnsi="Calibri"/>
+          <w:sz w:val="22"/>
+          <w:szCs w:val="22"/>
+        </w:rPr>
+        <w:t xml:space="preserve"> class was toggled, not the resulting visual </w:t>
+      </w:r>
+      <w:r>
+        <w:rPr>
+          <w:rFonts w:ascii="Consolas" w:cs="Consolas" w:eastAsia="Consolas" w:hAnsi="Consolas"/>
+          <w:sz w:val="20"/>
+          <w:szCs w:val="20"/>
+          <w:shd w:fill="F0F0F0" w:val="clear"/>
+        </w:rPr>
+        <w:t xml:space="preserve">display</w:t>
+      </w:r>
+      <w:r>
+        <w:rPr>
+          <w:rFonts w:ascii="Calibri" w:cs="Calibri" w:eastAsia="Calibri" w:hAnsi="Calibri"/>
+          <w:sz w:val="22"/>
+          <w:szCs w:val="22"/>
+        </w:rPr>
+        <w:t xml:space="preserve">) passed throughout and couldn't have caught this.</w:t>
+      </w:r>
+    </w:p>
+    <w:p>
+      <w:pPr>
+        <w:pStyle w:val="Heading2"/>
+        <w:spacing w:after="150" w:before="300"/>
+      </w:pPr>
+      <w:r>
+        <w:t xml:space="preserve">3.3 Calendar (requestStaffCalendar)</w:t>
+      </w:r>
+    </w:p>
+    <w:p>
+      <w:pPr>
+        <w:spacing w:after="160"/>
+      </w:pPr>
+      <w:r>
+        <w:rPr>
+          <w:rFonts w:ascii="Calibri" w:cs="Calibri" w:eastAsia="Calibri" w:hAnsi="Calibri"/>
+          <w:sz w:val="22"/>
+          <w:szCs w:val="22"/>
+        </w:rPr>
+        <w:t xml:space="preserve">Added convenience screen (nav label “Calendar”), not part of the original 6-screen deck: a month grid showing a badge on any day with existing requests. Clicking a day shows that day's bookings (Quantity + Role, Facility/Ward, Status) plus a Request Staff button that navigates to the Request Staff page with the date carried in state — Calendar is for reviewing what is already booked, Request Staff is where a request is actually submitted. Each booking is also clickable, navigating to My Requests filtered to that shift date.</w:t>
+      </w:r>
+    </w:p>
+    <w:p>
+      <w:pPr>
+        <w:pStyle w:val="Heading2"/>
+        <w:spacing w:after="150" w:before="300"/>
+      </w:pPr>
+      <w:r>
+        <w:t xml:space="preserve">3.4 Invoices (invoiceList)</w:t>
+      </w:r>
+    </w:p>
+    <w:p>
+      <w:pPr>
+        <w:spacing w:after="160"/>
+      </w:pPr>
+      <w:r>
+        <w:rPr>
+          <w:rFonts w:ascii="Calibri" w:cs="Calibri" w:eastAsia="Calibri" w:hAnsi="Calibri"/>
+          <w:sz w:val="22"/>
+          <w:szCs w:val="22"/>
+        </w:rPr>
+        <w:t xml:space="preserve">Has the same search/sort behaviour as My Requests. The </w:t>
+      </w:r>
+      <w:r>
+        <w:rPr>
+          <w:rFonts w:ascii="Calibri" w:cs="Calibri" w:eastAsia="Calibri" w:hAnsi="Calibri"/>
+          <w:b/>
+          <w:bCs/>
+          <w:sz w:val="22"/>
+          <w:szCs w:val="22"/>
+        </w:rPr>
+        <w:t xml:space="preserve">View / Download</w:t>
+      </w:r>
+      <w:r>
+        <w:rPr>
+          <w:rFonts w:ascii="Calibri" w:cs="Calibri" w:eastAsia="Calibri" w:hAnsi="Calibri"/>
+          <w:sz w:val="22"/>
+          <w:szCs w:val="22"/>
+        </w:rPr>
+        <w:t xml:space="preserve"> button is wired to the actual attached file, not just the record page.</w:t>
       </w:r>
     </w:p>
     <w:p>
@@ -2145,38 +2494,88 @@
       </w:pPr>
       <w:r>
         <w:rPr>
-          <w:rFonts w:ascii="Calibri" w:cs="Calibri" w:eastAsia="Calibri" w:hAnsi="Calibri"/>
-          <w:b/>
-          <w:bCs/>
-          <w:sz w:val="22"/>
-          <w:szCs w:val="22"/>
-        </w:rPr>
-        <w:t xml:space="preserve">1. Row-level sharing — </w:t>
-      </w:r>
-      <w:r>
-        <w:rPr>
-          <w:rFonts w:ascii="Calibri" w:cs="Calibri" w:eastAsia="Calibri" w:hAnsi="Calibri"/>
-          <w:sz w:val="22"/>
-          <w:szCs w:val="22"/>
-        </w:rPr>
-        <w:t xml:space="preserve">ContentDocumentLink's own visibility for a portal/Community user doesn't reliably follow the linked record's sharing. A new </w:t>
-      </w:r>
-      <w:r>
-        <w:rPr>
-          <w:rFonts w:ascii="Consolas" w:cs="Consolas" w:eastAsia="Consolas" w:hAnsi="Consolas"/>
-          <w:sz w:val="20"/>
-          <w:szCs w:val="20"/>
-          <w:shd w:fill="F0F0F0" w:val="clear"/>
-        </w:rPr>
-        <w:t xml:space="preserve">WithoutSharingFileAccess</w:t>
-      </w:r>
-      <w:r>
-        <w:rPr>
-          <w:rFonts w:ascii="Calibri" w:cs="Calibri" w:eastAsia="Calibri" w:hAnsi="Calibri"/>
-          <w:sz w:val="22"/>
-          <w:szCs w:val="22"/>
-        </w:rPr>
-        <w:t xml:space="preserve"> class runs the </w:t>
+          <w:rFonts w:ascii="Consolas" w:cs="Consolas" w:eastAsia="Consolas" w:hAnsi="Consolas"/>
+          <w:sz w:val="20"/>
+          <w:szCs w:val="20"/>
+          <w:shd w:fill="F0F0F0" w:val="clear"/>
+        </w:rPr>
+        <w:t xml:space="preserve">InvoiceController.getInvoiceFileIds()</w:t>
+      </w:r>
+      <w:r>
+        <w:rPr>
+          <w:rFonts w:ascii="Calibri" w:cs="Calibri" w:eastAsia="Calibri" w:hAnsi="Calibri"/>
+          <w:sz w:val="22"/>
+          <w:szCs w:val="22"/>
+        </w:rPr>
+        <w:t xml:space="preserve"> returns a </w:t>
+      </w:r>
+      <w:r>
+        <w:rPr>
+          <w:rFonts w:ascii="Consolas" w:cs="Consolas" w:eastAsia="Consolas" w:hAnsi="Consolas"/>
+          <w:sz w:val="20"/>
+          <w:szCs w:val="20"/>
+          <w:shd w:fill="F0F0F0" w:val="clear"/>
+        </w:rPr>
+        <w:t xml:space="preserve">Map&lt;Id, Id&gt;</w:t>
+      </w:r>
+      <w:r>
+        <w:rPr>
+          <w:rFonts w:ascii="Calibri" w:cs="Calibri" w:eastAsia="Calibri" w:hAnsi="Calibri"/>
+          <w:sz w:val="22"/>
+          <w:szCs w:val="22"/>
+        </w:rPr>
+        <w:t xml:space="preserve"> of invoice Id → the most recently modified </w:t>
+      </w:r>
+      <w:r>
+        <w:rPr>
+          <w:rFonts w:ascii="Consolas" w:cs="Consolas" w:eastAsia="Consolas" w:hAnsi="Consolas"/>
+          <w:sz w:val="20"/>
+          <w:szCs w:val="20"/>
+          <w:shd w:fill="F0F0F0" w:val="clear"/>
+        </w:rPr>
+        <w:t xml:space="preserve">ContentDocumentId</w:t>
+      </w:r>
+      <w:r>
+        <w:rPr>
+          <w:rFonts w:ascii="Calibri" w:cs="Calibri" w:eastAsia="Calibri" w:hAnsi="Calibri"/>
+          <w:sz w:val="22"/>
+          <w:szCs w:val="22"/>
+        </w:rPr>
+        <w:t xml:space="preserve"> linked to it (a second, separate </w:t>
+      </w:r>
+      <w:r>
+        <w:rPr>
+          <w:rFonts w:ascii="Consolas" w:cs="Consolas" w:eastAsia="Consolas" w:hAnsi="Consolas"/>
+          <w:sz w:val="20"/>
+          <w:szCs w:val="20"/>
+          <w:shd w:fill="F0F0F0" w:val="clear"/>
+        </w:rPr>
+        <w:t xml:space="preserve">@wire</w:t>
+      </w:r>
+      <w:r>
+        <w:rPr>
+          <w:rFonts w:ascii="Calibri" w:cs="Calibri" w:eastAsia="Calibri" w:hAnsi="Calibri"/>
+          <w:sz w:val="22"/>
+          <w:szCs w:val="22"/>
+        </w:rPr>
+        <w:t xml:space="preserve">, since the file is a standard </w:t>
+      </w:r>
+      <w:r>
+        <w:rPr>
+          <w:rFonts w:ascii="Consolas" w:cs="Consolas" w:eastAsia="Consolas" w:hAnsi="Consolas"/>
+          <w:sz w:val="20"/>
+          <w:szCs w:val="20"/>
+          <w:shd w:fill="F0F0F0" w:val="clear"/>
+        </w:rPr>
+        <w:t xml:space="preserve">ContentVersion</w:t>
+      </w:r>
+      <w:r>
+        <w:rPr>
+          <w:rFonts w:ascii="Calibri" w:cs="Calibri" w:eastAsia="Calibri" w:hAnsi="Calibri"/>
+          <w:sz w:val="22"/>
+          <w:szCs w:val="22"/>
+        </w:rPr>
+        <w:t xml:space="preserve">/</w:t>
       </w:r>
       <w:r>
         <w:rPr>
@@ -2193,41 +2592,24 @@
           <w:sz w:val="22"/>
           <w:szCs w:val="22"/>
         </w:rPr>
-        <w:t xml:space="preserve">/</w:t>
-      </w:r>
-      <w:r>
-        <w:rPr>
-          <w:rFonts w:ascii="Consolas" w:cs="Consolas" w:eastAsia="Consolas" w:hAnsi="Consolas"/>
-          <w:sz w:val="20"/>
-          <w:szCs w:val="20"/>
-          <w:shd w:fill="F0F0F0" w:val="clear"/>
-        </w:rPr>
-        <w:t xml:space="preserve">ContentVersion</w:t>
-      </w:r>
-      <w:r>
-        <w:rPr>
-          <w:rFonts w:ascii="Calibri" w:cs="Calibri" w:eastAsia="Calibri" w:hAnsi="Calibri"/>
-          <w:sz w:val="22"/>
-          <w:szCs w:val="22"/>
-        </w:rPr>
-        <w:t xml:space="preserve"> lookups without sharing, called only after </w:t>
-      </w:r>
-      <w:r>
-        <w:rPr>
-          <w:rFonts w:ascii="Consolas" w:cs="Consolas" w:eastAsia="Consolas" w:hAnsi="Consolas"/>
-          <w:sz w:val="20"/>
-          <w:szCs w:val="20"/>
-          <w:shd w:fill="F0F0F0" w:val="clear"/>
-        </w:rPr>
-        <w:t xml:space="preserve">InvoiceController</w:t>
-      </w:r>
-      <w:r>
-        <w:rPr>
-          <w:rFonts w:ascii="Calibri" w:cs="Calibri" w:eastAsia="Calibri" w:hAnsi="Calibri"/>
-          <w:sz w:val="22"/>
-          <w:szCs w:val="22"/>
-        </w:rPr>
-        <w:t xml:space="preserve"> has already confirmed (via its own with-sharing query) that the invoice belongs to the running user's Account.</w:t>
+        <w:t xml:space="preserve">, not a field on </w:t>
+      </w:r>
+      <w:r>
+        <w:rPr>
+          <w:rFonts w:ascii="Consolas" w:cs="Consolas" w:eastAsia="Consolas" w:hAnsi="Consolas"/>
+          <w:sz w:val="20"/>
+          <w:szCs w:val="20"/>
+          <w:shd w:fill="F0F0F0" w:val="clear"/>
+        </w:rPr>
+        <w:t xml:space="preserve">Invoice__c</w:t>
+      </w:r>
+      <w:r>
+        <w:rPr>
+          <w:rFonts w:ascii="Calibri" w:cs="Calibri" w:eastAsia="Calibri" w:hAnsi="Calibri"/>
+          <w:sz w:val="22"/>
+          <w:szCs w:val="22"/>
+        </w:rPr>
+        <w:t xml:space="preserve">) — merged onto each row client-side so it stays correct regardless of which wire resolves first.</w:t>
       </w:r>
     </w:p>
     <w:p>
@@ -2242,54 +2624,59 @@
       <w:r>
         <w:rPr>
           <w:rFonts w:ascii="Calibri" w:cs="Calibri" w:eastAsia="Calibri" w:hAnsi="Calibri"/>
+          <w:sz w:val="22"/>
+          <w:szCs w:val="22"/>
+        </w:rPr>
+        <w:t xml:space="preserve">The button label switches per row: “Download PDF” when a file exists, or “View” (the old record-page navigation) when it doesn't.</w:t>
+      </w:r>
+    </w:p>
+    <w:p>
+      <w:pPr>
+        <w:pStyle w:val="Heading3"/>
+        <w:spacing w:after="100" w:before="200"/>
+      </w:pPr>
+      <w:r>
+        <w:t xml:space="preserve">3.4.1 Download mechanism</w:t>
+      </w:r>
+    </w:p>
+    <w:p>
+      <w:pPr>
+        <w:spacing w:after="160"/>
+      </w:pPr>
+      <w:r>
+        <w:rPr>
+          <w:rFonts w:ascii="Calibri" w:cs="Calibri" w:eastAsia="Calibri" w:hAnsi="Calibri"/>
           <w:b/>
           <w:bCs/>
           <w:sz w:val="22"/>
           <w:szCs w:val="22"/>
         </w:rPr>
-        <w:t xml:space="preserve">2. Object-level CRUD — </w:t>
-      </w:r>
-      <w:r>
-        <w:rPr>
-          <w:rFonts w:ascii="Calibri" w:cs="Calibri" w:eastAsia="Calibri" w:hAnsi="Calibri"/>
-          <w:sz w:val="22"/>
-          <w:szCs w:val="22"/>
-        </w:rPr>
-        <w:t xml:space="preserve">without sharing only bypasses sharing rules, not object-level access, so </w:t>
-      </w:r>
-      <w:r>
-        <w:rPr>
-          <w:rFonts w:ascii="Consolas" w:cs="Consolas" w:eastAsia="Consolas" w:hAnsi="Consolas"/>
-          <w:sz w:val="20"/>
-          <w:szCs w:val="20"/>
-          <w:shd w:fill="F0F0F0" w:val="clear"/>
-        </w:rPr>
-        <w:t xml:space="preserve">ContentVersion</w:t>
-      </w:r>
-      <w:r>
-        <w:rPr>
-          <w:rFonts w:ascii="Calibri" w:cs="Calibri" w:eastAsia="Calibri" w:hAnsi="Calibri"/>
-          <w:sz w:val="22"/>
-          <w:szCs w:val="22"/>
-        </w:rPr>
-        <w:t xml:space="preserve"> was granted Read in </w:t>
-      </w:r>
-      <w:r>
-        <w:rPr>
-          <w:rFonts w:ascii="Consolas" w:cs="Consolas" w:eastAsia="Consolas" w:hAnsi="Consolas"/>
-          <w:sz w:val="20"/>
-          <w:szCs w:val="20"/>
-          <w:shd w:fill="F0F0F0" w:val="clear"/>
-        </w:rPr>
-        <w:t xml:space="preserve">Alliance_Client_Portal_User</w:t>
-      </w:r>
-      <w:r>
-        <w:rPr>
-          <w:rFonts w:ascii="Calibri" w:cs="Calibri" w:eastAsia="Calibri" w:hAnsi="Calibri"/>
-          <w:sz w:val="22"/>
-          <w:szCs w:val="22"/>
-        </w:rPr>
-        <w:t xml:space="preserve"> (objectPermissions).</w:t>
+        <w:t xml:space="preserve">Does not </w:t>
+      </w:r>
+      <w:r>
+        <w:rPr>
+          <w:rFonts w:ascii="Calibri" w:cs="Calibri" w:eastAsia="Calibri" w:hAnsi="Calibri"/>
+          <w:sz w:val="22"/>
+          <w:szCs w:val="22"/>
+        </w:rPr>
+        <w:t xml:space="preserve">link to Salesforce's internal </w:t>
+      </w:r>
+      <w:r>
+        <w:rPr>
+          <w:rFonts w:ascii="Consolas" w:cs="Consolas" w:eastAsia="Consolas" w:hAnsi="Consolas"/>
+          <w:sz w:val="20"/>
+          <w:szCs w:val="20"/>
+          <w:shd w:fill="F0F0F0" w:val="clear"/>
+        </w:rPr>
+        <w:t xml:space="preserve">/sfc/servlet.shepherd/document/download/{id}</w:t>
+      </w:r>
+      <w:r>
+        <w:rPr>
+          <w:rFonts w:ascii="Calibri" w:cs="Calibri" w:eastAsia="Calibri" w:hAnsi="Calibri"/>
+          <w:sz w:val="22"/>
+          <w:szCs w:val="22"/>
+        </w:rPr>
+        <w:t xml:space="preserve"> file servlet path — that path lives on Salesforce's core domain and 404s on this Experience Cloud (LWR) site, landing on the site's “Invalid Page” instead of the file.</w:t>
       </w:r>
     </w:p>
     <w:p>
@@ -2303,839 +2690,54 @@
       </w:pPr>
       <w:r>
         <w:rPr>
-          <w:rFonts w:ascii="Calibri" w:cs="Calibri" w:eastAsia="Calibri" w:hAnsi="Calibri"/>
-          <w:b/>
-          <w:bCs/>
-          <w:sz w:val="22"/>
-          <w:szCs w:val="22"/>
-        </w:rPr>
-        <w:t xml:space="preserve">3. A second object reached via relationship — </w:t>
-      </w:r>
-      <w:r>
-        <w:rPr>
-          <w:rFonts w:ascii="Calibri" w:cs="Calibri" w:eastAsia="Calibri" w:hAnsi="Calibri"/>
-          <w:sz w:val="22"/>
-          <w:szCs w:val="22"/>
-        </w:rPr>
-        <w:t xml:space="preserve">the query's </w:t>
-      </w:r>
-      <w:r>
-        <w:rPr>
-          <w:rFonts w:ascii="Consolas" w:cs="Consolas" w:eastAsia="Consolas" w:hAnsi="Consolas"/>
-          <w:sz w:val="20"/>
-          <w:szCs w:val="20"/>
-          <w:shd w:fill="F0F0F0" w:val="clear"/>
-        </w:rPr>
-        <w:t xml:space="preserve">ORDER BY ContentDocument.ContentModifiedDate DESC</w:t>
-      </w:r>
-      <w:r>
-        <w:rPr>
-          <w:rFonts w:ascii="Calibri" w:cs="Calibri" w:eastAsia="Calibri" w:hAnsi="Calibri"/>
-          <w:sz w:val="22"/>
-          <w:szCs w:val="22"/>
-        </w:rPr>
-        <w:t xml:space="preserve"> traversed into </w:t>
-      </w:r>
-      <w:r>
-        <w:rPr>
-          <w:rFonts w:ascii="Consolas" w:cs="Consolas" w:eastAsia="Consolas" w:hAnsi="Consolas"/>
-          <w:sz w:val="20"/>
-          <w:szCs w:val="20"/>
-          <w:shd w:fill="F0F0F0" w:val="clear"/>
-        </w:rPr>
-        <w:t xml:space="preserve">ContentDocument</w:t>
-      </w:r>
-      <w:r>
-        <w:rPr>
-          <w:rFonts w:ascii="Calibri" w:cs="Calibri" w:eastAsia="Calibri" w:hAnsi="Calibri"/>
-          <w:sz w:val="22"/>
-          <w:szCs w:val="22"/>
-        </w:rPr>
-        <w:t xml:space="preserve">, an object the permission set said nothing about. Now orders by </w:t>
-      </w:r>
-      <w:r>
-        <w:rPr>
-          <w:rFonts w:ascii="Consolas" w:cs="Consolas" w:eastAsia="Consolas" w:hAnsi="Consolas"/>
-          <w:sz w:val="20"/>
-          <w:szCs w:val="20"/>
-          <w:shd w:fill="F0F0F0" w:val="clear"/>
-        </w:rPr>
-        <w:t xml:space="preserve">ContentDocumentLink.SystemModstamp</w:t>
-      </w:r>
-      <w:r>
-        <w:rPr>
-          <w:rFonts w:ascii="Calibri" w:cs="Calibri" w:eastAsia="Calibri" w:hAnsi="Calibri"/>
-          <w:sz w:val="22"/>
-          <w:szCs w:val="22"/>
-        </w:rPr>
-        <w:t xml:space="preserve"> instead — a field on the object already being queried, avoiding the extra permission entirely.</w:t>
-      </w:r>
-    </w:p>
-    <w:p>
-      <w:pPr>
-        <w:spacing w:after="160"/>
-      </w:pPr>
-      <w:r>
-        <w:rPr>
-          <w:rFonts w:ascii="Calibri" w:cs="Calibri" w:eastAsia="Calibri" w:hAnsi="Calibri"/>
-          <w:b/>
-          <w:bCs/>
-          <w:sz w:val="22"/>
-          <w:szCs w:val="22"/>
-        </w:rPr>
-        <w:t xml:space="preserve">The actual root cause: </w:t>
-      </w:r>
-      <w:r>
-        <w:rPr>
-          <w:rFonts w:ascii="Calibri" w:cs="Calibri" w:eastAsia="Calibri" w:hAnsi="Calibri"/>
-          <w:sz w:val="22"/>
-          <w:szCs w:val="22"/>
-        </w:rPr>
-        <w:t xml:space="preserve">confirmed via </w:t>
-      </w:r>
-      <w:r>
-        <w:rPr>
-          <w:rFonts w:ascii="Consolas" w:cs="Consolas" w:eastAsia="Consolas" w:hAnsi="Consolas"/>
-          <w:sz w:val="20"/>
-          <w:szCs w:val="20"/>
-          <w:shd w:fill="F0F0F0" w:val="clear"/>
-        </w:rPr>
-        <w:t xml:space="preserve">System.debug</w:t>
-      </w:r>
-      <w:r>
-        <w:rPr>
-          <w:rFonts w:ascii="Calibri" w:cs="Calibri" w:eastAsia="Calibri" w:hAnsi="Calibri"/>
-          <w:sz w:val="22"/>
-          <w:szCs w:val="22"/>
-        </w:rPr>
-        <w:t xml:space="preserve"> in Execute Anonymous, directly on the </w:t>
-      </w:r>
-      <w:r>
-        <w:rPr>
-          <w:rFonts w:ascii="Consolas" w:cs="Consolas" w:eastAsia="Consolas" w:hAnsi="Consolas"/>
-          <w:sz w:val="20"/>
-          <w:szCs w:val="20"/>
-          <w:shd w:fill="F0F0F0" w:val="clear"/>
-        </w:rPr>
-        <w:t xml:space="preserve">ContentDocumentLink</w:t>
-      </w:r>
-      <w:r>
-        <w:rPr>
-          <w:rFonts w:ascii="Calibri" w:cs="Calibri" w:eastAsia="Calibri" w:hAnsi="Calibri"/>
-          <w:sz w:val="22"/>
-          <w:szCs w:val="22"/>
-        </w:rPr>
-        <w:t xml:space="preserve"> row: </w:t>
-      </w:r>
-      <w:r>
-        <w:rPr>
-          <w:rFonts w:ascii="Consolas" w:cs="Consolas" w:eastAsia="Consolas" w:hAnsi="Consolas"/>
-          <w:sz w:val="20"/>
-          <w:szCs w:val="20"/>
-          <w:shd w:fill="F0F0F0" w:val="clear"/>
-        </w:rPr>
-        <w:t xml:space="preserve">Visibility = 'InternalUsers'</w:t>
-      </w:r>
-      <w:r>
-        <w:rPr>
-          <w:rFonts w:ascii="Calibri" w:cs="Calibri" w:eastAsia="Calibri" w:hAnsi="Calibri"/>
-          <w:sz w:val="22"/>
-          <w:szCs w:val="22"/>
-        </w:rPr>
-        <w:t xml:space="preserve">. That field, set when the file was uploaded through the standard “Add Files” button, hard-blocks any external/Community/portal user from seeing that file, independent of sharing rules, CRUD, or permission sets. The fix for files already uploaded during investigation was a one-off Apex data update setting </w:t>
-      </w:r>
-      <w:r>
-        <w:rPr>
-          <w:rFonts w:ascii="Consolas" w:cs="Consolas" w:eastAsia="Consolas" w:hAnsi="Consolas"/>
-          <w:sz w:val="20"/>
-          <w:szCs w:val="20"/>
-          <w:shd w:fill="F0F0F0" w:val="clear"/>
-        </w:rPr>
-        <w:t xml:space="preserve">Visibility = 'AllUsers'</w:t>
-      </w:r>
-      <w:r>
-        <w:rPr>
-          <w:rFonts w:ascii="Calibri" w:cs="Calibri" w:eastAsia="Calibri" w:hAnsi="Calibri"/>
-          <w:sz w:val="22"/>
-          <w:szCs w:val="22"/>
-        </w:rPr>
-        <w:t xml:space="preserve">.</w:t>
-      </w:r>
-    </w:p>
-    <w:p>
-      <w:pPr>
-        <w:spacing w:after="160"/>
-      </w:pPr>
-      <w:r>
-        <w:rPr>
-          <w:rFonts w:ascii="Calibri" w:cs="Calibri" w:eastAsia="Calibri" w:hAnsi="Calibri"/>
-          <w:b/>
-          <w:bCs/>
-          <w:sz w:val="22"/>
-          <w:szCs w:val="22"/>
-        </w:rPr>
-        <w:t xml:space="preserve">Going forward this is automatic: </w:t>
-      </w:r>
-      <w:r>
-        <w:rPr>
-          <w:rFonts w:ascii="Consolas" w:cs="Consolas" w:eastAsia="Consolas" w:hAnsi="Consolas"/>
-          <w:sz w:val="20"/>
-          <w:szCs w:val="20"/>
-          <w:shd w:fill="F0F0F0" w:val="clear"/>
-        </w:rPr>
-        <w:t xml:space="preserve">ContentDocumentLinkTrigger</w:t>
-      </w:r>
-      <w:r>
-        <w:rPr>
-          <w:rFonts w:ascii="Calibri" w:cs="Calibri" w:eastAsia="Calibri" w:hAnsi="Calibri"/>
-          <w:sz w:val="22"/>
-          <w:szCs w:val="22"/>
-        </w:rPr>
-        <w:t xml:space="preserve"> (after insert on </w:t>
-      </w:r>
-      <w:r>
-        <w:rPr>
-          <w:rFonts w:ascii="Consolas" w:cs="Consolas" w:eastAsia="Consolas" w:hAnsi="Consolas"/>
-          <w:sz w:val="20"/>
-          <w:szCs w:val="20"/>
-          <w:shd w:fill="F0F0F0" w:val="clear"/>
-        </w:rPr>
-        <w:t xml:space="preserve">ContentDocumentLink</w:t>
-      </w:r>
-      <w:r>
-        <w:rPr>
-          <w:rFonts w:ascii="Calibri" w:cs="Calibri" w:eastAsia="Calibri" w:hAnsi="Calibri"/>
-          <w:sz w:val="22"/>
-          <w:szCs w:val="22"/>
-        </w:rPr>
-        <w:t xml:space="preserve">) calls </w:t>
-      </w:r>
-      <w:r>
-        <w:rPr>
-          <w:rFonts w:ascii="Consolas" w:cs="Consolas" w:eastAsia="Consolas" w:hAnsi="Consolas"/>
-          <w:sz w:val="20"/>
-          <w:szCs w:val="20"/>
-          <w:shd w:fill="F0F0F0" w:val="clear"/>
-        </w:rPr>
-        <w:t xml:space="preserve">ContentDocumentLinkVisibilityService.ensureAllUsersVisibilityForInvoiceFiles()</w:t>
-      </w:r>
-      <w:r>
-        <w:rPr>
-          <w:rFonts w:ascii="Calibri" w:cs="Calibri" w:eastAsia="Calibri" w:hAnsi="Calibri"/>
-          <w:sz w:val="22"/>
-          <w:szCs w:val="22"/>
-        </w:rPr>
-        <w:t xml:space="preserve">, correcting </w:t>
-      </w:r>
-      <w:r>
-        <w:rPr>
-          <w:rFonts w:ascii="Consolas" w:cs="Consolas" w:eastAsia="Consolas" w:hAnsi="Consolas"/>
-          <w:sz w:val="20"/>
-          <w:szCs w:val="20"/>
-          <w:shd w:fill="F0F0F0" w:val="clear"/>
-        </w:rPr>
-        <w:t xml:space="preserve">Visibility</w:t>
-      </w:r>
-      <w:r>
-        <w:rPr>
-          <w:rFonts w:ascii="Calibri" w:cs="Calibri" w:eastAsia="Calibri" w:hAnsi="Calibri"/>
-          <w:sz w:val="22"/>
-          <w:szCs w:val="22"/>
-        </w:rPr>
-        <w:t xml:space="preserve"> to </w:t>
-      </w:r>
-      <w:r>
-        <w:rPr>
-          <w:rFonts w:ascii="Consolas" w:cs="Consolas" w:eastAsia="Consolas" w:hAnsi="Consolas"/>
-          <w:sz w:val="20"/>
-          <w:szCs w:val="20"/>
-          <w:shd w:fill="F0F0F0" w:val="clear"/>
-        </w:rPr>
-        <w:t xml:space="preserve">AllUsers</w:t>
-      </w:r>
-      <w:r>
-        <w:rPr>
-          <w:rFonts w:ascii="Calibri" w:cs="Calibri" w:eastAsia="Calibri" w:hAnsi="Calibri"/>
-          <w:sz w:val="22"/>
-          <w:szCs w:val="22"/>
-        </w:rPr>
-        <w:t xml:space="preserve"> for any newly-linked file whose </w:t>
-      </w:r>
-      <w:r>
-        <w:rPr>
-          <w:rFonts w:ascii="Consolas" w:cs="Consolas" w:eastAsia="Consolas" w:hAnsi="Consolas"/>
-          <w:sz w:val="20"/>
-          <w:szCs w:val="20"/>
-          <w:shd w:fill="F0F0F0" w:val="clear"/>
-        </w:rPr>
-        <w:t xml:space="preserve">LinkedEntityId</w:t>
-      </w:r>
-      <w:r>
-        <w:rPr>
-          <w:rFonts w:ascii="Calibri" w:cs="Calibri" w:eastAsia="Calibri" w:hAnsi="Calibri"/>
-          <w:sz w:val="22"/>
-          <w:szCs w:val="22"/>
-        </w:rPr>
-        <w:t xml:space="preserve"> is an </w:t>
-      </w:r>
-      <w:r>
-        <w:rPr>
-          <w:rFonts w:ascii="Consolas" w:cs="Consolas" w:eastAsia="Consolas" w:hAnsi="Consolas"/>
-          <w:sz w:val="20"/>
-          <w:szCs w:val="20"/>
-          <w:shd w:fill="F0F0F0" w:val="clear"/>
-        </w:rPr>
-        <w:t xml:space="preserve">Invoice__c</w:t>
-      </w:r>
-      <w:r>
-        <w:rPr>
-          <w:rFonts w:ascii="Calibri" w:cs="Calibri" w:eastAsia="Calibri" w:hAnsi="Calibri"/>
-          <w:sz w:val="22"/>
-          <w:szCs w:val="22"/>
-        </w:rPr>
-        <w:t xml:space="preserve"> — scoped specifically to invoices. This runs without sharing for the same reason </w:t>
-      </w:r>
-      <w:r>
-        <w:rPr>
-          <w:rFonts w:ascii="Consolas" w:cs="Consolas" w:eastAsia="Consolas" w:hAnsi="Consolas"/>
-          <w:sz w:val="20"/>
-          <w:szCs w:val="20"/>
-          <w:shd w:fill="F0F0F0" w:val="clear"/>
-        </w:rPr>
-        <w:t xml:space="preserve">WithoutSharingDml</w:t>
-      </w:r>
-      <w:r>
-        <w:rPr>
-          <w:rFonts w:ascii="Calibri" w:cs="Calibri" w:eastAsia="Calibri" w:hAnsi="Calibri"/>
-          <w:sz w:val="22"/>
-          <w:szCs w:val="22"/>
-        </w:rPr>
-        <w:t xml:space="preserve"> does: the scope check (is this actually an Invoice__c) is the real access control.</w:t>
-      </w:r>
-    </w:p>
-    <w:p>
-      <w:pPr>
-        <w:spacing w:after="160"/>
-      </w:pPr>
-      <w:r>
-        <w:rPr>
-          <w:rFonts w:ascii="Calibri" w:cs="Calibri" w:eastAsia="Calibri" w:hAnsi="Calibri"/>
-          <w:sz w:val="22"/>
-          <w:szCs w:val="22"/>
-        </w:rPr>
-        <w:t xml:space="preserve">If </w:t>
-      </w:r>
-      <w:r>
-        <w:rPr>
-          <w:rFonts w:ascii="Consolas" w:cs="Consolas" w:eastAsia="Consolas" w:hAnsi="Consolas"/>
-          <w:sz w:val="20"/>
-          <w:szCs w:val="20"/>
-          <w:shd w:fill="F0F0F0" w:val="clear"/>
-        </w:rPr>
-        <w:t xml:space="preserve">getInvoiceFileIds()</w:t>
-      </w:r>
-      <w:r>
-        <w:rPr>
-          <w:rFonts w:ascii="Calibri" w:cs="Calibri" w:eastAsia="Calibri" w:hAnsi="Calibri"/>
-          <w:sz w:val="22"/>
-          <w:szCs w:val="22"/>
-        </w:rPr>
-        <w:t xml:space="preserve"> still fails for another reason (an actual exception), every row falls back to “View” rather than breaking the page — </w:t>
-      </w:r>
-      <w:r>
-        <w:rPr>
-          <w:rFonts w:ascii="Consolas" w:cs="Consolas" w:eastAsia="Consolas" w:hAnsi="Consolas"/>
-          <w:sz w:val="20"/>
-          <w:szCs w:val="20"/>
-          <w:shd w:fill="F0F0F0" w:val="clear"/>
-        </w:rPr>
-        <w:t xml:space="preserve">wiredFileIds()</w:t>
-      </w:r>
-      <w:r>
-        <w:rPr>
-          <w:rFonts w:ascii="Calibri" w:cs="Calibri" w:eastAsia="Calibri" w:hAnsi="Calibri"/>
-          <w:sz w:val="22"/>
-          <w:szCs w:val="22"/>
-        </w:rPr>
-        <w:t xml:space="preserve"> logs it to the console so it's diagnosable.</w:t>
-      </w:r>
-    </w:p>
-    <w:p>
-      <w:pPr>
-        <w:spacing w:after="160"/>
-      </w:pPr>
-      <w:r>
-        <w:rPr>
-          <w:rFonts w:ascii="Calibri" w:cs="Calibri" w:eastAsia="Calibri" w:hAnsi="Calibri"/>
-          <w:b/>
-          <w:bCs/>
-          <w:sz w:val="22"/>
-          <w:szCs w:val="22"/>
-        </w:rPr>
-        <w:t xml:space="preserve">A second, separate issue: </w:t>
-      </w:r>
-      <w:r>
-        <w:rPr>
-          <w:rFonts w:ascii="Calibri" w:cs="Calibri" w:eastAsia="Calibri" w:hAnsi="Calibri"/>
-          <w:sz w:val="22"/>
-          <w:szCs w:val="22"/>
-        </w:rPr>
-        <w:t xml:space="preserve">the “View” fallback (</w:t>
-      </w:r>
-      <w:r>
-        <w:rPr>
-          <w:rFonts w:ascii="Consolas" w:cs="Consolas" w:eastAsia="Consolas" w:hAnsi="Consolas"/>
-          <w:sz w:val="20"/>
-          <w:szCs w:val="20"/>
-          <w:shd w:fill="F0F0F0" w:val="clear"/>
-        </w:rPr>
-        <w:t xml:space="preserve">standard__recordPage</w:t>
-      </w:r>
-      <w:r>
-        <w:rPr>
-          <w:rFonts w:ascii="Calibri" w:cs="Calibri" w:eastAsia="Calibri" w:hAnsi="Calibri"/>
-          <w:sz w:val="22"/>
-          <w:szCs w:val="22"/>
-        </w:rPr>
-        <w:t xml:space="preserve"> navigation) can also land on the site's error page (“Invalid Page”) if </w:t>
-      </w:r>
-      <w:r>
-        <w:rPr>
-          <w:rFonts w:ascii="Consolas" w:cs="Consolas" w:eastAsia="Consolas" w:hAnsi="Consolas"/>
-          <w:sz w:val="20"/>
-          <w:szCs w:val="20"/>
-          <w:shd w:fill="F0F0F0" w:val="clear"/>
-        </w:rPr>
-        <w:t xml:space="preserve">Invoice__c</w:t>
-      </w:r>
-      <w:r>
-        <w:rPr>
-          <w:rFonts w:ascii="Calibri" w:cs="Calibri" w:eastAsia="Calibri" w:hAnsi="Calibri"/>
-          <w:sz w:val="22"/>
-          <w:szCs w:val="22"/>
-        </w:rPr>
-        <w:t xml:space="preserve"> doesn't have an activated Object Page in this Experience Builder site. LWR (“Build Your Own”) sites need that page created explicitly: Setup → Digital Experiences → Builder → Pages → New Page → Object Page → select </w:t>
-      </w:r>
-      <w:r>
-        <w:rPr>
-          <w:rFonts w:ascii="Consolas" w:cs="Consolas" w:eastAsia="Consolas" w:hAnsi="Consolas"/>
-          <w:sz w:val="20"/>
-          <w:szCs w:val="20"/>
-          <w:shd w:fill="F0F0F0" w:val="clear"/>
-        </w:rPr>
-        <w:t xml:space="preserve">Invoice__c</w:t>
-      </w:r>
-      <w:r>
-        <w:rPr>
-          <w:rFonts w:ascii="Calibri" w:cs="Calibri" w:eastAsia="Calibri" w:hAnsi="Calibri"/>
-          <w:sz w:val="22"/>
-          <w:szCs w:val="22"/>
-        </w:rPr>
-        <w:t xml:space="preserve"> → Publish. Unrelated to the file-download fix above; check independently if the “View” (not “Download PDF”) button is the one landing on Invalid Page.</w:t>
-      </w:r>
-    </w:p>
-    <w:p>
-      <w:pPr>
-        <w:pStyle w:val="Heading2"/>
-        <w:spacing w:after="150" w:before="300"/>
-      </w:pPr>
-      <w:r>
-        <w:t xml:space="preserve">3.5 Support / Query (supportRequestForm)</w:t>
-      </w:r>
-    </w:p>
-    <w:p>
-      <w:pPr>
-        <w:spacing w:after="160"/>
-      </w:pPr>
-      <w:r>
-        <w:rPr>
-          <w:rFonts w:ascii="Calibri" w:cs="Calibri" w:eastAsia="Calibri" w:hAnsi="Calibri"/>
-          <w:sz w:val="22"/>
-          <w:szCs w:val="22"/>
-        </w:rPr>
-        <w:t xml:space="preserve">No longer submits through a bare </w:t>
-      </w:r>
-      <w:r>
-        <w:rPr>
-          <w:rFonts w:ascii="Consolas" w:cs="Consolas" w:eastAsia="Consolas" w:hAnsi="Consolas"/>
-          <w:sz w:val="20"/>
-          <w:szCs w:val="20"/>
-          <w:shd w:fill="F0F0F0" w:val="clear"/>
-        </w:rPr>
-        <w:t xml:space="preserve">lightning-record-edit-form</w:t>
-      </w:r>
-      <w:r>
-        <w:rPr>
-          <w:rFonts w:ascii="Calibri" w:cs="Calibri" w:eastAsia="Calibri" w:hAnsi="Calibri"/>
-          <w:sz w:val="22"/>
-          <w:szCs w:val="22"/>
-        </w:rPr>
-        <w:t xml:space="preserve"> — now a custom Apex-backed form (matching requestStaffForm's pattern) via </w:t>
-      </w:r>
-      <w:r>
-        <w:rPr>
-          <w:rFonts w:ascii="Consolas" w:cs="Consolas" w:eastAsia="Consolas" w:hAnsi="Consolas"/>
-          <w:sz w:val="20"/>
-          <w:szCs w:val="20"/>
-          <w:shd w:fill="F0F0F0" w:val="clear"/>
-        </w:rPr>
-        <w:t xml:space="preserve">SupportRequestController.createCase()</w:t>
-      </w:r>
-      <w:r>
-        <w:rPr>
-          <w:rFonts w:ascii="Calibri" w:cs="Calibri" w:eastAsia="Calibri" w:hAnsi="Calibri"/>
-          <w:sz w:val="22"/>
-          <w:szCs w:val="22"/>
-        </w:rPr>
-        <w:t xml:space="preserve"> / </w:t>
-      </w:r>
-      <w:r>
-        <w:rPr>
-          <w:rFonts w:ascii="Consolas" w:cs="Consolas" w:eastAsia="Consolas" w:hAnsi="Consolas"/>
-          <w:sz w:val="20"/>
-          <w:szCs w:val="20"/>
-          <w:shd w:fill="F0F0F0" w:val="clear"/>
-        </w:rPr>
-        <w:t xml:space="preserve">SupportRequestService.submitNewCase()</w:t>
-      </w:r>
-      <w:r>
-        <w:rPr>
-          <w:rFonts w:ascii="Calibri" w:cs="Calibri" w:eastAsia="Calibri" w:hAnsi="Calibri"/>
-          <w:sz w:val="22"/>
-          <w:szCs w:val="22"/>
-        </w:rPr>
-        <w:t xml:space="preserve">, giving a reliable post-submit confirmation (inline confirmation panel, not just a toast) with View My Requests and Submit Another Request buttons, plus a confirmation email (</w:t>
-      </w:r>
-      <w:r>
-        <w:rPr>
-          <w:rFonts w:ascii="Consolas" w:cs="Consolas" w:eastAsia="Consolas" w:hAnsi="Consolas"/>
-          <w:sz w:val="20"/>
-          <w:szCs w:val="20"/>
-          <w:shd w:fill="F0F0F0" w:val="clear"/>
-        </w:rPr>
-        <w:t xml:space="preserve">SupportRequestService</w:t>
-      </w:r>
-      <w:r>
-        <w:rPr>
-          <w:rFonts w:ascii="Calibri" w:cs="Calibri" w:eastAsia="Calibri" w:hAnsi="Calibri"/>
-          <w:sz w:val="22"/>
-          <w:szCs w:val="22"/>
-        </w:rPr>
-        <w:t xml:space="preserve"> emails the submitting Contact; email failures are caught and logged rather than blocking Case creation).</w:t>
-      </w:r>
-    </w:p>
-    <w:p>
-      <w:pPr>
-        <w:spacing w:after="160"/>
-      </w:pPr>
-      <w:r>
-        <w:rPr>
-          <w:rFonts w:ascii="Calibri" w:cs="Calibri" w:eastAsia="Calibri" w:hAnsi="Calibri"/>
-          <w:sz w:val="22"/>
-          <w:szCs w:val="22"/>
-        </w:rPr>
-        <w:t xml:space="preserve">No longer offers a Request Type picker or a Related Request picker — now just Subject/Description, always submitting </w:t>
-      </w:r>
-      <w:r>
-        <w:rPr>
-          <w:rFonts w:ascii="Consolas" w:cs="Consolas" w:eastAsia="Consolas" w:hAnsi="Consolas"/>
-          <w:sz w:val="20"/>
-          <w:szCs w:val="20"/>
-          <w:shd w:fill="F0F0F0" w:val="clear"/>
-        </w:rPr>
-        <w:t xml:space="preserve">Portal_Request_Type__c = 'General Query'</w:t>
-      </w:r>
-      <w:r>
-        <w:rPr>
-          <w:rFonts w:ascii="Calibri" w:cs="Calibri" w:eastAsia="Calibri" w:hAnsi="Calibri"/>
-          <w:sz w:val="22"/>
-          <w:szCs w:val="22"/>
-        </w:rPr>
-        <w:t xml:space="preserve">. Both removals reflect the same shift: cancellation requests moved to the My Requests row action, which is also where the Related Request context now naturally lives (the row clicked </w:t>
-      </w:r>
-      <w:r>
-        <w:rPr>
-          <w:rFonts w:ascii="Calibri" w:cs="Calibri" w:eastAsia="Calibri" w:hAnsi="Calibri"/>
-          <w:sz w:val="22"/>
-          <w:szCs w:val="22"/>
-        </w:rPr>
-        <w:t xml:space="preserve">is</w:t>
-      </w:r>
-      <w:r>
-        <w:rPr>
-          <w:rFonts w:ascii="Calibri" w:cs="Calibri" w:eastAsia="Calibri" w:hAnsi="Calibri"/>
-          <w:sz w:val="22"/>
-          <w:szCs w:val="22"/>
-        </w:rPr>
-        <w:t xml:space="preserve"> the related request). The </w:t>
-      </w:r>
-      <w:r>
-        <w:rPr>
-          <w:rFonts w:ascii="Consolas" w:cs="Consolas" w:eastAsia="Consolas" w:hAnsi="Consolas"/>
-          <w:sz w:val="20"/>
-          <w:szCs w:val="20"/>
-          <w:shd w:fill="F0F0F0" w:val="clear"/>
-        </w:rPr>
-        <w:t xml:space="preserve">Cancellation Request</w:t>
-      </w:r>
-      <w:r>
-        <w:rPr>
-          <w:rFonts w:ascii="Calibri" w:cs="Calibri" w:eastAsia="Calibri" w:hAnsi="Calibri"/>
-          <w:sz w:val="22"/>
-          <w:szCs w:val="22"/>
-        </w:rPr>
-        <w:t xml:space="preserve"> picklist value and </w:t>
-      </w:r>
-      <w:r>
-        <w:rPr>
-          <w:rFonts w:ascii="Consolas" w:cs="Consolas" w:eastAsia="Consolas" w:hAnsi="Consolas"/>
-          <w:sz w:val="20"/>
-          <w:szCs w:val="20"/>
-          <w:shd w:fill="F0F0F0" w:val="clear"/>
-        </w:rPr>
-        <w:t xml:space="preserve">Case.Related_Staffing_Request__c</w:t>
-      </w:r>
-      <w:r>
-        <w:rPr>
-          <w:rFonts w:ascii="Calibri" w:cs="Calibri" w:eastAsia="Calibri" w:hAnsi="Calibri"/>
-          <w:sz w:val="22"/>
-          <w:szCs w:val="22"/>
-        </w:rPr>
-        <w:t xml:space="preserve"> field both still exist and are still used — just by the row action, not by anything picked on this form.</w:t>
-      </w:r>
-    </w:p>
-    <w:p>
-      <w:pPr>
-        <w:spacing w:after="160"/>
-      </w:pPr>
-      <w:r>
-        <w:rPr>
-          <w:rFonts w:ascii="Calibri" w:cs="Calibri" w:eastAsia="Calibri" w:hAnsi="Calibri"/>
-          <w:b/>
-          <w:bCs/>
-          <w:sz w:val="22"/>
-          <w:szCs w:val="22"/>
-        </w:rPr>
-        <w:t xml:space="preserve">Subject is enforced as required: </w:t>
-      </w:r>
-      <w:r>
-        <w:rPr>
-          <w:rFonts w:ascii="Calibri" w:cs="Calibri" w:eastAsia="Calibri" w:hAnsi="Calibri"/>
-          <w:sz w:val="22"/>
-          <w:szCs w:val="22"/>
-        </w:rPr>
-        <w:t xml:space="preserve">the </w:t>
-      </w:r>
-      <w:r>
-        <w:rPr>
-          <w:rFonts w:ascii="Consolas" w:cs="Consolas" w:eastAsia="Consolas" w:hAnsi="Consolas"/>
-          <w:sz w:val="20"/>
-          <w:szCs w:val="20"/>
-          <w:shd w:fill="F0F0F0" w:val="clear"/>
-        </w:rPr>
-        <w:t xml:space="preserve">required</w:t>
-      </w:r>
-      <w:r>
-        <w:rPr>
-          <w:rFonts w:ascii="Calibri" w:cs="Calibri" w:eastAsia="Calibri" w:hAnsi="Calibri"/>
-          <w:sz w:val="22"/>
-          <w:szCs w:val="22"/>
-        </w:rPr>
-        <w:t xml:space="preserve"> attribute alone only drove browser-native validation when something calls </w:t>
-      </w:r>
-      <w:r>
-        <w:rPr>
-          <w:rFonts w:ascii="Consolas" w:cs="Consolas" w:eastAsia="Consolas" w:hAnsi="Consolas"/>
-          <w:sz w:val="20"/>
-          <w:szCs w:val="20"/>
-          <w:shd w:fill="F0F0F0" w:val="clear"/>
-        </w:rPr>
-        <w:t xml:space="preserve">reportValidity()</w:t>
-      </w:r>
-      <w:r>
-        <w:rPr>
-          <w:rFonts w:ascii="Calibri" w:cs="Calibri" w:eastAsia="Calibri" w:hAnsi="Calibri"/>
-          <w:sz w:val="22"/>
-          <w:szCs w:val="22"/>
-        </w:rPr>
-        <w:t xml:space="preserve"> — nothing did, so it was decorative. </w:t>
-      </w:r>
-      <w:r>
-        <w:rPr>
-          <w:rFonts w:ascii="Consolas" w:cs="Consolas" w:eastAsia="Consolas" w:hAnsi="Consolas"/>
-          <w:sz w:val="20"/>
-          <w:szCs w:val="20"/>
-          <w:shd w:fill="F0F0F0" w:val="clear"/>
-        </w:rPr>
-        <w:t xml:space="preserve">handleSubmit</w:t>
-      </w:r>
-      <w:r>
-        <w:rPr>
-          <w:rFonts w:ascii="Calibri" w:cs="Calibri" w:eastAsia="Calibri" w:hAnsi="Calibri"/>
-          <w:sz w:val="22"/>
-          <w:szCs w:val="22"/>
-        </w:rPr>
-        <w:t xml:space="preserve"> now calls </w:t>
-      </w:r>
-      <w:r>
-        <w:rPr>
-          <w:rFonts w:ascii="Consolas" w:cs="Consolas" w:eastAsia="Consolas" w:hAnsi="Consolas"/>
-          <w:sz w:val="20"/>
-          <w:szCs w:val="20"/>
-          <w:shd w:fill="F0F0F0" w:val="clear"/>
-        </w:rPr>
-        <w:t xml:space="preserve">reportValidity()</w:t>
-      </w:r>
-      <w:r>
-        <w:rPr>
-          <w:rFonts w:ascii="Calibri" w:cs="Calibri" w:eastAsia="Calibri" w:hAnsi="Calibri"/>
-          <w:sz w:val="22"/>
-          <w:szCs w:val="22"/>
-        </w:rPr>
-        <w:t xml:space="preserve"> and also gates on the trimmed </w:t>
-      </w:r>
-      <w:r>
-        <w:rPr>
-          <w:rFonts w:ascii="Consolas" w:cs="Consolas" w:eastAsia="Consolas" w:hAnsi="Consolas"/>
-          <w:sz w:val="20"/>
-          <w:szCs w:val="20"/>
-          <w:shd w:fill="F0F0F0" w:val="clear"/>
-        </w:rPr>
-        <w:t xml:space="preserve">formData.subject</w:t>
-      </w:r>
-      <w:r>
-        <w:rPr>
-          <w:rFonts w:ascii="Calibri" w:cs="Calibri" w:eastAsia="Calibri" w:hAnsi="Calibri"/>
-          <w:sz w:val="22"/>
-          <w:szCs w:val="22"/>
-        </w:rPr>
-        <w:t xml:space="preserve"> value directly (Jest's stub can't exercise real DOM validity), showing an inline error banner (“Subject is required.”) if blank or whitespace-only.</w:t>
-      </w:r>
-    </w:p>
-    <w:p>
-      <w:pPr>
-        <w:pStyle w:val="Heading2"/>
-        <w:spacing w:after="150" w:before="300"/>
-      </w:pPr>
-      <w:r>
-        <w:t xml:space="preserve">3.6 Request Staff (requestStaffForm)</w:t>
-      </w:r>
-    </w:p>
-    <w:p>
-      <w:pPr>
-        <w:spacing w:after="160"/>
-      </w:pPr>
-      <w:r>
-        <w:rPr>
-          <w:rFonts w:ascii="Calibri" w:cs="Calibri" w:eastAsia="Calibri" w:hAnsi="Calibri"/>
-          <w:sz w:val="22"/>
-          <w:szCs w:val="22"/>
-        </w:rPr>
-        <w:t xml:space="preserve">Had the same required-field validation gap, across more fields: Role, Shift Date, Start Time, End Time, Quantity, and Priority were all marked required (Facility is required too, as a Master-Detail relationship, though facilityPicker didn't mark it required itself), but nothing called reportValidity() — a blank submission went all the way to Apex, surfacing a raw DML error (e.g. “Required fields are missing: [Role__c]”) instead of a clean client-side message.</w:t>
-      </w:r>
-    </w:p>
-    <w:p>
-      <w:pPr>
-        <w:spacing w:after="160"/>
-      </w:pPr>
-      <w:r>
-        <w:rPr>
-          <w:rFonts w:ascii="Calibri" w:cs="Calibri" w:eastAsia="Calibri" w:hAnsi="Calibri"/>
-          <w:sz w:val="22"/>
-          <w:szCs w:val="22"/>
-        </w:rPr>
-        <w:t xml:space="preserve">handleSubmit now checks Facility/Role/Shift Date/Start Time/End Time/Quantity/Priority up front and shows a single banner listing only whichever are missing (e.g. “Please fill in: Facility, Role, Shift Date.”) before calling Apex. Quantity and Priority always carry a default value in practice, but are included in case those defaults ever change. Ward, Specialty, and Notes remain genuinely optional.</w:t>
-      </w:r>
-    </w:p>
-    <w:p>
-      <w:pPr>
-        <w:spacing w:after="160"/>
-      </w:pPr>
-      <w:r>
-        <w:rPr>
-          <w:rFonts w:ascii="Calibri" w:cs="Calibri" w:eastAsia="Calibri" w:hAnsi="Calibri"/>
-          <w:sz w:val="22"/>
-          <w:szCs w:val="22"/>
-        </w:rPr>
-        <w:t xml:space="preserve">Submit buttons on this form and Support's now show a “Submitting…” label plus a small spinner while the Apex call is in flight, instead of only an easy-to-miss disabled state.</w:t>
-      </w:r>
-    </w:p>
-    <w:p>
-      <w:pPr>
-        <w:pStyle w:val="Heading2"/>
-        <w:spacing w:after="150" w:before="300"/>
-      </w:pPr>
-      <w:r>
-        <w:t xml:space="preserve">3.7 Error/Success Feedback</w:t>
-      </w:r>
-    </w:p>
-    <w:p>
-      <w:pPr>
-        <w:spacing w:after="160"/>
-      </w:pPr>
-      <w:r>
-        <w:rPr>
-          <w:rFonts w:ascii="Calibri" w:cs="Calibri" w:eastAsia="Calibri" w:hAnsi="Calibri"/>
-          <w:sz w:val="22"/>
-          <w:szCs w:val="22"/>
-        </w:rPr>
-        <w:t xml:space="preserve">Both forms originally surfaced validation and Apex errors only via lightning/platformShowToastEvent. This is a problem specifically because Experience Cloud LWR sites (this portal's site type) don't render platform toasts at all — a blocked submission looked like it silently did nothing. Both forms now also show a guaranteed inline banner (error-red or success-green, cleared at the start of the next submit attempt) alongside the existing toast dispatches — toasts are left in place in case the component is reused where toasts do render, but the banner is what a user on this site actually sees.</w:t>
-      </w:r>
-    </w:p>
-    <w:p>
-      <w:pPr>
-        <w:pStyle w:val="Heading1"/>
-        <w:spacing w:after="200" w:before="400"/>
-      </w:pPr>
-      <w:r>
-        <w:t xml:space="preserve">4. Reporting Screen</w:t>
-      </w:r>
-    </w:p>
-    <w:p>
-      <w:pPr>
-        <w:spacing w:after="160"/>
-      </w:pPr>
-      <w:r>
-        <w:rPr>
-          <w:rFonts w:ascii="Calibri" w:cs="Calibri" w:eastAsia="Calibri" w:hAnsi="Calibri"/>
-          <w:sz w:val="22"/>
-          <w:szCs w:val="22"/>
-        </w:rPr>
-        <w:t xml:space="preserve">staffingRequestReporting (nav label “Reporting”) reuses the same </w:t>
-      </w:r>
-      <w:r>
-        <w:rPr>
-          <w:rFonts w:ascii="Consolas" w:cs="Consolas" w:eastAsia="Consolas" w:hAnsi="Consolas"/>
-          <w:sz w:val="20"/>
-          <w:szCs w:val="20"/>
-          <w:shd w:fill="F0F0F0" w:val="clear"/>
-        </w:rPr>
-        <w:t xml:space="preserve">StaffingRequestController.getMyRequests()</w:t>
-      </w:r>
-      <w:r>
-        <w:rPr>
-          <w:rFonts w:ascii="Calibri" w:cs="Calibri" w:eastAsia="Calibri" w:hAnsi="Calibri"/>
-          <w:sz w:val="22"/>
-          <w:szCs w:val="22"/>
-        </w:rPr>
-        <w:t xml:space="preserve"> data as My Requests — no new Apex — filtered client-side by </w:t>
-      </w:r>
-      <w:r>
-        <w:rPr>
-          <w:rFonts w:ascii="Consolas" w:cs="Consolas" w:eastAsia="Consolas" w:hAnsi="Consolas"/>
-          <w:sz w:val="20"/>
-          <w:szCs w:val="20"/>
-          <w:shd w:fill="F0F0F0" w:val="clear"/>
-        </w:rPr>
-        <w:t xml:space="preserve">Shift_Date__c</w:t>
-      </w:r>
-      <w:r>
-        <w:rPr>
-          <w:rFonts w:ascii="Calibri" w:cs="Calibri" w:eastAsia="Calibri" w:hAnsi="Calibri"/>
-          <w:sz w:val="22"/>
-          <w:szCs w:val="22"/>
-        </w:rPr>
-        <w:t xml:space="preserve"> against one of five ranges:</w:t>
+          <w:rFonts w:ascii="Consolas" w:cs="Consolas" w:eastAsia="Consolas" w:hAnsi="Consolas"/>
+          <w:sz w:val="20"/>
+          <w:szCs w:val="20"/>
+          <w:shd w:fill="F0F0F0" w:val="clear"/>
+        </w:rPr>
+        <w:t xml:space="preserve">InvoiceController.getInvoiceFileData(invoiceId)</w:t>
+      </w:r>
+      <w:r>
+        <w:rPr>
+          <w:rFonts w:ascii="Calibri" w:cs="Calibri" w:eastAsia="Calibri" w:hAnsi="Calibri"/>
+          <w:sz w:val="22"/>
+          <w:szCs w:val="22"/>
+        </w:rPr>
+        <w:t xml:space="preserve"> is called imperatively (only fetched on click, not preloaded per row) and returns the file's bytes base64-encoded (</w:t>
+      </w:r>
+      <w:r>
+        <w:rPr>
+          <w:rFonts w:ascii="Consolas" w:cs="Consolas" w:eastAsia="Consolas" w:hAnsi="Consolas"/>
+          <w:sz w:val="20"/>
+          <w:szCs w:val="20"/>
+          <w:shd w:fill="F0F0F0" w:val="clear"/>
+        </w:rPr>
+        <w:t xml:space="preserve">EncodingUtil.base64Encode</w:t>
+      </w:r>
+      <w:r>
+        <w:rPr>
+          <w:rFonts w:ascii="Calibri" w:cs="Calibri" w:eastAsia="Calibri" w:hAnsi="Calibri"/>
+          <w:sz w:val="22"/>
+          <w:szCs w:val="22"/>
+        </w:rPr>
+        <w:t xml:space="preserve"> on the </w:t>
+      </w:r>
+      <w:r>
+        <w:rPr>
+          <w:rFonts w:ascii="Consolas" w:cs="Consolas" w:eastAsia="Consolas" w:hAnsi="Consolas"/>
+          <w:sz w:val="20"/>
+          <w:szCs w:val="20"/>
+          <w:shd w:fill="F0F0F0" w:val="clear"/>
+        </w:rPr>
+        <w:t xml:space="preserve">ContentVersion.VersionData</w:t>
+      </w:r>
+      <w:r>
+        <w:rPr>
+          <w:rFonts w:ascii="Calibri" w:cs="Calibri" w:eastAsia="Calibri" w:hAnsi="Calibri"/>
+          <w:sz w:val="22"/>
+          <w:szCs w:val="22"/>
+        </w:rPr>
+        <w:t xml:space="preserve"> Blob) plus its filename.</w:t>
       </w:r>
     </w:p>
     <w:p>
@@ -3153,7 +2755,75 @@
           <w:sz w:val="22"/>
           <w:szCs w:val="22"/>
         </w:rPr>
-        <w:t xml:space="preserve">All — no date filtering; every request the user can see. Gives an explicit, unambiguous way to clear the date filter.</w:t>
+        <w:t xml:space="preserve">The LWC builds a </w:t>
+      </w:r>
+      <w:r>
+        <w:rPr>
+          <w:rFonts w:ascii="Consolas" w:cs="Consolas" w:eastAsia="Consolas" w:hAnsi="Consolas"/>
+          <w:sz w:val="20"/>
+          <w:szCs w:val="20"/>
+          <w:shd w:fill="F0F0F0" w:val="clear"/>
+        </w:rPr>
+        <w:t xml:space="preserve">data:application/pdf;base64,...</w:t>
+      </w:r>
+      <w:r>
+        <w:rPr>
+          <w:rFonts w:ascii="Calibri" w:cs="Calibri" w:eastAsia="Calibri" w:hAnsi="Calibri"/>
+          <w:sz w:val="22"/>
+          <w:szCs w:val="22"/>
+        </w:rPr>
+        <w:t xml:space="preserve"> URI (</w:t>
+      </w:r>
+      <w:r>
+        <w:rPr>
+          <w:rFonts w:ascii="Consolas" w:cs="Consolas" w:eastAsia="Consolas" w:hAnsi="Consolas"/>
+          <w:sz w:val="20"/>
+          <w:szCs w:val="20"/>
+          <w:shd w:fill="F0F0F0" w:val="clear"/>
+        </w:rPr>
+        <w:t xml:space="preserve">application/octet-stream</w:t>
+      </w:r>
+      <w:r>
+        <w:rPr>
+          <w:rFonts w:ascii="Calibri" w:cs="Calibri" w:eastAsia="Calibri" w:hAnsi="Calibri"/>
+          <w:sz w:val="22"/>
+          <w:szCs w:val="22"/>
+        </w:rPr>
+        <w:t xml:space="preserve"> if the filename doesn't end in </w:t>
+      </w:r>
+      <w:r>
+        <w:rPr>
+          <w:rFonts w:ascii="Consolas" w:cs="Consolas" w:eastAsia="Consolas" w:hAnsi="Consolas"/>
+          <w:sz w:val="20"/>
+          <w:szCs w:val="20"/>
+          <w:shd w:fill="F0F0F0" w:val="clear"/>
+        </w:rPr>
+        <w:t xml:space="preserve">.pdf</w:t>
+      </w:r>
+      <w:r>
+        <w:rPr>
+          <w:rFonts w:ascii="Calibri" w:cs="Calibri" w:eastAsia="Calibri" w:hAnsi="Calibri"/>
+          <w:sz w:val="22"/>
+          <w:szCs w:val="22"/>
+        </w:rPr>
+        <w:t xml:space="preserve">) and triggers the download via </w:t>
+      </w:r>
+      <w:r>
+        <w:rPr>
+          <w:rFonts w:ascii="Consolas" w:cs="Consolas" w:eastAsia="Consolas" w:hAnsi="Consolas"/>
+          <w:sz w:val="20"/>
+          <w:szCs w:val="20"/>
+          <w:shd w:fill="F0F0F0" w:val="clear"/>
+        </w:rPr>
+        <w:t xml:space="preserve">c/fileDownloadUtils</w:t>
+      </w:r>
+      <w:r>
+        <w:rPr>
+          <w:rFonts w:ascii="Calibri" w:cs="Calibri" w:eastAsia="Calibri" w:hAnsi="Calibri"/>
+          <w:sz w:val="22"/>
+          <w:szCs w:val="22"/>
+        </w:rPr>
+        <w:t xml:space="preserve"> — the same shared helper Reporting's CSV export uses (see "iOS Safari download fix" below), with file bytes instead of CSV text.</w:t>
       </w:r>
     </w:p>
     <w:p>
@@ -3171,7 +2841,29 @@
           <w:sz w:val="22"/>
           <w:szCs w:val="22"/>
         </w:rPr>
-        <w:t xml:space="preserve">Last 7 Days — a rolling window (today minus 6 days through today).</w:t>
+        <w:t xml:space="preserve">A failed fetch (no file, wrong Account, etc.) shows a guaranteed inline error banner rather than a toast.</w:t>
+      </w:r>
+    </w:p>
+    <w:p>
+      <w:pPr>
+        <w:pStyle w:val="Heading3"/>
+        <w:spacing w:after="100" w:before="200"/>
+      </w:pPr>
+      <w:r>
+        <w:t xml:space="preserve">3.4.2 Root-cause investigation: portal users could not see invoice files</w:t>
+      </w:r>
+    </w:p>
+    <w:p>
+      <w:pPr>
+        <w:spacing w:after="160"/>
+      </w:pPr>
+      <w:r>
+        <w:rPr>
+          <w:rFonts w:ascii="Calibri" w:cs="Calibri" w:eastAsia="Calibri" w:hAnsi="Calibri"/>
+          <w:sz w:val="22"/>
+          <w:szCs w:val="22"/>
+        </w:rPr>
+        <w:t xml:space="preserve">Getting this working against a real connected org took several rounds, all silent failures (query succeeds, returns nothing, no exception). Three things were tried and kept in place, though none turned out to be the actual root cause:</w:t>
       </w:r>
     </w:p>
     <w:p>
@@ -3186,10 +2878,88 @@
       <w:r>
         <w:rPr>
           <w:rFonts w:ascii="Calibri" w:cs="Calibri" w:eastAsia="Calibri" w:hAnsi="Calibri"/>
-          <w:sz w:val="22"/>
-          <w:szCs w:val="22"/>
-        </w:rPr>
-        <w:t xml:space="preserve">Last Week — the most recently completed calendar week (Monday through Sunday), deliberately different from Last 7 Days.</w:t>
+          <w:b/>
+          <w:bCs/>
+          <w:sz w:val="22"/>
+          <w:szCs w:val="22"/>
+        </w:rPr>
+        <w:t xml:space="preserve">1. Row-level sharing — </w:t>
+      </w:r>
+      <w:r>
+        <w:rPr>
+          <w:rFonts w:ascii="Calibri" w:cs="Calibri" w:eastAsia="Calibri" w:hAnsi="Calibri"/>
+          <w:sz w:val="22"/>
+          <w:szCs w:val="22"/>
+        </w:rPr>
+        <w:t xml:space="preserve">ContentDocumentLink's own visibility for a portal/Community user doesn't reliably follow the linked record's sharing. A new </w:t>
+      </w:r>
+      <w:r>
+        <w:rPr>
+          <w:rFonts w:ascii="Consolas" w:cs="Consolas" w:eastAsia="Consolas" w:hAnsi="Consolas"/>
+          <w:sz w:val="20"/>
+          <w:szCs w:val="20"/>
+          <w:shd w:fill="F0F0F0" w:val="clear"/>
+        </w:rPr>
+        <w:t xml:space="preserve">WithoutSharingFileAccess</w:t>
+      </w:r>
+      <w:r>
+        <w:rPr>
+          <w:rFonts w:ascii="Calibri" w:cs="Calibri" w:eastAsia="Calibri" w:hAnsi="Calibri"/>
+          <w:sz w:val="22"/>
+          <w:szCs w:val="22"/>
+        </w:rPr>
+        <w:t xml:space="preserve"> class runs the </w:t>
+      </w:r>
+      <w:r>
+        <w:rPr>
+          <w:rFonts w:ascii="Consolas" w:cs="Consolas" w:eastAsia="Consolas" w:hAnsi="Consolas"/>
+          <w:sz w:val="20"/>
+          <w:szCs w:val="20"/>
+          <w:shd w:fill="F0F0F0" w:val="clear"/>
+        </w:rPr>
+        <w:t xml:space="preserve">ContentDocumentLink</w:t>
+      </w:r>
+      <w:r>
+        <w:rPr>
+          <w:rFonts w:ascii="Calibri" w:cs="Calibri" w:eastAsia="Calibri" w:hAnsi="Calibri"/>
+          <w:sz w:val="22"/>
+          <w:szCs w:val="22"/>
+        </w:rPr>
+        <w:t xml:space="preserve">/</w:t>
+      </w:r>
+      <w:r>
+        <w:rPr>
+          <w:rFonts w:ascii="Consolas" w:cs="Consolas" w:eastAsia="Consolas" w:hAnsi="Consolas"/>
+          <w:sz w:val="20"/>
+          <w:szCs w:val="20"/>
+          <w:shd w:fill="F0F0F0" w:val="clear"/>
+        </w:rPr>
+        <w:t xml:space="preserve">ContentVersion</w:t>
+      </w:r>
+      <w:r>
+        <w:rPr>
+          <w:rFonts w:ascii="Calibri" w:cs="Calibri" w:eastAsia="Calibri" w:hAnsi="Calibri"/>
+          <w:sz w:val="22"/>
+          <w:szCs w:val="22"/>
+        </w:rPr>
+        <w:t xml:space="preserve"> lookups without sharing, called only after </w:t>
+      </w:r>
+      <w:r>
+        <w:rPr>
+          <w:rFonts w:ascii="Consolas" w:cs="Consolas" w:eastAsia="Consolas" w:hAnsi="Consolas"/>
+          <w:sz w:val="20"/>
+          <w:szCs w:val="20"/>
+          <w:shd w:fill="F0F0F0" w:val="clear"/>
+        </w:rPr>
+        <w:t xml:space="preserve">InvoiceController</w:t>
+      </w:r>
+      <w:r>
+        <w:rPr>
+          <w:rFonts w:ascii="Calibri" w:cs="Calibri" w:eastAsia="Calibri" w:hAnsi="Calibri"/>
+          <w:sz w:val="22"/>
+          <w:szCs w:val="22"/>
+        </w:rPr>
+        <w:t xml:space="preserve"> has already confirmed (via its own with-sharing query) that the invoice belongs to the running user's Account.</w:t>
       </w:r>
     </w:p>
     <w:p>
@@ -3204,10 +2974,54 @@
       <w:r>
         <w:rPr>
           <w:rFonts w:ascii="Calibri" w:cs="Calibri" w:eastAsia="Calibri" w:hAnsi="Calibri"/>
-          <w:sz w:val="22"/>
-          <w:szCs w:val="22"/>
-        </w:rPr>
-        <w:t xml:space="preserve">Last Month — the most recently completed calendar month.</w:t>
+          <w:b/>
+          <w:bCs/>
+          <w:sz w:val="22"/>
+          <w:szCs w:val="22"/>
+        </w:rPr>
+        <w:t xml:space="preserve">2. Object-level CRUD — </w:t>
+      </w:r>
+      <w:r>
+        <w:rPr>
+          <w:rFonts w:ascii="Calibri" w:cs="Calibri" w:eastAsia="Calibri" w:hAnsi="Calibri"/>
+          <w:sz w:val="22"/>
+          <w:szCs w:val="22"/>
+        </w:rPr>
+        <w:t xml:space="preserve">without sharing only bypasses sharing rules, not object-level access, so </w:t>
+      </w:r>
+      <w:r>
+        <w:rPr>
+          <w:rFonts w:ascii="Consolas" w:cs="Consolas" w:eastAsia="Consolas" w:hAnsi="Consolas"/>
+          <w:sz w:val="20"/>
+          <w:szCs w:val="20"/>
+          <w:shd w:fill="F0F0F0" w:val="clear"/>
+        </w:rPr>
+        <w:t xml:space="preserve">ContentVersion</w:t>
+      </w:r>
+      <w:r>
+        <w:rPr>
+          <w:rFonts w:ascii="Calibri" w:cs="Calibri" w:eastAsia="Calibri" w:hAnsi="Calibri"/>
+          <w:sz w:val="22"/>
+          <w:szCs w:val="22"/>
+        </w:rPr>
+        <w:t xml:space="preserve"> was granted Read in </w:t>
+      </w:r>
+      <w:r>
+        <w:rPr>
+          <w:rFonts w:ascii="Consolas" w:cs="Consolas" w:eastAsia="Consolas" w:hAnsi="Consolas"/>
+          <w:sz w:val="20"/>
+          <w:szCs w:val="20"/>
+          <w:shd w:fill="F0F0F0" w:val="clear"/>
+        </w:rPr>
+        <w:t xml:space="preserve">Alliance_Client_Portal_User</w:t>
+      </w:r>
+      <w:r>
+        <w:rPr>
+          <w:rFonts w:ascii="Calibri" w:cs="Calibri" w:eastAsia="Calibri" w:hAnsi="Calibri"/>
+          <w:sz w:val="22"/>
+          <w:szCs w:val="22"/>
+        </w:rPr>
+        <w:t xml:space="preserve"> (objectPermissions).</w:t>
       </w:r>
     </w:p>
     <w:p>
@@ -3222,6 +3036,1309 @@
       <w:r>
         <w:rPr>
           <w:rFonts w:ascii="Calibri" w:cs="Calibri" w:eastAsia="Calibri" w:hAnsi="Calibri"/>
+          <w:b/>
+          <w:bCs/>
+          <w:sz w:val="22"/>
+          <w:szCs w:val="22"/>
+        </w:rPr>
+        <w:t xml:space="preserve">3. A second object reached via relationship — </w:t>
+      </w:r>
+      <w:r>
+        <w:rPr>
+          <w:rFonts w:ascii="Calibri" w:cs="Calibri" w:eastAsia="Calibri" w:hAnsi="Calibri"/>
+          <w:sz w:val="22"/>
+          <w:szCs w:val="22"/>
+        </w:rPr>
+        <w:t xml:space="preserve">the query's </w:t>
+      </w:r>
+      <w:r>
+        <w:rPr>
+          <w:rFonts w:ascii="Consolas" w:cs="Consolas" w:eastAsia="Consolas" w:hAnsi="Consolas"/>
+          <w:sz w:val="20"/>
+          <w:szCs w:val="20"/>
+          <w:shd w:fill="F0F0F0" w:val="clear"/>
+        </w:rPr>
+        <w:t xml:space="preserve">ORDER BY ContentDocument.ContentModifiedDate DESC</w:t>
+      </w:r>
+      <w:r>
+        <w:rPr>
+          <w:rFonts w:ascii="Calibri" w:cs="Calibri" w:eastAsia="Calibri" w:hAnsi="Calibri"/>
+          <w:sz w:val="22"/>
+          <w:szCs w:val="22"/>
+        </w:rPr>
+        <w:t xml:space="preserve"> traversed into </w:t>
+      </w:r>
+      <w:r>
+        <w:rPr>
+          <w:rFonts w:ascii="Consolas" w:cs="Consolas" w:eastAsia="Consolas" w:hAnsi="Consolas"/>
+          <w:sz w:val="20"/>
+          <w:szCs w:val="20"/>
+          <w:shd w:fill="F0F0F0" w:val="clear"/>
+        </w:rPr>
+        <w:t xml:space="preserve">ContentDocument</w:t>
+      </w:r>
+      <w:r>
+        <w:rPr>
+          <w:rFonts w:ascii="Calibri" w:cs="Calibri" w:eastAsia="Calibri" w:hAnsi="Calibri"/>
+          <w:sz w:val="22"/>
+          <w:szCs w:val="22"/>
+        </w:rPr>
+        <w:t xml:space="preserve">, an object the permission set said nothing about. Now orders by </w:t>
+      </w:r>
+      <w:r>
+        <w:rPr>
+          <w:rFonts w:ascii="Consolas" w:cs="Consolas" w:eastAsia="Consolas" w:hAnsi="Consolas"/>
+          <w:sz w:val="20"/>
+          <w:szCs w:val="20"/>
+          <w:shd w:fill="F0F0F0" w:val="clear"/>
+        </w:rPr>
+        <w:t xml:space="preserve">ContentDocumentLink.SystemModstamp</w:t>
+      </w:r>
+      <w:r>
+        <w:rPr>
+          <w:rFonts w:ascii="Calibri" w:cs="Calibri" w:eastAsia="Calibri" w:hAnsi="Calibri"/>
+          <w:sz w:val="22"/>
+          <w:szCs w:val="22"/>
+        </w:rPr>
+        <w:t xml:space="preserve"> instead — a field on the object already being queried, avoiding the extra permission entirely.</w:t>
+      </w:r>
+    </w:p>
+    <w:p>
+      <w:pPr>
+        <w:spacing w:after="160"/>
+      </w:pPr>
+      <w:r>
+        <w:rPr>
+          <w:rFonts w:ascii="Calibri" w:cs="Calibri" w:eastAsia="Calibri" w:hAnsi="Calibri"/>
+          <w:b/>
+          <w:bCs/>
+          <w:sz w:val="22"/>
+          <w:szCs w:val="22"/>
+        </w:rPr>
+        <w:t xml:space="preserve">The actual root cause: </w:t>
+      </w:r>
+      <w:r>
+        <w:rPr>
+          <w:rFonts w:ascii="Calibri" w:cs="Calibri" w:eastAsia="Calibri" w:hAnsi="Calibri"/>
+          <w:sz w:val="22"/>
+          <w:szCs w:val="22"/>
+        </w:rPr>
+        <w:t xml:space="preserve">confirmed via </w:t>
+      </w:r>
+      <w:r>
+        <w:rPr>
+          <w:rFonts w:ascii="Consolas" w:cs="Consolas" w:eastAsia="Consolas" w:hAnsi="Consolas"/>
+          <w:sz w:val="20"/>
+          <w:szCs w:val="20"/>
+          <w:shd w:fill="F0F0F0" w:val="clear"/>
+        </w:rPr>
+        <w:t xml:space="preserve">System.debug</w:t>
+      </w:r>
+      <w:r>
+        <w:rPr>
+          <w:rFonts w:ascii="Calibri" w:cs="Calibri" w:eastAsia="Calibri" w:hAnsi="Calibri"/>
+          <w:sz w:val="22"/>
+          <w:szCs w:val="22"/>
+        </w:rPr>
+        <w:t xml:space="preserve"> in Execute Anonymous, directly on the </w:t>
+      </w:r>
+      <w:r>
+        <w:rPr>
+          <w:rFonts w:ascii="Consolas" w:cs="Consolas" w:eastAsia="Consolas" w:hAnsi="Consolas"/>
+          <w:sz w:val="20"/>
+          <w:szCs w:val="20"/>
+          <w:shd w:fill="F0F0F0" w:val="clear"/>
+        </w:rPr>
+        <w:t xml:space="preserve">ContentDocumentLink</w:t>
+      </w:r>
+      <w:r>
+        <w:rPr>
+          <w:rFonts w:ascii="Calibri" w:cs="Calibri" w:eastAsia="Calibri" w:hAnsi="Calibri"/>
+          <w:sz w:val="22"/>
+          <w:szCs w:val="22"/>
+        </w:rPr>
+        <w:t xml:space="preserve"> row: </w:t>
+      </w:r>
+      <w:r>
+        <w:rPr>
+          <w:rFonts w:ascii="Consolas" w:cs="Consolas" w:eastAsia="Consolas" w:hAnsi="Consolas"/>
+          <w:sz w:val="20"/>
+          <w:szCs w:val="20"/>
+          <w:shd w:fill="F0F0F0" w:val="clear"/>
+        </w:rPr>
+        <w:t xml:space="preserve">Visibility = 'InternalUsers'</w:t>
+      </w:r>
+      <w:r>
+        <w:rPr>
+          <w:rFonts w:ascii="Calibri" w:cs="Calibri" w:eastAsia="Calibri" w:hAnsi="Calibri"/>
+          <w:sz w:val="22"/>
+          <w:szCs w:val="22"/>
+        </w:rPr>
+        <w:t xml:space="preserve">. That field, set when the file was uploaded through the standard “Add Files” button, hard-blocks any external/Community/portal user from seeing that file, independent of sharing rules, CRUD, or permission sets. The fix for files already uploaded during investigation was a one-off Apex data update setting </w:t>
+      </w:r>
+      <w:r>
+        <w:rPr>
+          <w:rFonts w:ascii="Consolas" w:cs="Consolas" w:eastAsia="Consolas" w:hAnsi="Consolas"/>
+          <w:sz w:val="20"/>
+          <w:szCs w:val="20"/>
+          <w:shd w:fill="F0F0F0" w:val="clear"/>
+        </w:rPr>
+        <w:t xml:space="preserve">Visibility = 'AllUsers'</w:t>
+      </w:r>
+      <w:r>
+        <w:rPr>
+          <w:rFonts w:ascii="Calibri" w:cs="Calibri" w:eastAsia="Calibri" w:hAnsi="Calibri"/>
+          <w:sz w:val="22"/>
+          <w:szCs w:val="22"/>
+        </w:rPr>
+        <w:t xml:space="preserve">.</w:t>
+      </w:r>
+    </w:p>
+    <w:p>
+      <w:pPr>
+        <w:spacing w:after="160"/>
+      </w:pPr>
+      <w:r>
+        <w:rPr>
+          <w:rFonts w:ascii="Calibri" w:cs="Calibri" w:eastAsia="Calibri" w:hAnsi="Calibri"/>
+          <w:b/>
+          <w:bCs/>
+          <w:sz w:val="22"/>
+          <w:szCs w:val="22"/>
+        </w:rPr>
+        <w:t xml:space="preserve">Going forward this is automatic: </w:t>
+      </w:r>
+      <w:r>
+        <w:rPr>
+          <w:rFonts w:ascii="Consolas" w:cs="Consolas" w:eastAsia="Consolas" w:hAnsi="Consolas"/>
+          <w:sz w:val="20"/>
+          <w:szCs w:val="20"/>
+          <w:shd w:fill="F0F0F0" w:val="clear"/>
+        </w:rPr>
+        <w:t xml:space="preserve">ContentDocumentLinkTrigger</w:t>
+      </w:r>
+      <w:r>
+        <w:rPr>
+          <w:rFonts w:ascii="Calibri" w:cs="Calibri" w:eastAsia="Calibri" w:hAnsi="Calibri"/>
+          <w:sz w:val="22"/>
+          <w:szCs w:val="22"/>
+        </w:rPr>
+        <w:t xml:space="preserve"> (after insert on </w:t>
+      </w:r>
+      <w:r>
+        <w:rPr>
+          <w:rFonts w:ascii="Consolas" w:cs="Consolas" w:eastAsia="Consolas" w:hAnsi="Consolas"/>
+          <w:sz w:val="20"/>
+          <w:szCs w:val="20"/>
+          <w:shd w:fill="F0F0F0" w:val="clear"/>
+        </w:rPr>
+        <w:t xml:space="preserve">ContentDocumentLink</w:t>
+      </w:r>
+      <w:r>
+        <w:rPr>
+          <w:rFonts w:ascii="Calibri" w:cs="Calibri" w:eastAsia="Calibri" w:hAnsi="Calibri"/>
+          <w:sz w:val="22"/>
+          <w:szCs w:val="22"/>
+        </w:rPr>
+        <w:t xml:space="preserve">) calls </w:t>
+      </w:r>
+      <w:r>
+        <w:rPr>
+          <w:rFonts w:ascii="Consolas" w:cs="Consolas" w:eastAsia="Consolas" w:hAnsi="Consolas"/>
+          <w:sz w:val="20"/>
+          <w:szCs w:val="20"/>
+          <w:shd w:fill="F0F0F0" w:val="clear"/>
+        </w:rPr>
+        <w:t xml:space="preserve">ContentDocumentLinkVisibilityService.ensureAllUsersVisibilityForInvoiceFiles()</w:t>
+      </w:r>
+      <w:r>
+        <w:rPr>
+          <w:rFonts w:ascii="Calibri" w:cs="Calibri" w:eastAsia="Calibri" w:hAnsi="Calibri"/>
+          <w:sz w:val="22"/>
+          <w:szCs w:val="22"/>
+        </w:rPr>
+        <w:t xml:space="preserve">, correcting </w:t>
+      </w:r>
+      <w:r>
+        <w:rPr>
+          <w:rFonts w:ascii="Consolas" w:cs="Consolas" w:eastAsia="Consolas" w:hAnsi="Consolas"/>
+          <w:sz w:val="20"/>
+          <w:szCs w:val="20"/>
+          <w:shd w:fill="F0F0F0" w:val="clear"/>
+        </w:rPr>
+        <w:t xml:space="preserve">Visibility</w:t>
+      </w:r>
+      <w:r>
+        <w:rPr>
+          <w:rFonts w:ascii="Calibri" w:cs="Calibri" w:eastAsia="Calibri" w:hAnsi="Calibri"/>
+          <w:sz w:val="22"/>
+          <w:szCs w:val="22"/>
+        </w:rPr>
+        <w:t xml:space="preserve"> to </w:t>
+      </w:r>
+      <w:r>
+        <w:rPr>
+          <w:rFonts w:ascii="Consolas" w:cs="Consolas" w:eastAsia="Consolas" w:hAnsi="Consolas"/>
+          <w:sz w:val="20"/>
+          <w:szCs w:val="20"/>
+          <w:shd w:fill="F0F0F0" w:val="clear"/>
+        </w:rPr>
+        <w:t xml:space="preserve">AllUsers</w:t>
+      </w:r>
+      <w:r>
+        <w:rPr>
+          <w:rFonts w:ascii="Calibri" w:cs="Calibri" w:eastAsia="Calibri" w:hAnsi="Calibri"/>
+          <w:sz w:val="22"/>
+          <w:szCs w:val="22"/>
+        </w:rPr>
+        <w:t xml:space="preserve"> for any newly-linked file whose </w:t>
+      </w:r>
+      <w:r>
+        <w:rPr>
+          <w:rFonts w:ascii="Consolas" w:cs="Consolas" w:eastAsia="Consolas" w:hAnsi="Consolas"/>
+          <w:sz w:val="20"/>
+          <w:szCs w:val="20"/>
+          <w:shd w:fill="F0F0F0" w:val="clear"/>
+        </w:rPr>
+        <w:t xml:space="preserve">LinkedEntityId</w:t>
+      </w:r>
+      <w:r>
+        <w:rPr>
+          <w:rFonts w:ascii="Calibri" w:cs="Calibri" w:eastAsia="Calibri" w:hAnsi="Calibri"/>
+          <w:sz w:val="22"/>
+          <w:szCs w:val="22"/>
+        </w:rPr>
+        <w:t xml:space="preserve"> is an </w:t>
+      </w:r>
+      <w:r>
+        <w:rPr>
+          <w:rFonts w:ascii="Consolas" w:cs="Consolas" w:eastAsia="Consolas" w:hAnsi="Consolas"/>
+          <w:sz w:val="20"/>
+          <w:szCs w:val="20"/>
+          <w:shd w:fill="F0F0F0" w:val="clear"/>
+        </w:rPr>
+        <w:t xml:space="preserve">Invoice__c</w:t>
+      </w:r>
+      <w:r>
+        <w:rPr>
+          <w:rFonts w:ascii="Calibri" w:cs="Calibri" w:eastAsia="Calibri" w:hAnsi="Calibri"/>
+          <w:sz w:val="22"/>
+          <w:szCs w:val="22"/>
+        </w:rPr>
+        <w:t xml:space="preserve"> — scoped specifically to invoices. This runs without sharing for the same reason </w:t>
+      </w:r>
+      <w:r>
+        <w:rPr>
+          <w:rFonts w:ascii="Consolas" w:cs="Consolas" w:eastAsia="Consolas" w:hAnsi="Consolas"/>
+          <w:sz w:val="20"/>
+          <w:szCs w:val="20"/>
+          <w:shd w:fill="F0F0F0" w:val="clear"/>
+        </w:rPr>
+        <w:t xml:space="preserve">WithoutSharingDml</w:t>
+      </w:r>
+      <w:r>
+        <w:rPr>
+          <w:rFonts w:ascii="Calibri" w:cs="Calibri" w:eastAsia="Calibri" w:hAnsi="Calibri"/>
+          <w:sz w:val="22"/>
+          <w:szCs w:val="22"/>
+        </w:rPr>
+        <w:t xml:space="preserve"> does: the scope check (is this actually an Invoice__c) is the real access control.</w:t>
+      </w:r>
+    </w:p>
+    <w:p>
+      <w:pPr>
+        <w:spacing w:after="160"/>
+      </w:pPr>
+      <w:r>
+        <w:rPr>
+          <w:rFonts w:ascii="Calibri" w:cs="Calibri" w:eastAsia="Calibri" w:hAnsi="Calibri"/>
+          <w:sz w:val="22"/>
+          <w:szCs w:val="22"/>
+        </w:rPr>
+        <w:t xml:space="preserve">If </w:t>
+      </w:r>
+      <w:r>
+        <w:rPr>
+          <w:rFonts w:ascii="Consolas" w:cs="Consolas" w:eastAsia="Consolas" w:hAnsi="Consolas"/>
+          <w:sz w:val="20"/>
+          <w:szCs w:val="20"/>
+          <w:shd w:fill="F0F0F0" w:val="clear"/>
+        </w:rPr>
+        <w:t xml:space="preserve">getInvoiceFileIds()</w:t>
+      </w:r>
+      <w:r>
+        <w:rPr>
+          <w:rFonts w:ascii="Calibri" w:cs="Calibri" w:eastAsia="Calibri" w:hAnsi="Calibri"/>
+          <w:sz w:val="22"/>
+          <w:szCs w:val="22"/>
+        </w:rPr>
+        <w:t xml:space="preserve"> still fails for another reason (an actual exception), every row falls back to “View” rather than breaking the page — </w:t>
+      </w:r>
+      <w:r>
+        <w:rPr>
+          <w:rFonts w:ascii="Consolas" w:cs="Consolas" w:eastAsia="Consolas" w:hAnsi="Consolas"/>
+          <w:sz w:val="20"/>
+          <w:szCs w:val="20"/>
+          <w:shd w:fill="F0F0F0" w:val="clear"/>
+        </w:rPr>
+        <w:t xml:space="preserve">wiredFileIds()</w:t>
+      </w:r>
+      <w:r>
+        <w:rPr>
+          <w:rFonts w:ascii="Calibri" w:cs="Calibri" w:eastAsia="Calibri" w:hAnsi="Calibri"/>
+          <w:sz w:val="22"/>
+          <w:szCs w:val="22"/>
+        </w:rPr>
+        <w:t xml:space="preserve"> logs it to the console so it's diagnosable.</w:t>
+      </w:r>
+    </w:p>
+    <w:p>
+      <w:pPr>
+        <w:spacing w:after="160"/>
+      </w:pPr>
+      <w:r>
+        <w:rPr>
+          <w:rFonts w:ascii="Calibri" w:cs="Calibri" w:eastAsia="Calibri" w:hAnsi="Calibri"/>
+          <w:b/>
+          <w:bCs/>
+          <w:sz w:val="22"/>
+          <w:szCs w:val="22"/>
+        </w:rPr>
+        <w:t xml:space="preserve">A second, separate issue: </w:t>
+      </w:r>
+      <w:r>
+        <w:rPr>
+          <w:rFonts w:ascii="Calibri" w:cs="Calibri" w:eastAsia="Calibri" w:hAnsi="Calibri"/>
+          <w:sz w:val="22"/>
+          <w:szCs w:val="22"/>
+        </w:rPr>
+        <w:t xml:space="preserve">the “View” fallback (</w:t>
+      </w:r>
+      <w:r>
+        <w:rPr>
+          <w:rFonts w:ascii="Consolas" w:cs="Consolas" w:eastAsia="Consolas" w:hAnsi="Consolas"/>
+          <w:sz w:val="20"/>
+          <w:szCs w:val="20"/>
+          <w:shd w:fill="F0F0F0" w:val="clear"/>
+        </w:rPr>
+        <w:t xml:space="preserve">standard__recordPage</w:t>
+      </w:r>
+      <w:r>
+        <w:rPr>
+          <w:rFonts w:ascii="Calibri" w:cs="Calibri" w:eastAsia="Calibri" w:hAnsi="Calibri"/>
+          <w:sz w:val="22"/>
+          <w:szCs w:val="22"/>
+        </w:rPr>
+        <w:t xml:space="preserve"> navigation) can also land on the site's error page (“Invalid Page”) if </w:t>
+      </w:r>
+      <w:r>
+        <w:rPr>
+          <w:rFonts w:ascii="Consolas" w:cs="Consolas" w:eastAsia="Consolas" w:hAnsi="Consolas"/>
+          <w:sz w:val="20"/>
+          <w:szCs w:val="20"/>
+          <w:shd w:fill="F0F0F0" w:val="clear"/>
+        </w:rPr>
+        <w:t xml:space="preserve">Invoice__c</w:t>
+      </w:r>
+      <w:r>
+        <w:rPr>
+          <w:rFonts w:ascii="Calibri" w:cs="Calibri" w:eastAsia="Calibri" w:hAnsi="Calibri"/>
+          <w:sz w:val="22"/>
+          <w:szCs w:val="22"/>
+        </w:rPr>
+        <w:t xml:space="preserve"> doesn't have an activated Object Page in this Experience Builder site. LWR (“Build Your Own”) sites need that page created explicitly: Setup → Digital Experiences → Builder → Pages → New Page → Object Page → select </w:t>
+      </w:r>
+      <w:r>
+        <w:rPr>
+          <w:rFonts w:ascii="Consolas" w:cs="Consolas" w:eastAsia="Consolas" w:hAnsi="Consolas"/>
+          <w:sz w:val="20"/>
+          <w:szCs w:val="20"/>
+          <w:shd w:fill="F0F0F0" w:val="clear"/>
+        </w:rPr>
+        <w:t xml:space="preserve">Invoice__c</w:t>
+      </w:r>
+      <w:r>
+        <w:rPr>
+          <w:rFonts w:ascii="Calibri" w:cs="Calibri" w:eastAsia="Calibri" w:hAnsi="Calibri"/>
+          <w:sz w:val="22"/>
+          <w:szCs w:val="22"/>
+        </w:rPr>
+        <w:t xml:space="preserve"> → Publish. Unrelated to the file-download fix above; check independently if the “View” (not “Download PDF”) button is the one landing on Invalid Page.</w:t>
+      </w:r>
+    </w:p>
+    <w:p>
+      <w:pPr>
+        <w:pStyle w:val="Heading3"/>
+        <w:spacing w:after="100" w:before="200"/>
+      </w:pPr>
+      <w:r>
+        <w:t xml:space="preserve">3.4.3 iOS Safari download fix</w:t>
+      </w:r>
+    </w:p>
+    <w:p>
+      <w:pPr>
+        <w:spacing w:after="160"/>
+      </w:pPr>
+      <w:r>
+        <w:rPr>
+          <w:rFonts w:ascii="Calibri" w:cs="Calibri" w:eastAsia="Calibri" w:hAnsi="Calibri"/>
+          <w:b/>
+          <w:bCs/>
+          <w:sz w:val="22"/>
+          <w:szCs w:val="22"/>
+        </w:rPr>
+        <w:t xml:space="preserve">Both this button and Reporting's Download CSV button silently did nothing useful on an iPhone/iPad.</w:t>
+      </w:r>
+      <w:r>
+        <w:rPr>
+          <w:rFonts w:ascii="Calibri" w:cs="Calibri" w:eastAsia="Calibri" w:hAnsi="Calibri"/>
+          <w:sz w:val="22"/>
+          <w:szCs w:val="22"/>
+        </w:rPr>
+        <w:t xml:space="preserve"> Root cause: </w:t>
+      </w:r>
+      <w:r>
+        <w:rPr>
+          <w:rFonts w:ascii="Calibri" w:cs="Calibri" w:eastAsia="Calibri" w:hAnsi="Calibri"/>
+          <w:b/>
+          <w:bCs/>
+          <w:sz w:val="22"/>
+          <w:szCs w:val="22"/>
+        </w:rPr>
+        <w:t xml:space="preserve">iOS Safari has never honoured the </w:t>
+      </w:r>
+      <w:r>
+        <w:rPr>
+          <w:rFonts w:ascii="Consolas" w:cs="Consolas" w:eastAsia="Consolas" w:hAnsi="Consolas"/>
+          <w:sz w:val="20"/>
+          <w:szCs w:val="20"/>
+          <w:shd w:fill="F0F0F0" w:val="clear"/>
+        </w:rPr>
+        <w:t xml:space="preserve">&lt;a download&gt;</w:t>
+      </w:r>
+      <w:r>
+        <w:rPr>
+          <w:rFonts w:ascii="Calibri" w:cs="Calibri" w:eastAsia="Calibri" w:hAnsi="Calibri"/>
+          <w:b/>
+          <w:bCs/>
+          <w:sz w:val="22"/>
+          <w:szCs w:val="22"/>
+        </w:rPr>
+        <w:t xml:space="preserve"> attribute at all</w:t>
+      </w:r>
+      <w:r>
+        <w:rPr>
+          <w:rFonts w:ascii="Calibri" w:cs="Calibri" w:eastAsia="Calibri" w:hAnsi="Calibri"/>
+          <w:sz w:val="22"/>
+          <w:szCs w:val="22"/>
+        </w:rPr>
+        <w:t xml:space="preserve"> — a long-standing WebKit platform limitation, not a bug that a newer iOS version fixes. This holds regardless of whether the </w:t>
+      </w:r>
+      <w:r>
+        <w:rPr>
+          <w:rFonts w:ascii="Consolas" w:cs="Consolas" w:eastAsia="Consolas" w:hAnsi="Consolas"/>
+          <w:sz w:val="20"/>
+          <w:szCs w:val="20"/>
+          <w:shd w:fill="F0F0F0" w:val="clear"/>
+        </w:rPr>
+        <w:t xml:space="preserve">href</w:t>
+      </w:r>
+      <w:r>
+        <w:rPr>
+          <w:rFonts w:ascii="Calibri" w:cs="Calibri" w:eastAsia="Calibri" w:hAnsi="Calibri"/>
+          <w:sz w:val="22"/>
+          <w:szCs w:val="22"/>
+        </w:rPr>
+        <w:t xml:space="preserve"> is a </w:t>
+      </w:r>
+      <w:r>
+        <w:rPr>
+          <w:rFonts w:ascii="Consolas" w:cs="Consolas" w:eastAsia="Consolas" w:hAnsi="Consolas"/>
+          <w:sz w:val="20"/>
+          <w:szCs w:val="20"/>
+          <w:shd w:fill="F0F0F0" w:val="clear"/>
+        </w:rPr>
+        <w:t xml:space="preserve">data:</w:t>
+      </w:r>
+      <w:r>
+        <w:rPr>
+          <w:rFonts w:ascii="Calibri" w:cs="Calibri" w:eastAsia="Calibri" w:hAnsi="Calibri"/>
+          <w:sz w:val="22"/>
+          <w:szCs w:val="22"/>
+        </w:rPr>
+        <w:t xml:space="preserve"> URI, a </w:t>
+      </w:r>
+      <w:r>
+        <w:rPr>
+          <w:rFonts w:ascii="Consolas" w:cs="Consolas" w:eastAsia="Consolas" w:hAnsi="Consolas"/>
+          <w:sz w:val="20"/>
+          <w:szCs w:val="20"/>
+          <w:shd w:fill="F0F0F0" w:val="clear"/>
+        </w:rPr>
+        <w:t xml:space="preserve">blob:</w:t>
+      </w:r>
+      <w:r>
+        <w:rPr>
+          <w:rFonts w:ascii="Calibri" w:cs="Calibri" w:eastAsia="Calibri" w:hAnsi="Calibri"/>
+          <w:sz w:val="22"/>
+          <w:szCs w:val="22"/>
+        </w:rPr>
+        <w:t xml:space="preserve"> URL, or a same-origin file, and applies to every browser on iOS (Chrome/Firefox there are all Safari underneath). Clicking such a link just navigates to/opens the URI instead of saving anything. Desktop and Android don't have this problem — the existing anchor-click technique already documented throughout this section works fine there and is completely unchanged.</w:t>
+      </w:r>
+    </w:p>
+    <w:p>
+      <w:pPr>
+        <w:pStyle w:val="ListParagraph"/>
+        <w:numPr>
+          <w:ilvl w:val="0"/>
+          <w:numId w:val="1"/>
+        </w:numPr>
+        <w:spacing w:after="80"/>
+      </w:pPr>
+      <w:r>
+        <w:rPr>
+          <w:rFonts w:ascii="Consolas" w:cs="Consolas" w:eastAsia="Consolas" w:hAnsi="Consolas"/>
+          <w:sz w:val="20"/>
+          <w:szCs w:val="20"/>
+          <w:shd w:fill="F0F0F0" w:val="clear"/>
+        </w:rPr>
+        <w:t xml:space="preserve">c/fileDownloadUtils</w:t>
+      </w:r>
+      <w:r>
+        <w:rPr>
+          <w:rFonts w:ascii="Calibri" w:cs="Calibri" w:eastAsia="Calibri" w:hAnsi="Calibri"/>
+          <w:sz w:val="22"/>
+          <w:szCs w:val="22"/>
+        </w:rPr>
+        <w:t xml:space="preserve"> (new shared LWC module — </w:t>
+      </w:r>
+      <w:r>
+        <w:rPr>
+          <w:rFonts w:ascii="Consolas" w:cs="Consolas" w:eastAsia="Consolas" w:hAnsi="Consolas"/>
+          <w:sz w:val="20"/>
+          <w:szCs w:val="20"/>
+          <w:shd w:fill="F0F0F0" w:val="clear"/>
+        </w:rPr>
+        <w:t xml:space="preserve">isIosDevice</w:t>
+      </w:r>
+      <w:r>
+        <w:rPr>
+          <w:rFonts w:ascii="Calibri" w:cs="Calibri" w:eastAsia="Calibri" w:hAnsi="Calibri"/>
+          <w:sz w:val="22"/>
+          <w:szCs w:val="22"/>
+        </w:rPr>
+        <w:t xml:space="preserve">/</w:t>
+      </w:r>
+      <w:r>
+        <w:rPr>
+          <w:rFonts w:ascii="Consolas" w:cs="Consolas" w:eastAsia="Consolas" w:hAnsi="Consolas"/>
+          <w:sz w:val="20"/>
+          <w:szCs w:val="20"/>
+          <w:shd w:fill="F0F0F0" w:val="clear"/>
+        </w:rPr>
+        <w:t xml:space="preserve">triggerDataUriDownload</w:t>
+      </w:r>
+      <w:r>
+        <w:rPr>
+          <w:rFonts w:ascii="Calibri" w:cs="Calibri" w:eastAsia="Calibri" w:hAnsi="Calibri"/>
+          <w:sz w:val="22"/>
+          <w:szCs w:val="22"/>
+        </w:rPr>
+        <w:t xml:space="preserve">) branches </w:t>
+      </w:r>
+      <w:r>
+        <w:rPr>
+          <w:rFonts w:ascii="Calibri" w:cs="Calibri" w:eastAsia="Calibri" w:hAnsi="Calibri"/>
+          <w:b/>
+          <w:bCs/>
+          <w:sz w:val="22"/>
+          <w:szCs w:val="22"/>
+        </w:rPr>
+        <w:t xml:space="preserve">only</w:t>
+      </w:r>
+      <w:r>
+        <w:rPr>
+          <w:rFonts w:ascii="Calibri" w:cs="Calibri" w:eastAsia="Calibri" w:hAnsi="Calibri"/>
+          <w:sz w:val="22"/>
+          <w:szCs w:val="22"/>
+        </w:rPr>
+        <w:t xml:space="preserve"> for iOS: </w:t>
+      </w:r>
+      <w:r>
+        <w:rPr>
+          <w:rFonts w:ascii="Consolas" w:cs="Consolas" w:eastAsia="Consolas" w:hAnsi="Consolas"/>
+          <w:sz w:val="20"/>
+          <w:szCs w:val="20"/>
+          <w:shd w:fill="F0F0F0" w:val="clear"/>
+        </w:rPr>
+        <w:t xml:space="preserve">navigator.userAgent</w:t>
+      </w:r>
+      <w:r>
+        <w:rPr>
+          <w:rFonts w:ascii="Calibri" w:cs="Calibri" w:eastAsia="Calibri" w:hAnsi="Calibri"/>
+          <w:sz w:val="22"/>
+          <w:szCs w:val="22"/>
+        </w:rPr>
+        <w:t xml:space="preserve"> matched against </w:t>
+      </w:r>
+      <w:r>
+        <w:rPr>
+          <w:rFonts w:ascii="Consolas" w:cs="Consolas" w:eastAsia="Consolas" w:hAnsi="Consolas"/>
+          <w:sz w:val="20"/>
+          <w:szCs w:val="20"/>
+          <w:shd w:fill="F0F0F0" w:val="clear"/>
+        </w:rPr>
+        <w:t xml:space="preserve">/iPad|iPhone|iPod/i</w:t>
+      </w:r>
+      <w:r>
+        <w:rPr>
+          <w:rFonts w:ascii="Calibri" w:cs="Calibri" w:eastAsia="Calibri" w:hAnsi="Calibri"/>
+          <w:sz w:val="22"/>
+          <w:szCs w:val="22"/>
+        </w:rPr>
+        <w:t xml:space="preserve"> (desktop Safari on a Mac isn't affected either, so this deliberately doesn't match on "Safari" generally, only the iOS device tokens).</w:t>
+      </w:r>
+    </w:p>
+    <w:p>
+      <w:pPr>
+        <w:pStyle w:val="ListParagraph"/>
+        <w:numPr>
+          <w:ilvl w:val="0"/>
+          <w:numId w:val="1"/>
+        </w:numPr>
+        <w:spacing w:after="80"/>
+      </w:pPr>
+      <w:r>
+        <w:rPr>
+          <w:rFonts w:ascii="Calibri" w:cs="Calibri" w:eastAsia="Calibri" w:hAnsi="Calibri"/>
+          <w:sz w:val="22"/>
+          <w:szCs w:val="22"/>
+        </w:rPr>
+        <w:t xml:space="preserve">On iOS, instead of clicking an anchor, </w:t>
+      </w:r>
+      <w:r>
+        <w:rPr>
+          <w:rFonts w:ascii="Consolas" w:cs="Consolas" w:eastAsia="Consolas" w:hAnsi="Consolas"/>
+          <w:sz w:val="20"/>
+          <w:szCs w:val="20"/>
+          <w:shd w:fill="F0F0F0" w:val="clear"/>
+        </w:rPr>
+        <w:t xml:space="preserve">window.open(dataUri, '_blank')</w:t>
+      </w:r>
+      <w:r>
+        <w:rPr>
+          <w:rFonts w:ascii="Calibri" w:cs="Calibri" w:eastAsia="Calibri" w:hAnsi="Calibri"/>
+          <w:sz w:val="22"/>
+          <w:szCs w:val="22"/>
+        </w:rPr>
+        <w:t xml:space="preserve"> opens the same data: URI directly — there is no way to force a true "Save As" from pure client-side markup on iOS Safari, but this lets iOS's own viewer take over: a PDF opens in Safari's built-in PDF viewer, which has its own native Share/Save-to-Files button.</w:t>
+      </w:r>
+    </w:p>
+    <w:p>
+      <w:pPr>
+        <w:pStyle w:val="ListParagraph"/>
+        <w:numPr>
+          <w:ilvl w:val="0"/>
+          <w:numId w:val="1"/>
+        </w:numPr>
+        <w:spacing w:after="80"/>
+      </w:pPr>
+      <w:r>
+        <w:rPr>
+          <w:rFonts w:ascii="Calibri" w:cs="Calibri" w:eastAsia="Calibri" w:hAnsi="Calibri"/>
+          <w:sz w:val="22"/>
+          <w:szCs w:val="22"/>
+        </w:rPr>
+        <w:t xml:space="preserve">CSV has no equivalent built-in iOS viewer, so the best available outcome there is the raw text opening in a new tab (viewable/selectable/shareable via Safari's share sheet) rather than a literal file save — an improvement over doing nothing, but not a perfect "download", given this project has no backend to set a real </w:t>
+      </w:r>
+      <w:r>
+        <w:rPr>
+          <w:rFonts w:ascii="Consolas" w:cs="Consolas" w:eastAsia="Consolas" w:hAnsi="Consolas"/>
+          <w:sz w:val="20"/>
+          <w:szCs w:val="20"/>
+          <w:shd w:fill="F0F0F0" w:val="clear"/>
+        </w:rPr>
+        <w:t xml:space="preserve">Content-Disposition</w:t>
+      </w:r>
+      <w:r>
+        <w:rPr>
+          <w:rFonts w:ascii="Calibri" w:cs="Calibri" w:eastAsia="Calibri" w:hAnsi="Calibri"/>
+          <w:sz w:val="22"/>
+          <w:szCs w:val="22"/>
+        </w:rPr>
+        <w:t xml:space="preserve"> header.</w:t>
+      </w:r>
+    </w:p>
+    <w:p>
+      <w:pPr>
+        <w:pStyle w:val="ListParagraph"/>
+        <w:numPr>
+          <w:ilvl w:val="0"/>
+          <w:numId w:val="1"/>
+        </w:numPr>
+        <w:spacing w:after="80"/>
+      </w:pPr>
+      <w:r>
+        <w:rPr>
+          <w:rFonts w:ascii="Calibri" w:cs="Calibri" w:eastAsia="Calibri" w:hAnsi="Calibri"/>
+          <w:sz w:val="22"/>
+          <w:szCs w:val="22"/>
+        </w:rPr>
+        <w:t xml:space="preserve">Every other browser (desktop Chrome/Firefox/Edge/Safari, Android Chrome) keeps using the original anchor-click path, completely untouched.</w:t>
+      </w:r>
+    </w:p>
+    <w:p>
+      <w:pPr>
+        <w:spacing w:after="160"/>
+      </w:pPr>
+      <w:r>
+        <w:rPr>
+          <w:rFonts w:ascii="Calibri" w:cs="Calibri" w:eastAsia="Calibri" w:hAnsi="Calibri"/>
+          <w:sz w:val="22"/>
+          <w:szCs w:val="22"/>
+        </w:rPr>
+        <w:t xml:space="preserve">Confirmed via Jest — </w:t>
+      </w:r>
+      <w:r>
+        <w:rPr>
+          <w:rFonts w:ascii="Consolas" w:cs="Consolas" w:eastAsia="Consolas" w:hAnsi="Consolas"/>
+          <w:sz w:val="20"/>
+          <w:szCs w:val="20"/>
+          <w:shd w:fill="F0F0F0" w:val="clear"/>
+        </w:rPr>
+        <w:t xml:space="preserve">isIosDevice</w:t>
+      </w:r>
+      <w:r>
+        <w:rPr>
+          <w:rFonts w:ascii="Calibri" w:cs="Calibri" w:eastAsia="Calibri" w:hAnsi="Calibri"/>
+          <w:sz w:val="22"/>
+          <w:szCs w:val="22"/>
+        </w:rPr>
+        <w:t xml:space="preserve"> correctly matches iPhone/iPad user agents and not Android/desktop ones, and </w:t>
+      </w:r>
+      <w:r>
+        <w:rPr>
+          <w:rFonts w:ascii="Consolas" w:cs="Consolas" w:eastAsia="Consolas" w:hAnsi="Consolas"/>
+          <w:sz w:val="20"/>
+          <w:szCs w:val="20"/>
+          <w:shd w:fill="F0F0F0" w:val="clear"/>
+        </w:rPr>
+        <w:t xml:space="preserve">triggerDataUriDownload</w:t>
+      </w:r>
+      <w:r>
+        <w:rPr>
+          <w:rFonts w:ascii="Calibri" w:cs="Calibri" w:eastAsia="Calibri" w:hAnsi="Calibri"/>
+          <w:sz w:val="22"/>
+          <w:szCs w:val="22"/>
+        </w:rPr>
+        <w:t xml:space="preserve"> calls </w:t>
+      </w:r>
+      <w:r>
+        <w:rPr>
+          <w:rFonts w:ascii="Consolas" w:cs="Consolas" w:eastAsia="Consolas" w:hAnsi="Consolas"/>
+          <w:sz w:val="20"/>
+          <w:szCs w:val="20"/>
+          <w:shd w:fill="F0F0F0" w:val="clear"/>
+        </w:rPr>
+        <w:t xml:space="preserve">window.open</w:t>
+      </w:r>
+      <w:r>
+        <w:rPr>
+          <w:rFonts w:ascii="Calibri" w:cs="Calibri" w:eastAsia="Calibri" w:hAnsi="Calibri"/>
+          <w:sz w:val="22"/>
+          <w:szCs w:val="22"/>
+        </w:rPr>
+        <w:t xml:space="preserve"> on iOS versus clicking an off-DOM anchor everywhere else — since these are standard DOM APIs jsdom implements accurately (unlike the CSS cascade issue above, there's no rendering/layout involved here).</w:t>
+      </w:r>
+    </w:p>
+    <w:p>
+      <w:pPr>
+        <w:pStyle w:val="Heading2"/>
+        <w:spacing w:after="150" w:before="300"/>
+      </w:pPr>
+      <w:r>
+        <w:t xml:space="preserve">3.5 Support / Query (supportRequestForm)</w:t>
+      </w:r>
+    </w:p>
+    <w:p>
+      <w:pPr>
+        <w:spacing w:after="160"/>
+      </w:pPr>
+      <w:r>
+        <w:rPr>
+          <w:rFonts w:ascii="Calibri" w:cs="Calibri" w:eastAsia="Calibri" w:hAnsi="Calibri"/>
+          <w:sz w:val="22"/>
+          <w:szCs w:val="22"/>
+        </w:rPr>
+        <w:t xml:space="preserve">No longer submits through a bare </w:t>
+      </w:r>
+      <w:r>
+        <w:rPr>
+          <w:rFonts w:ascii="Consolas" w:cs="Consolas" w:eastAsia="Consolas" w:hAnsi="Consolas"/>
+          <w:sz w:val="20"/>
+          <w:szCs w:val="20"/>
+          <w:shd w:fill="F0F0F0" w:val="clear"/>
+        </w:rPr>
+        <w:t xml:space="preserve">lightning-record-edit-form</w:t>
+      </w:r>
+      <w:r>
+        <w:rPr>
+          <w:rFonts w:ascii="Calibri" w:cs="Calibri" w:eastAsia="Calibri" w:hAnsi="Calibri"/>
+          <w:sz w:val="22"/>
+          <w:szCs w:val="22"/>
+        </w:rPr>
+        <w:t xml:space="preserve"> — now a custom Apex-backed form (matching requestStaffForm's pattern) via </w:t>
+      </w:r>
+      <w:r>
+        <w:rPr>
+          <w:rFonts w:ascii="Consolas" w:cs="Consolas" w:eastAsia="Consolas" w:hAnsi="Consolas"/>
+          <w:sz w:val="20"/>
+          <w:szCs w:val="20"/>
+          <w:shd w:fill="F0F0F0" w:val="clear"/>
+        </w:rPr>
+        <w:t xml:space="preserve">SupportRequestController.createCase()</w:t>
+      </w:r>
+      <w:r>
+        <w:rPr>
+          <w:rFonts w:ascii="Calibri" w:cs="Calibri" w:eastAsia="Calibri" w:hAnsi="Calibri"/>
+          <w:sz w:val="22"/>
+          <w:szCs w:val="22"/>
+        </w:rPr>
+        <w:t xml:space="preserve"> / </w:t>
+      </w:r>
+      <w:r>
+        <w:rPr>
+          <w:rFonts w:ascii="Consolas" w:cs="Consolas" w:eastAsia="Consolas" w:hAnsi="Consolas"/>
+          <w:sz w:val="20"/>
+          <w:szCs w:val="20"/>
+          <w:shd w:fill="F0F0F0" w:val="clear"/>
+        </w:rPr>
+        <w:t xml:space="preserve">SupportRequestService.submitNewCase()</w:t>
+      </w:r>
+      <w:r>
+        <w:rPr>
+          <w:rFonts w:ascii="Calibri" w:cs="Calibri" w:eastAsia="Calibri" w:hAnsi="Calibri"/>
+          <w:sz w:val="22"/>
+          <w:szCs w:val="22"/>
+        </w:rPr>
+        <w:t xml:space="preserve">, giving a reliable post-submit confirmation (inline confirmation panel, not just a toast) with View My Requests and Submit Another Request buttons, plus a confirmation email (</w:t>
+      </w:r>
+      <w:r>
+        <w:rPr>
+          <w:rFonts w:ascii="Consolas" w:cs="Consolas" w:eastAsia="Consolas" w:hAnsi="Consolas"/>
+          <w:sz w:val="20"/>
+          <w:szCs w:val="20"/>
+          <w:shd w:fill="F0F0F0" w:val="clear"/>
+        </w:rPr>
+        <w:t xml:space="preserve">SupportRequestService</w:t>
+      </w:r>
+      <w:r>
+        <w:rPr>
+          <w:rFonts w:ascii="Calibri" w:cs="Calibri" w:eastAsia="Calibri" w:hAnsi="Calibri"/>
+          <w:sz w:val="22"/>
+          <w:szCs w:val="22"/>
+        </w:rPr>
+        <w:t xml:space="preserve"> emails the submitting Contact; email failures are caught and logged rather than blocking Case creation).</w:t>
+      </w:r>
+    </w:p>
+    <w:p>
+      <w:pPr>
+        <w:spacing w:after="160"/>
+      </w:pPr>
+      <w:r>
+        <w:rPr>
+          <w:rFonts w:ascii="Calibri" w:cs="Calibri" w:eastAsia="Calibri" w:hAnsi="Calibri"/>
+          <w:sz w:val="22"/>
+          <w:szCs w:val="22"/>
+        </w:rPr>
+        <w:t xml:space="preserve">No longer offers a Request Type picker or a Related Request picker — now just Subject/Description, always submitting </w:t>
+      </w:r>
+      <w:r>
+        <w:rPr>
+          <w:rFonts w:ascii="Consolas" w:cs="Consolas" w:eastAsia="Consolas" w:hAnsi="Consolas"/>
+          <w:sz w:val="20"/>
+          <w:szCs w:val="20"/>
+          <w:shd w:fill="F0F0F0" w:val="clear"/>
+        </w:rPr>
+        <w:t xml:space="preserve">Portal_Request_Type__c = 'General Query'</w:t>
+      </w:r>
+      <w:r>
+        <w:rPr>
+          <w:rFonts w:ascii="Calibri" w:cs="Calibri" w:eastAsia="Calibri" w:hAnsi="Calibri"/>
+          <w:sz w:val="22"/>
+          <w:szCs w:val="22"/>
+        </w:rPr>
+        <w:t xml:space="preserve">. Both removals reflect the same shift: cancellation requests moved to the My Requests row action, which is also where the Related Request context now naturally lives (the row clicked </w:t>
+      </w:r>
+      <w:r>
+        <w:rPr>
+          <w:rFonts w:ascii="Calibri" w:cs="Calibri" w:eastAsia="Calibri" w:hAnsi="Calibri"/>
+          <w:sz w:val="22"/>
+          <w:szCs w:val="22"/>
+        </w:rPr>
+        <w:t xml:space="preserve">is</w:t>
+      </w:r>
+      <w:r>
+        <w:rPr>
+          <w:rFonts w:ascii="Calibri" w:cs="Calibri" w:eastAsia="Calibri" w:hAnsi="Calibri"/>
+          <w:sz w:val="22"/>
+          <w:szCs w:val="22"/>
+        </w:rPr>
+        <w:t xml:space="preserve"> the related request). The </w:t>
+      </w:r>
+      <w:r>
+        <w:rPr>
+          <w:rFonts w:ascii="Consolas" w:cs="Consolas" w:eastAsia="Consolas" w:hAnsi="Consolas"/>
+          <w:sz w:val="20"/>
+          <w:szCs w:val="20"/>
+          <w:shd w:fill="F0F0F0" w:val="clear"/>
+        </w:rPr>
+        <w:t xml:space="preserve">Cancellation Request</w:t>
+      </w:r>
+      <w:r>
+        <w:rPr>
+          <w:rFonts w:ascii="Calibri" w:cs="Calibri" w:eastAsia="Calibri" w:hAnsi="Calibri"/>
+          <w:sz w:val="22"/>
+          <w:szCs w:val="22"/>
+        </w:rPr>
+        <w:t xml:space="preserve"> picklist value and </w:t>
+      </w:r>
+      <w:r>
+        <w:rPr>
+          <w:rFonts w:ascii="Consolas" w:cs="Consolas" w:eastAsia="Consolas" w:hAnsi="Consolas"/>
+          <w:sz w:val="20"/>
+          <w:szCs w:val="20"/>
+          <w:shd w:fill="F0F0F0" w:val="clear"/>
+        </w:rPr>
+        <w:t xml:space="preserve">Case.Related_Staffing_Request__c</w:t>
+      </w:r>
+      <w:r>
+        <w:rPr>
+          <w:rFonts w:ascii="Calibri" w:cs="Calibri" w:eastAsia="Calibri" w:hAnsi="Calibri"/>
+          <w:sz w:val="22"/>
+          <w:szCs w:val="22"/>
+        </w:rPr>
+        <w:t xml:space="preserve"> field both still exist and are still used — just by the row action, not by anything picked on this form.</w:t>
+      </w:r>
+    </w:p>
+    <w:p>
+      <w:pPr>
+        <w:spacing w:after="160"/>
+      </w:pPr>
+      <w:r>
+        <w:rPr>
+          <w:rFonts w:ascii="Calibri" w:cs="Calibri" w:eastAsia="Calibri" w:hAnsi="Calibri"/>
+          <w:b/>
+          <w:bCs/>
+          <w:sz w:val="22"/>
+          <w:szCs w:val="22"/>
+        </w:rPr>
+        <w:t xml:space="preserve">Subject is enforced as required: </w:t>
+      </w:r>
+      <w:r>
+        <w:rPr>
+          <w:rFonts w:ascii="Calibri" w:cs="Calibri" w:eastAsia="Calibri" w:hAnsi="Calibri"/>
+          <w:sz w:val="22"/>
+          <w:szCs w:val="22"/>
+        </w:rPr>
+        <w:t xml:space="preserve">the </w:t>
+      </w:r>
+      <w:r>
+        <w:rPr>
+          <w:rFonts w:ascii="Consolas" w:cs="Consolas" w:eastAsia="Consolas" w:hAnsi="Consolas"/>
+          <w:sz w:val="20"/>
+          <w:szCs w:val="20"/>
+          <w:shd w:fill="F0F0F0" w:val="clear"/>
+        </w:rPr>
+        <w:t xml:space="preserve">required</w:t>
+      </w:r>
+      <w:r>
+        <w:rPr>
+          <w:rFonts w:ascii="Calibri" w:cs="Calibri" w:eastAsia="Calibri" w:hAnsi="Calibri"/>
+          <w:sz w:val="22"/>
+          <w:szCs w:val="22"/>
+        </w:rPr>
+        <w:t xml:space="preserve"> attribute alone only drove browser-native validation when something calls </w:t>
+      </w:r>
+      <w:r>
+        <w:rPr>
+          <w:rFonts w:ascii="Consolas" w:cs="Consolas" w:eastAsia="Consolas" w:hAnsi="Consolas"/>
+          <w:sz w:val="20"/>
+          <w:szCs w:val="20"/>
+          <w:shd w:fill="F0F0F0" w:val="clear"/>
+        </w:rPr>
+        <w:t xml:space="preserve">reportValidity()</w:t>
+      </w:r>
+      <w:r>
+        <w:rPr>
+          <w:rFonts w:ascii="Calibri" w:cs="Calibri" w:eastAsia="Calibri" w:hAnsi="Calibri"/>
+          <w:sz w:val="22"/>
+          <w:szCs w:val="22"/>
+        </w:rPr>
+        <w:t xml:space="preserve"> — nothing did, so it was decorative. </w:t>
+      </w:r>
+      <w:r>
+        <w:rPr>
+          <w:rFonts w:ascii="Consolas" w:cs="Consolas" w:eastAsia="Consolas" w:hAnsi="Consolas"/>
+          <w:sz w:val="20"/>
+          <w:szCs w:val="20"/>
+          <w:shd w:fill="F0F0F0" w:val="clear"/>
+        </w:rPr>
+        <w:t xml:space="preserve">handleSubmit</w:t>
+      </w:r>
+      <w:r>
+        <w:rPr>
+          <w:rFonts w:ascii="Calibri" w:cs="Calibri" w:eastAsia="Calibri" w:hAnsi="Calibri"/>
+          <w:sz w:val="22"/>
+          <w:szCs w:val="22"/>
+        </w:rPr>
+        <w:t xml:space="preserve"> now calls </w:t>
+      </w:r>
+      <w:r>
+        <w:rPr>
+          <w:rFonts w:ascii="Consolas" w:cs="Consolas" w:eastAsia="Consolas" w:hAnsi="Consolas"/>
+          <w:sz w:val="20"/>
+          <w:szCs w:val="20"/>
+          <w:shd w:fill="F0F0F0" w:val="clear"/>
+        </w:rPr>
+        <w:t xml:space="preserve">reportValidity()</w:t>
+      </w:r>
+      <w:r>
+        <w:rPr>
+          <w:rFonts w:ascii="Calibri" w:cs="Calibri" w:eastAsia="Calibri" w:hAnsi="Calibri"/>
+          <w:sz w:val="22"/>
+          <w:szCs w:val="22"/>
+        </w:rPr>
+        <w:t xml:space="preserve"> and also gates on the trimmed </w:t>
+      </w:r>
+      <w:r>
+        <w:rPr>
+          <w:rFonts w:ascii="Consolas" w:cs="Consolas" w:eastAsia="Consolas" w:hAnsi="Consolas"/>
+          <w:sz w:val="20"/>
+          <w:szCs w:val="20"/>
+          <w:shd w:fill="F0F0F0" w:val="clear"/>
+        </w:rPr>
+        <w:t xml:space="preserve">formData.subject</w:t>
+      </w:r>
+      <w:r>
+        <w:rPr>
+          <w:rFonts w:ascii="Calibri" w:cs="Calibri" w:eastAsia="Calibri" w:hAnsi="Calibri"/>
+          <w:sz w:val="22"/>
+          <w:szCs w:val="22"/>
+        </w:rPr>
+        <w:t xml:space="preserve"> value directly (Jest's stub can't exercise real DOM validity), showing an inline error banner (“Subject is required.”) if blank or whitespace-only.</w:t>
+      </w:r>
+    </w:p>
+    <w:p>
+      <w:pPr>
+        <w:pStyle w:val="Heading2"/>
+        <w:spacing w:after="150" w:before="300"/>
+      </w:pPr>
+      <w:r>
+        <w:t xml:space="preserve">3.6 Request Staff (requestStaffForm)</w:t>
+      </w:r>
+    </w:p>
+    <w:p>
+      <w:pPr>
+        <w:spacing w:after="160"/>
+      </w:pPr>
+      <w:r>
+        <w:rPr>
+          <w:rFonts w:ascii="Calibri" w:cs="Calibri" w:eastAsia="Calibri" w:hAnsi="Calibri"/>
+          <w:sz w:val="22"/>
+          <w:szCs w:val="22"/>
+        </w:rPr>
+        <w:t xml:space="preserve">Had the same required-field validation gap, across more fields: Role, Shift Date, Start Time, End Time, Quantity, and Priority were all marked required (Facility is required too, as a Master-Detail relationship, though facilityPicker didn't mark it required itself), but nothing called reportValidity() — a blank submission went all the way to Apex, surfacing a raw DML error (e.g. “Required fields are missing: [Role__c]”) instead of a clean client-side message.</w:t>
+      </w:r>
+    </w:p>
+    <w:p>
+      <w:pPr>
+        <w:spacing w:after="160"/>
+      </w:pPr>
+      <w:r>
+        <w:rPr>
+          <w:rFonts w:ascii="Calibri" w:cs="Calibri" w:eastAsia="Calibri" w:hAnsi="Calibri"/>
+          <w:sz w:val="22"/>
+          <w:szCs w:val="22"/>
+        </w:rPr>
+        <w:t xml:space="preserve">handleSubmit now checks Facility/Role/Shift Date/Start Time/End Time/Quantity/Priority up front and shows a single banner listing only whichever are missing (e.g. “Please fill in: Facility, Role, Shift Date.”) before calling Apex. Quantity and Priority always carry a default value in practice, but are included in case those defaults ever change. Ward, Specialty, and Notes remain genuinely optional.</w:t>
+      </w:r>
+    </w:p>
+    <w:p>
+      <w:pPr>
+        <w:spacing w:after="160"/>
+      </w:pPr>
+      <w:r>
+        <w:rPr>
+          <w:rFonts w:ascii="Calibri" w:cs="Calibri" w:eastAsia="Calibri" w:hAnsi="Calibri"/>
+          <w:sz w:val="22"/>
+          <w:szCs w:val="22"/>
+        </w:rPr>
+        <w:t xml:space="preserve">Submit buttons on this form and Support's now show a “Submitting…” label plus a small spinner while the Apex call is in flight, instead of only an easy-to-miss disabled state.</w:t>
+      </w:r>
+    </w:p>
+    <w:p>
+      <w:pPr>
+        <w:pStyle w:val="Heading2"/>
+        <w:spacing w:after="150" w:before="300"/>
+      </w:pPr>
+      <w:r>
+        <w:t xml:space="preserve">3.7 Error/Success Feedback</w:t>
+      </w:r>
+    </w:p>
+    <w:p>
+      <w:pPr>
+        <w:spacing w:after="160"/>
+      </w:pPr>
+      <w:r>
+        <w:rPr>
+          <w:rFonts w:ascii="Calibri" w:cs="Calibri" w:eastAsia="Calibri" w:hAnsi="Calibri"/>
+          <w:sz w:val="22"/>
+          <w:szCs w:val="22"/>
+        </w:rPr>
+        <w:t xml:space="preserve">Both forms originally surfaced validation and Apex errors only via lightning/platformShowToastEvent. This is a problem specifically because Experience Cloud LWR sites (this portal's site type) don't render platform toasts at all — a blocked submission looked like it silently did nothing. Both forms now also show a guaranteed inline banner (error-red or success-green, cleared at the start of the next submit attempt) alongside the existing toast dispatches — toasts are left in place in case the component is reused where toasts do render, but the banner is what a user on this site actually sees.</w:t>
+      </w:r>
+    </w:p>
+    <w:p>
+      <w:pPr>
+        <w:pStyle w:val="Heading1"/>
+        <w:spacing w:after="200" w:before="400"/>
+      </w:pPr>
+      <w:r>
+        <w:t xml:space="preserve">4. Reporting Screen</w:t>
+      </w:r>
+    </w:p>
+    <w:p>
+      <w:pPr>
+        <w:spacing w:after="160"/>
+      </w:pPr>
+      <w:r>
+        <w:rPr>
+          <w:rFonts w:ascii="Calibri" w:cs="Calibri" w:eastAsia="Calibri" w:hAnsi="Calibri"/>
+          <w:sz w:val="22"/>
+          <w:szCs w:val="22"/>
+        </w:rPr>
+        <w:t xml:space="preserve">staffingRequestReporting (nav label “Reporting”) reuses the same </w:t>
+      </w:r>
+      <w:r>
+        <w:rPr>
+          <w:rFonts w:ascii="Consolas" w:cs="Consolas" w:eastAsia="Consolas" w:hAnsi="Consolas"/>
+          <w:sz w:val="20"/>
+          <w:szCs w:val="20"/>
+          <w:shd w:fill="F0F0F0" w:val="clear"/>
+        </w:rPr>
+        <w:t xml:space="preserve">StaffingRequestController.getMyRequests()</w:t>
+      </w:r>
+      <w:r>
+        <w:rPr>
+          <w:rFonts w:ascii="Calibri" w:cs="Calibri" w:eastAsia="Calibri" w:hAnsi="Calibri"/>
+          <w:sz w:val="22"/>
+          <w:szCs w:val="22"/>
+        </w:rPr>
+        <w:t xml:space="preserve"> data as My Requests — no new Apex — filtered client-side by </w:t>
+      </w:r>
+      <w:r>
+        <w:rPr>
+          <w:rFonts w:ascii="Consolas" w:cs="Consolas" w:eastAsia="Consolas" w:hAnsi="Consolas"/>
+          <w:sz w:val="20"/>
+          <w:szCs w:val="20"/>
+          <w:shd w:fill="F0F0F0" w:val="clear"/>
+        </w:rPr>
+        <w:t xml:space="preserve">Shift_Date__c</w:t>
+      </w:r>
+      <w:r>
+        <w:rPr>
+          <w:rFonts w:ascii="Calibri" w:cs="Calibri" w:eastAsia="Calibri" w:hAnsi="Calibri"/>
+          <w:sz w:val="22"/>
+          <w:szCs w:val="22"/>
+        </w:rPr>
+        <w:t xml:space="preserve"> against one of five ranges:</w:t>
+      </w:r>
+    </w:p>
+    <w:p>
+      <w:pPr>
+        <w:pStyle w:val="ListParagraph"/>
+        <w:numPr>
+          <w:ilvl w:val="0"/>
+          <w:numId w:val="1"/>
+        </w:numPr>
+        <w:spacing w:after="80"/>
+      </w:pPr>
+      <w:r>
+        <w:rPr>
+          <w:rFonts w:ascii="Calibri" w:cs="Calibri" w:eastAsia="Calibri" w:hAnsi="Calibri"/>
+          <w:sz w:val="22"/>
+          <w:szCs w:val="22"/>
+        </w:rPr>
+        <w:t xml:space="preserve">All — no date filtering; every request the user can see. Gives an explicit, unambiguous way to clear the date filter.</w:t>
+      </w:r>
+    </w:p>
+    <w:p>
+      <w:pPr>
+        <w:pStyle w:val="ListParagraph"/>
+        <w:numPr>
+          <w:ilvl w:val="0"/>
+          <w:numId w:val="1"/>
+        </w:numPr>
+        <w:spacing w:after="80"/>
+      </w:pPr>
+      <w:r>
+        <w:rPr>
+          <w:rFonts w:ascii="Calibri" w:cs="Calibri" w:eastAsia="Calibri" w:hAnsi="Calibri"/>
+          <w:sz w:val="22"/>
+          <w:szCs w:val="22"/>
+        </w:rPr>
+        <w:t xml:space="preserve">Last 7 Days — a rolling window (today minus 6 days through today).</w:t>
+      </w:r>
+    </w:p>
+    <w:p>
+      <w:pPr>
+        <w:pStyle w:val="ListParagraph"/>
+        <w:numPr>
+          <w:ilvl w:val="0"/>
+          <w:numId w:val="1"/>
+        </w:numPr>
+        <w:spacing w:after="80"/>
+      </w:pPr>
+      <w:r>
+        <w:rPr>
+          <w:rFonts w:ascii="Calibri" w:cs="Calibri" w:eastAsia="Calibri" w:hAnsi="Calibri"/>
+          <w:sz w:val="22"/>
+          <w:szCs w:val="22"/>
+        </w:rPr>
+        <w:t xml:space="preserve">Last Week — the most recently completed calendar week (Monday through Sunday), deliberately different from Last 7 Days.</w:t>
+      </w:r>
+    </w:p>
+    <w:p>
+      <w:pPr>
+        <w:pStyle w:val="ListParagraph"/>
+        <w:numPr>
+          <w:ilvl w:val="0"/>
+          <w:numId w:val="1"/>
+        </w:numPr>
+        <w:spacing w:after="80"/>
+      </w:pPr>
+      <w:r>
+        <w:rPr>
+          <w:rFonts w:ascii="Calibri" w:cs="Calibri" w:eastAsia="Calibri" w:hAnsi="Calibri"/>
+          <w:sz w:val="22"/>
+          <w:szCs w:val="22"/>
+        </w:rPr>
+        <w:t xml:space="preserve">Last Month — the most recently completed calendar month.</w:t>
+      </w:r>
+    </w:p>
+    <w:p>
+      <w:pPr>
+        <w:pStyle w:val="ListParagraph"/>
+        <w:numPr>
+          <w:ilvl w:val="0"/>
+          <w:numId w:val="1"/>
+        </w:numPr>
+        <w:spacing w:after="80"/>
+      </w:pPr>
+      <w:r>
+        <w:rPr>
+          <w:rFonts w:ascii="Calibri" w:cs="Calibri" w:eastAsia="Calibri" w:hAnsi="Calibri"/>
           <w:sz w:val="22"/>
           <w:szCs w:val="22"/>
         </w:rPr>
@@ -3328,7 +4445,24 @@
           <w:sz w:val="22"/>
           <w:szCs w:val="22"/>
         </w:rPr>
-        <w:t xml:space="preserve"> pattern — that was tried first, but didn't actually download anything on this site (the link just navigated to a blank page): this site's CSP/Lightning Web Security sandboxing doesn't treat blob: URLs the way a plain web app would. A data: URI sidesteps it — the whole file is encoded directly into the href, with no separate object-URL lifecycle. If a future change needs Blob-based downloads again, test on the actual site early rather than assuming the textbook pattern works here.</w:t>
+        <w:t xml:space="preserve"> pattern — that was tried first, but didn't actually download anything on this site (the link just navigated to a blank page): this site's CSP/Lightning Web Security sandboxing doesn't treat blob: URLs the way a plain web app would. A data: URI sidesteps it — the whole file is encoded directly into the href, with no separate object-URL lifecycle. If a future change needs Blob-based downloads again, test on the actual site early rather than assuming the textbook pattern works here. This anchor-click is now routed through the shared </w:t>
+      </w:r>
+      <w:r>
+        <w:rPr>
+          <w:rFonts w:ascii="Consolas" w:cs="Consolas" w:eastAsia="Consolas" w:hAnsi="Consolas"/>
+          <w:sz w:val="20"/>
+          <w:szCs w:val="20"/>
+          <w:shd w:fill="F0F0F0" w:val="clear"/>
+        </w:rPr>
+        <w:t xml:space="preserve">c/fileDownloadUtils</w:t>
+      </w:r>
+      <w:r>
+        <w:rPr>
+          <w:rFonts w:ascii="Calibri" w:cs="Calibri" w:eastAsia="Calibri" w:hAnsi="Calibri"/>
+          <w:sz w:val="22"/>
+          <w:szCs w:val="22"/>
+        </w:rPr>
+        <w:t xml:space="preserve"> helper (see §3.4.3), which keeps this exact desktop/Android behaviour unchanged and adds a separate path only for iOS, where the download attribute was never honoured at all.</w:t>
       </w:r>
     </w:p>
     <w:p>
@@ -3342,6 +4476,36 @@
           <w:szCs w:val="22"/>
         </w:rPr>
         <w:t xml:space="preserve">This is a brand new page, so it needs a manual Experience Builder step the same way Calendar did: create a new page in Experience Builder, drag staffingRequestReporting onto it, and add a “Reporting” entry to the site's navigation menu. None of this is deployable metadata up front — see §12 Experience Cloud site setup.</w:t>
+      </w:r>
+    </w:p>
+    <w:p>
+      <w:pPr>
+        <w:spacing w:after="160"/>
+      </w:pPr>
+      <w:r>
+        <w:rPr>
+          <w:rFonts w:ascii="Calibri" w:cs="Calibri" w:eastAsia="Calibri" w:hAnsi="Calibri"/>
+          <w:sz w:val="22"/>
+          <w:szCs w:val="22"/>
+        </w:rPr>
+        <w:t xml:space="preserve">Below a </w:t>
+      </w:r>
+      <w:r>
+        <w:rPr>
+          <w:rFonts w:ascii="Consolas" w:cs="Consolas" w:eastAsia="Consolas" w:hAnsi="Consolas"/>
+          <w:sz w:val="20"/>
+          <w:szCs w:val="20"/>
+          <w:shd w:fill="F0F0F0" w:val="clear"/>
+        </w:rPr>
+        <w:t xml:space="preserve">48rem</w:t>
+      </w:r>
+      <w:r>
+        <w:rPr>
+          <w:rFonts w:ascii="Calibri" w:cs="Calibri" w:eastAsia="Calibri" w:hAnsi="Calibri"/>
+          <w:sz w:val="22"/>
+          <w:szCs w:val="22"/>
+        </w:rPr>
+        <w:t xml:space="preserve"> viewport, this screen also switches to the same per-card mobile layout as My Requests — see §3.2.3 for the full write-up (field split, the toggle mechanism, and the CSS specificity bug found and fixed along the way).</w:t>
       </w:r>
     </w:p>
     <w:p>
@@ -5107,6 +6271,337 @@
     </w:p>
     <w:p>
       <w:pPr>
+        <w:pStyle w:val="Heading2"/>
+        <w:spacing w:after="150" w:before="300"/>
+      </w:pPr>
+      <w:r>
+        <w:t xml:space="preserve">9.1 Why Build Your Own (LWR), Not a Prebuilt Template</w:t>
+      </w:r>
+    </w:p>
+    <w:p>
+      <w:pPr>
+        <w:spacing w:after="160"/>
+      </w:pPr>
+      <w:r>
+        <w:rPr>
+          <w:rFonts w:ascii="Calibri" w:cs="Calibri" w:eastAsia="Calibri" w:hAnsi="Calibri"/>
+          <w:sz w:val="22"/>
+          <w:szCs w:val="22"/>
+        </w:rPr>
+        <w:t xml:space="preserve">Salesforce's other Experience Cloud templates are each opinionated around a specific standard object family, and none of them fit this project's data model:</w:t>
+      </w:r>
+    </w:p>
+    <w:p>
+      <w:pPr>
+        <w:pStyle w:val="ListParagraph"/>
+        <w:numPr>
+          <w:ilvl w:val="0"/>
+          <w:numId w:val="1"/>
+        </w:numPr>
+        <w:spacing w:after="80"/>
+      </w:pPr>
+      <w:r>
+        <w:rPr>
+          <w:rFonts w:ascii="Calibri" w:cs="Calibri" w:eastAsia="Calibri" w:hAnsi="Calibri"/>
+          <w:b/>
+          <w:bCs/>
+          <w:sz w:val="22"/>
+          <w:szCs w:val="22"/>
+        </w:rPr>
+        <w:t xml:space="preserve">Customer Account Portal — </w:t>
+      </w:r>
+      <w:r>
+        <w:rPr>
+          <w:rFonts w:ascii="Calibri" w:cs="Calibri" w:eastAsia="Calibri" w:hAnsi="Calibri"/>
+          <w:sz w:val="22"/>
+          <w:szCs w:val="22"/>
+        </w:rPr>
+        <w:t xml:space="preserve">tightly coupled to the standard B2B commerce/order data model. It ships prebuilt pages for Order History, Contracts, Entitlements, and standard Account/Case management, and assumes the portal is exposing </w:t>
+      </w:r>
+      <w:r>
+        <w:rPr>
+          <w:rFonts w:ascii="Consolas" w:cs="Consolas" w:eastAsia="Consolas" w:hAnsi="Consolas"/>
+          <w:sz w:val="20"/>
+          <w:szCs w:val="20"/>
+          <w:shd w:fill="F0F0F0" w:val="clear"/>
+        </w:rPr>
+        <w:t xml:space="preserve">Order</w:t>
+      </w:r>
+      <w:r>
+        <w:rPr>
+          <w:rFonts w:ascii="Calibri" w:cs="Calibri" w:eastAsia="Calibri" w:hAnsi="Calibri"/>
+          <w:sz w:val="22"/>
+          <w:szCs w:val="22"/>
+        </w:rPr>
+        <w:t xml:space="preserve">/</w:t>
+      </w:r>
+      <w:r>
+        <w:rPr>
+          <w:rFonts w:ascii="Consolas" w:cs="Consolas" w:eastAsia="Consolas" w:hAnsi="Consolas"/>
+          <w:sz w:val="20"/>
+          <w:szCs w:val="20"/>
+          <w:shd w:fill="F0F0F0" w:val="clear"/>
+        </w:rPr>
+        <w:t xml:space="preserve">OrderItem</w:t>
+      </w:r>
+      <w:r>
+        <w:rPr>
+          <w:rFonts w:ascii="Calibri" w:cs="Calibri" w:eastAsia="Calibri" w:hAnsi="Calibri"/>
+          <w:sz w:val="22"/>
+          <w:szCs w:val="22"/>
+        </w:rPr>
+        <w:t xml:space="preserve">/</w:t>
+      </w:r>
+      <w:r>
+        <w:rPr>
+          <w:rFonts w:ascii="Consolas" w:cs="Consolas" w:eastAsia="Consolas" w:hAnsi="Consolas"/>
+          <w:sz w:val="20"/>
+          <w:szCs w:val="20"/>
+          <w:shd w:fill="F0F0F0" w:val="clear"/>
+        </w:rPr>
+        <w:t xml:space="preserve">Contract</w:t>
+      </w:r>
+      <w:r>
+        <w:rPr>
+          <w:rFonts w:ascii="Calibri" w:cs="Calibri" w:eastAsia="Calibri" w:hAnsi="Calibri"/>
+          <w:sz w:val="22"/>
+          <w:szCs w:val="22"/>
+        </w:rPr>
+        <w:t xml:space="preserve">/</w:t>
+      </w:r>
+      <w:r>
+        <w:rPr>
+          <w:rFonts w:ascii="Consolas" w:cs="Consolas" w:eastAsia="Consolas" w:hAnsi="Consolas"/>
+          <w:sz w:val="20"/>
+          <w:szCs w:val="20"/>
+          <w:shd w:fill="F0F0F0" w:val="clear"/>
+        </w:rPr>
+        <w:t xml:space="preserve">Entitlement</w:t>
+      </w:r>
+      <w:r>
+        <w:rPr>
+          <w:rFonts w:ascii="Calibri" w:cs="Calibri" w:eastAsia="Calibri" w:hAnsi="Calibri"/>
+          <w:sz w:val="22"/>
+          <w:szCs w:val="22"/>
+        </w:rPr>
+        <w:t xml:space="preserve">, etc. This project has none of those objects at all — the whole workflow (submit a staffing request → track fulfilment status → view invoices) runs on bespoke custom objects instead.</w:t>
+      </w:r>
+    </w:p>
+    <w:p>
+      <w:pPr>
+        <w:pStyle w:val="ListParagraph"/>
+        <w:numPr>
+          <w:ilvl w:val="0"/>
+          <w:numId w:val="1"/>
+        </w:numPr>
+        <w:spacing w:after="80"/>
+      </w:pPr>
+      <w:r>
+        <w:rPr>
+          <w:rFonts w:ascii="Calibri" w:cs="Calibri" w:eastAsia="Calibri" w:hAnsi="Calibri"/>
+          <w:b/>
+          <w:bCs/>
+          <w:sz w:val="22"/>
+          <w:szCs w:val="22"/>
+        </w:rPr>
+        <w:t xml:space="preserve">Partner Central — </w:t>
+      </w:r>
+      <w:r>
+        <w:rPr>
+          <w:rFonts w:ascii="Calibri" w:cs="Calibri" w:eastAsia="Calibri" w:hAnsi="Calibri"/>
+          <w:sz w:val="22"/>
+          <w:szCs w:val="22"/>
+        </w:rPr>
+        <w:t xml:space="preserve">built for reseller/partner relationship management (deal registration, leads, opportunities, partner funds). Nothing in this portal is partner-facing.</w:t>
+      </w:r>
+    </w:p>
+    <w:p>
+      <w:pPr>
+        <w:pStyle w:val="ListParagraph"/>
+        <w:numPr>
+          <w:ilvl w:val="0"/>
+          <w:numId w:val="1"/>
+        </w:numPr>
+        <w:spacing w:after="80"/>
+      </w:pPr>
+      <w:r>
+        <w:rPr>
+          <w:rFonts w:ascii="Calibri" w:cs="Calibri" w:eastAsia="Calibri" w:hAnsi="Calibri"/>
+          <w:b/>
+          <w:bCs/>
+          <w:sz w:val="22"/>
+          <w:szCs w:val="22"/>
+        </w:rPr>
+        <w:t xml:space="preserve">Customer Service / Help Center — </w:t>
+      </w:r>
+      <w:r>
+        <w:rPr>
+          <w:rFonts w:ascii="Calibri" w:cs="Calibri" w:eastAsia="Calibri" w:hAnsi="Calibri"/>
+          <w:sz w:val="22"/>
+          <w:szCs w:val="22"/>
+        </w:rPr>
+        <w:t xml:space="preserve">built around </w:t>
+      </w:r>
+      <w:r>
+        <w:rPr>
+          <w:rFonts w:ascii="Consolas" w:cs="Consolas" w:eastAsia="Consolas" w:hAnsi="Consolas"/>
+          <w:sz w:val="20"/>
+          <w:szCs w:val="20"/>
+          <w:shd w:fill="F0F0F0" w:val="clear"/>
+        </w:rPr>
+        <w:t xml:space="preserve">Case</w:t>
+      </w:r>
+      <w:r>
+        <w:rPr>
+          <w:rFonts w:ascii="Calibri" w:cs="Calibri" w:eastAsia="Calibri" w:hAnsi="Calibri"/>
+          <w:sz w:val="22"/>
+          <w:szCs w:val="22"/>
+        </w:rPr>
+        <w:t xml:space="preserve"> + Knowledge self-service. The closest tangential match, since Support/Query does reuse the standard </w:t>
+      </w:r>
+      <w:r>
+        <w:rPr>
+          <w:rFonts w:ascii="Consolas" w:cs="Consolas" w:eastAsia="Consolas" w:hAnsi="Consolas"/>
+          <w:sz w:val="20"/>
+          <w:szCs w:val="20"/>
+          <w:shd w:fill="F0F0F0" w:val="clear"/>
+        </w:rPr>
+        <w:t xml:space="preserve">Case</w:t>
+      </w:r>
+      <w:r>
+        <w:rPr>
+          <w:rFonts w:ascii="Calibri" w:cs="Calibri" w:eastAsia="Calibri" w:hAnsi="Calibri"/>
+          <w:sz w:val="22"/>
+          <w:szCs w:val="22"/>
+        </w:rPr>
+        <w:t xml:space="preserve"> object — but that's 1 of 7 screens. The other six (Home dashboard, Request Staff, My Requests, Calendar, Invoices, Reporting) are all driven by </w:t>
+      </w:r>
+      <w:r>
+        <w:rPr>
+          <w:rFonts w:ascii="Consolas" w:cs="Consolas" w:eastAsia="Consolas" w:hAnsi="Consolas"/>
+          <w:sz w:val="20"/>
+          <w:szCs w:val="20"/>
+          <w:shd w:fill="F0F0F0" w:val="clear"/>
+        </w:rPr>
+        <w:t xml:space="preserve">Staffing_Request__c</w:t>
+      </w:r>
+      <w:r>
+        <w:rPr>
+          <w:rFonts w:ascii="Calibri" w:cs="Calibri" w:eastAsia="Calibri" w:hAnsi="Calibri"/>
+          <w:sz w:val="22"/>
+          <w:szCs w:val="22"/>
+        </w:rPr>
+        <w:t xml:space="preserve">/</w:t>
+      </w:r>
+      <w:r>
+        <w:rPr>
+          <w:rFonts w:ascii="Consolas" w:cs="Consolas" w:eastAsia="Consolas" w:hAnsi="Consolas"/>
+          <w:sz w:val="20"/>
+          <w:szCs w:val="20"/>
+          <w:shd w:fill="F0F0F0" w:val="clear"/>
+        </w:rPr>
+        <w:t xml:space="preserve">Invoice__c</w:t>
+      </w:r>
+      <w:r>
+        <w:rPr>
+          <w:rFonts w:ascii="Calibri" w:cs="Calibri" w:eastAsia="Calibri" w:hAnsi="Calibri"/>
+          <w:sz w:val="22"/>
+          <w:szCs w:val="22"/>
+        </w:rPr>
+        <w:t xml:space="preserve">/</w:t>
+      </w:r>
+      <w:r>
+        <w:rPr>
+          <w:rFonts w:ascii="Consolas" w:cs="Consolas" w:eastAsia="Consolas" w:hAnsi="Consolas"/>
+          <w:sz w:val="20"/>
+          <w:szCs w:val="20"/>
+          <w:shd w:fill="F0F0F0" w:val="clear"/>
+        </w:rPr>
+        <w:t xml:space="preserve">Facility__c</w:t>
+      </w:r>
+      <w:r>
+        <w:rPr>
+          <w:rFonts w:ascii="Calibri" w:cs="Calibri" w:eastAsia="Calibri" w:hAnsi="Calibri"/>
+          <w:sz w:val="22"/>
+          <w:szCs w:val="22"/>
+        </w:rPr>
+        <w:t xml:space="preserve">, which this template has no prebuilt furniture for either.</w:t>
+      </w:r>
+    </w:p>
+    <w:p>
+      <w:pPr>
+        <w:spacing w:after="160"/>
+      </w:pPr>
+      <w:r>
+        <w:rPr>
+          <w:rFonts w:ascii="Calibri" w:cs="Calibri" w:eastAsia="Calibri" w:hAnsi="Calibri"/>
+          <w:sz w:val="22"/>
+          <w:szCs w:val="22"/>
+        </w:rPr>
+        <w:t xml:space="preserve">None of CAP's, Partner Central's, or Customer Service's out-of-box components would apply here — building on any of them would mean paying for prebuilt furniture (Order/Entitlement/Opportunity pages, B2B Commerce licensing overhead) and then overriding or removing nearly all of it anyway. </w:t>
+      </w:r>
+      <w:r>
+        <w:rPr>
+          <w:rFonts w:ascii="Calibri" w:cs="Calibri" w:eastAsia="Calibri" w:hAnsi="Calibri"/>
+          <w:b/>
+          <w:bCs/>
+          <w:sz w:val="22"/>
+          <w:szCs w:val="22"/>
+        </w:rPr>
+        <w:t xml:space="preserve">Build Your Own (LWR)</w:t>
+      </w:r>
+      <w:r>
+        <w:rPr>
+          <w:rFonts w:ascii="Calibri" w:cs="Calibri" w:eastAsia="Calibri" w:hAnsi="Calibri"/>
+          <w:sz w:val="22"/>
+          <w:szCs w:val="22"/>
+        </w:rPr>
+        <w:t xml:space="preserve"> is the blank-canvas template: no prebuilt object assumptions, full control over every page/component, and Salesforce's newer Lightning Web Runtime (faster page loads / better Core Web Vitals than the older Aura-based templates the other options have traditionally used). Since every screen here is a custom LWC built from scratch against custom objects, this was the template that didn't fight the actual data model.</w:t>
+      </w:r>
+    </w:p>
+    <w:p>
+      <w:pPr>
+        <w:spacing w:after="160"/>
+      </w:pPr>
+      <w:r>
+        <w:rPr>
+          <w:rFonts w:ascii="Calibri" w:cs="Calibri" w:eastAsia="Calibri" w:hAnsi="Calibri"/>
+          <w:b/>
+          <w:bCs/>
+          <w:sz w:val="22"/>
+          <w:szCs w:val="22"/>
+        </w:rPr>
+        <w:t xml:space="preserve">Revisited after finishing the build, not just at the start: </w:t>
+      </w:r>
+      <w:r>
+        <w:rPr>
+          <w:rFonts w:ascii="Calibri" w:cs="Calibri" w:eastAsia="Calibri" w:hAnsi="Calibri"/>
+          <w:sz w:val="22"/>
+          <w:szCs w:val="22"/>
+        </w:rPr>
+        <w:t xml:space="preserve">the same conclusion holds. The Calendar and Reporting screens were added </w:t>
+      </w:r>
+      <w:r>
+        <w:rPr>
+          <w:rFonts w:ascii="Calibri" w:cs="Calibri" w:eastAsia="Calibri" w:hAnsi="Calibri"/>
+          <w:b/>
+          <w:bCs/>
+          <w:sz w:val="22"/>
+          <w:szCs w:val="22"/>
+        </w:rPr>
+        <w:t xml:space="preserve">beyond</w:t>
+      </w:r>
+      <w:r>
+        <w:rPr>
+          <w:rFonts w:ascii="Calibri" w:cs="Calibri" w:eastAsia="Calibri" w:hAnsi="Calibri"/>
+          <w:sz w:val="22"/>
+          <w:szCs w:val="22"/>
+        </w:rPr>
+        <w:t xml:space="preserve"> the original 6-screen scope with zero template friction, and the deep-linking between Home tiles/Calendar/My Requests/Invoices, the custom per-row cancellation action, and the mobile card layout (§3.2.3) all required full control over markup and navigation that a prebuilt template would have made harder to achieve, not easier. A template-based starting point would likely have meant removing more prebuilt structure than it saved.</w:t>
+      </w:r>
+    </w:p>
+    <w:p>
+      <w:pPr>
         <w:spacing w:after="160"/>
       </w:pPr>
       <w:r>
@@ -5629,7 +7124,7 @@
           <w:sz w:val="22"/>
           <w:szCs w:val="22"/>
         </w:rPr>
-        <w:t xml:space="preserve">134 Jest tests across all 15 LWCs (including the sortTableUtils and dateFormatUtils shared modules). This is the only thing in this project that has actually been run and confirmed passing in this environment.</w:t>
+        <w:t xml:space="preserve">142 Jest tests across all 16 LWCs (including the sortTableUtils, dateFormatUtils, and fileDownloadUtils shared modules). This is the only thing in this project that has actually been run and confirmed passing in this environment.</w:t>
       </w:r>
     </w:p>
     <w:p>
@@ -5798,7 +7293,7 @@
           <w:sz w:val="22"/>
           <w:szCs w:val="22"/>
         </w:rPr>
-        <w:t xml:space="preserve"> (MD → Facility__c, optional lookup → Ward__c) — the shift/staff demand request. Status__c is the client-safe lifecycle: Submitted, Being Worked, Broadcasted, Filled, Unable to Fill, Cancelled. Requested_By_Contact__c and External_Demand_Id__c are intentionally not portal-readable (server-set only). Assigned_Contact__c (plain text, not a lookup) and Cancellation_Requested__c are portal-readable but not portal-editable — both set only by trusted server-side Apex. Role__c is a restricted picklist (Clinical Nurse, Registered Nurse, Registered Midwife, Enrolled Nurse, Nursing Assistant (AIN), Personal Care Assistant, Kitchen Hand, Pantry, Food Services Assistant, Cleaner, Laundry, Assistant Cook, Cook, Chef, Head Chef Supervisor, Allied Health) — being restricted means requestStaffForm's ROLE_OPTIONS must exactly match the field's valueSet, or picking a value the field doesn't allow would submit fine client-side and only fail once it reaches Apex/the database.</w:t>
+        <w:t xml:space="preserve"> (MD → Facility__c, optional lookup → Ward__c) — the shift/staff demand request. Status__c is the client-safe lifecycle: Submitted, Being Worked, Broadcasted, Filled, Unable to Fill, Cancelled. Requested_By_Contact__c and External_Demand_Id__c are intentionally not portal-readable (server-set only). Assigned_Contact__c (plain text, not a lookup) and Cancellation_Requested__c are portal-readable but not portal-editable — both set only by trusted server-side Apex. Role__c is a restricted picklist (Clinical Nurse, Registered Nurse, Registered Midwife, Enrolled Nurse, Nursing Assistant (AIN), Personal Care Assistant, Kitchen Hand, Pantry, Food Services Assistant, Cleaner, Laundry, Assistant Cook, Cook, Chef, Head Chef Supervisor, Allied Health) — being restricted means requestStaffForm's ROLE_OPTIONS must exactly match the field's valueSet, or picking a value the field doesn't allow would submit fine client-side and only fail once it reaches Apex/the database. Priority__c is likewise a restricted picklist, with just two values: Standard (the default) and Urgent — narrowed down from an earlier four-value Low/Medium/High/Urgent set. Same constraint as Role__c: requestStaffForm's PRIORITY_OPTIONS must exactly match the field's valueSet.</w:t>
       </w:r>
     </w:p>
     <w:p>

</xml_diff>